<commit_message>
Document EXP-2026-011 family-seed holdout validation
</commit_message>
<xml_diff>
--- a/docs/papers/robust-repertoire-memory-ja.docx
+++ b/docs/papers/robust-repertoire-memory-ja.docx
@@ -32,7 +32,7 @@
         <w:rPr>
           <w:rFonts w:ascii="Calibri" w:hAnsi="Calibri" w:eastAsia="Yu Gothic"/>
         </w:rPr>
-        <w:t>研究草稿 v0.1 2026年7月30日</w:t>
+        <w:t>研究草稿 v0.2 2026年7月30日</w:t>
       </w:r>
     </w:p>
     <w:p>
@@ -80,7 +80,7 @@
         <w:rPr>
           <w:rFonts w:ascii="Calibri" w:hAnsi="Calibri" w:eastAsia="Yu Gothic"/>
         </w:rPr>
-        <w:t>4次元RNNを用いた段階的な検証では、まず未使用30 seedで自律アトラクタ数を全条件16に一致させたまま、認証レパートリーを分離した。次に、全16 orthantと全16一定corner外乱方向からなる符号記憶taskを導入した。単一familyの未使用30 seedでは、低外乱で認証robust fractionと保持率のSpearman相関が0.8823、高外乱で平均marginとの相関が0.9347だった。さらにdense symmetric、sparse symmetric、asymmetric dense、feedforward non-normalの4 familyを事前登録条件で確認したところ、全480 network条件のraw countが16のまま、平均marginと保持率の相関は0.8933–0.9771となった。seed単位でpoolした未知seed予測では、平均marginのMAEはraw countより0.0851、coupling gainより0.0080、worst local Jacobian infinity normより0.0051小さかった。後二つはsecondary endpointである。</w:t>
+        <w:t>4次元RNNを用いた段階的な検証では、まず未使用30 seedで自律アトラクタ数を全条件16に一致させたまま、認証レパートリーを分離した。次に、全16 orthantと全16一定corner外乱方向からなる符号記憶taskを導入した。単一familyの未使用30 seedでは、低外乱で認証robust fractionと保持率のSpearman相関が0.8823、高外乱で平均marginとの相関が0.9347だった。さらにdense symmetric、sparse symmetric、asymmetric dense、feedforward non-normalの4 familyを事前登録条件で確認したところ、全480 network条件のraw countが16のまま、平均marginと保持率の相関は0.8933–0.9771となった。</w:t>
       </w:r>
     </w:p>
     <w:p>
@@ -88,7 +88,15 @@
         <w:rPr>
           <w:rFonts w:ascii="Calibri" w:hAnsi="Calibri" w:eastAsia="Yu Gothic"/>
         </w:rPr>
-        <w:t>以上は、有限外乱下で利用可能な記憶状態を評価するにはアトラクタ数だけでなく、外乱budgetを引数とするmargin profileが必要であることを支持する。一方、本結果は4次元tanh RNN、一定外乱、符号保持task、hyperbox十分条件に限定される。未知family、確率外乱、高次元系、生物回路、人間規模の必要条件への一般化は今後の課題である。</w:t>
+        <w:t>最後に、各foldの対象familyをfitから除外し、他3 familyだけで標準化ridge回帰をfitするfamily・seed二重holdout確認を行った。要求外乱で無次元化した平均marginと認証robust fractionの二成分modelは、新規30 seedのpooled MAE 0.0822、family別Spearman 0.8225–0.9572を示した。seed単位paired bootstrapで、raw countおよび5-feature structural baselineのMAEよりそれぞれ0.0486 [0.0468, 0.0505]、0.0362 [0.0319, 0.0404]小さかった。</w:t>
+      </w:r>
+    </w:p>
+    <w:p>
+      <w:r>
+        <w:rPr>
+          <w:rFonts w:ascii="Calibri" w:hAnsi="Calibri" w:eastAsia="Yu Gothic"/>
+        </w:rPr>
+        <w:t>以上は、有限外乱下で利用可能な記憶状態を評価するにはアトラクタ数だけでなく、外乱budgetを引数とするmargin profileが必要であることを支持する。一方、本結果は4次元tanh RNN、既知の4 family、一定外乱、符号保持task、hyperbox十分条件に限定される。candidate選択にも未使用の第五family、確率外乱、高次元系、生物回路、人間規模の必要条件への一般化は今後の課題である。</w:t>
       </w:r>
     </w:p>
     <w:p>
@@ -204,6 +212,21 @@
     </w:p>
     <w:p>
       <w:pPr>
+        <w:spacing w:before="0" w:after="80" w:line="290" w:lineRule="auto"/>
+        <w:numPr>
+          <w:ilvl w:val="0"/>
+          <w:numId w:val="10"/>
+        </w:numPr>
+      </w:pPr>
+      <w:r>
+        <w:rPr>
+          <w:rFonts w:ascii="Calibri" w:hAnsi="Calibri" w:eastAsia="Yu Gothic"/>
+        </w:rPr>
+        <w:t>対象familyのlabelをfitから除外するfamily・seed二重holdoutで、robust repertoire二成分modelの移送性能を事前登録確認した。</w:t>
+      </w:r>
+    </w:p>
+    <w:p>
+      <w:pPr>
         <w:pStyle w:val="Heading1"/>
       </w:pPr>
       <w:r>
@@ -307,17 +330,7 @@
           <w:rFonts w:ascii="Cambria Math" w:hAnsi="Cambria Math"/>
           <w:sz w:val="21"/>
         </w:rPr>
-        <w:t>x_t+1=tanh(Wx_t+η_t),</w:t>
-      </w:r>
-      <w:r>
-        <w:br/>
-      </w:r>
-      <w:r>
-        <w:rPr>
-          <w:rFonts w:ascii="Cambria Math" w:hAnsi="Cambria Math"/>
-          <w:sz w:val="21"/>
-        </w:rPr>
-        <w:t>‖η_t‖_∞≤ e.</w:t>
+        <w:t>xₜ₊₁=tanh(Wxₜ+ηₜ), ‖ηₜ‖∞≤ e.</w:t>
       </w:r>
     </w:p>
     <w:p>
@@ -331,7 +344,7 @@
         <w:rPr>
           <w:rFonts w:ascii="Cambria Math" w:hAnsi="Cambria Math" w:eastAsia="Yu Gothic"/>
         </w:rPr>
-        <w:t>s∈-1,1^d</w:t>
+        <w:t>s∈-1,1ᵈ</w:t>
       </w:r>
       <w:r>
         <w:rPr>
@@ -343,7 +356,7 @@
         <w:rPr>
           <w:rFonts w:ascii="Cambria Math" w:hAnsi="Cambria Math" w:eastAsia="Yu Gothic"/>
         </w:rPr>
-        <w:t>D_s=diag(s)</w:t>
+        <w:t>Dₛ=diag(s)</w:t>
       </w:r>
       <w:r>
         <w:rPr>
@@ -355,7 +368,7 @@
         <w:rPr>
           <w:rFonts w:ascii="Cambria Math" w:hAnsi="Cambria Math" w:eastAsia="Yu Gothic"/>
         </w:rPr>
-        <w:t>y=D_sx</w:t>
+        <w:t>y=Dₛx</w:t>
       </w:r>
       <w:r>
         <w:rPr>
@@ -367,7 +380,7 @@
         <w:rPr>
           <w:rFonts w:ascii="Cambria Math" w:hAnsi="Cambria Math" w:eastAsia="Yu Gothic"/>
         </w:rPr>
-        <w:t>W_s=D_sWD_s</w:t>
+        <w:t>Wₛ=DₛWDₛ</w:t>
       </w:r>
       <w:r>
         <w:rPr>
@@ -401,7 +414,7 @@
           <w:rFonts w:ascii="Cambria Math" w:hAnsi="Cambria Math"/>
           <w:sz w:val="21"/>
         </w:rPr>
-        <w:t>B_s(m)=[m,1]^d, 0&lt;m&lt;1</w:t>
+        <w:t>Bₛ(m)=[m,1]ᵈ, 0&lt;m&lt;1</w:t>
       </w:r>
     </w:p>
     <w:p>
@@ -433,17 +446,7 @@
           <w:rFonts w:ascii="Cambria Math" w:hAnsi="Cambria Math"/>
           <w:sz w:val="21"/>
         </w:rPr>
-        <w:t>P_i=Σ_jmax((W_s)_ij,0),</w:t>
-      </w:r>
-      <w:r>
-        <w:br/>
-      </w:r>
-      <w:r>
-        <w:rPr>
-          <w:rFonts w:ascii="Cambria Math" w:hAnsi="Cambria Math"/>
-          <w:sz w:val="21"/>
-        </w:rPr>
-        <w:t>N_i=Σ_jmin((W_s)_ij,0)</w:t>
+        <w:t>Pᵢ=Σⱼₘₐₓ((Wₛ)ᵢⱼ,0), Nᵢ=Σⱼₘᵢₙ((Wₛ)ᵢⱼ,0)</w:t>
       </w:r>
     </w:p>
     <w:p>
@@ -457,7 +460,7 @@
         <w:rPr>
           <w:rFonts w:ascii="Cambria Math" w:hAnsi="Cambria Math" w:eastAsia="Yu Gothic"/>
         </w:rPr>
-        <w:t>y∈[m,1]^d</w:t>
+        <w:t>y∈[m,1]ᵈ</w:t>
       </w:r>
       <w:r>
         <w:rPr>
@@ -469,7 +472,7 @@
         <w:rPr>
           <w:rFonts w:ascii="Cambria Math" w:hAnsi="Cambria Math" w:eastAsia="Yu Gothic"/>
         </w:rPr>
-        <w:t>‖η‖_∞≤ e</w:t>
+        <w:t>‖η‖∞≤ e</w:t>
       </w:r>
       <w:r>
         <w:rPr>
@@ -493,7 +496,7 @@
         <w:rPr>
           <w:rFonts w:ascii="Cambria Math" w:hAnsi="Cambria Math" w:eastAsia="Yu Gothic"/>
         </w:rPr>
-        <w:t>P_i m+N_i-e</w:t>
+        <w:t>Pᵢ m+Nᵢ-e</w:t>
       </w:r>
       <w:r>
         <w:rPr>
@@ -511,7 +514,7 @@
           <w:rFonts w:ascii="Cambria Math" w:hAnsi="Cambria Math"/>
           <w:sz w:val="21"/>
         </w:rPr>
-        <w:t>P_i m+N_i-e≥ atanh(m)</w:t>
+        <w:t>Pᵢ m+Nᵢ-e≥ atanh(m)</w:t>
       </w:r>
     </w:p>
     <w:p>
@@ -525,7 +528,7 @@
         <w:rPr>
           <w:rFonts w:ascii="Cambria Math" w:hAnsi="Cambria Math" w:eastAsia="Yu Gothic"/>
         </w:rPr>
-        <w:t>[m,1]^d</w:t>
+        <w:t>[m,1]ᵈ</w:t>
       </w:r>
       <w:r>
         <w:rPr>
@@ -571,67 +574,7 @@
           <w:rFonts w:ascii="Cambria Math" w:hAnsi="Cambria Math"/>
           <w:sz w:val="21"/>
         </w:rPr>
-        <w:t>μ_s</w:t>
-      </w:r>
-      <w:r>
-        <w:br/>
-      </w:r>
-      <w:r>
-        <w:rPr>
-          <w:rFonts w:ascii="Cambria Math" w:hAnsi="Cambria Math"/>
-          <w:sz w:val="21"/>
-        </w:rPr>
-        <w:t>=</w:t>
-      </w:r>
-      <w:r>
-        <w:br/>
-      </w:r>
-      <w:r>
-        <w:rPr>
-          <w:rFonts w:ascii="Cambria Math" w:hAnsi="Cambria Math"/>
-          <w:sz w:val="21"/>
-        </w:rPr>
-        <w:t>max_0&lt;m&lt;1</w:t>
-      </w:r>
-      <w:r>
-        <w:br/>
-      </w:r>
-      <w:r>
-        <w:rPr>
-          <w:rFonts w:ascii="Cambria Math" w:hAnsi="Cambria Math"/>
-          <w:sz w:val="21"/>
-        </w:rPr>
-        <w:t>min_i</w:t>
-      </w:r>
-      <w:r>
-        <w:br/>
-      </w:r>
-      <w:r>
-        <w:rPr>
-          <w:rFonts w:ascii="Cambria Math" w:hAnsi="Cambria Math"/>
-          <w:sz w:val="21"/>
-        </w:rPr>
-        <w:t>[</w:t>
-      </w:r>
-      <w:r>
-        <w:br/>
-      </w:r>
-      <w:r>
-        <w:rPr>
-          <w:rFonts w:ascii="Cambria Math" w:hAnsi="Cambria Math"/>
-          <w:sz w:val="21"/>
-        </w:rPr>
-        <w:t>P_i m+N_i-atanh(m)</w:t>
-      </w:r>
-      <w:r>
-        <w:br/>
-      </w:r>
-      <w:r>
-        <w:rPr>
-          <w:rFonts w:ascii="Cambria Math" w:hAnsi="Cambria Math"/>
-          <w:sz w:val="21"/>
-        </w:rPr>
-        <w:t>]</w:t>
+        <w:t>μₛ = max₀&lt;m&lt;1 minᵢ [ Pᵢ m+Nᵢ-atanh(m) ]</w:t>
       </w:r>
     </w:p>
     <w:p>
@@ -645,7 +588,7 @@
         <w:rPr>
           <w:rFonts w:ascii="Cambria Math" w:hAnsi="Cambria Math" w:eastAsia="Yu Gothic"/>
         </w:rPr>
-        <w:t>μ_s≥ e</w:t>
+        <w:t>μₛ≥ e</w:t>
       </w:r>
       <w:r>
         <w:rPr>
@@ -657,7 +600,7 @@
         <w:rPr>
           <w:rFonts w:ascii="Cambria Math" w:hAnsi="Cambria Math" w:eastAsia="Yu Gothic"/>
         </w:rPr>
-        <w:t>B_s(m)</w:t>
+        <w:t>Bₛ(m)</w:t>
       </w:r>
       <w:r>
         <w:rPr>
@@ -669,7 +612,7 @@
         <w:rPr>
           <w:rFonts w:ascii="Cambria Math" w:hAnsi="Cambria Math" w:eastAsia="Yu Gothic"/>
         </w:rPr>
-        <w:t>‖η_t‖_∞≤ e</w:t>
+        <w:t>‖ηₜ‖∞≤ e</w:t>
       </w:r>
       <w:r>
         <w:rPr>
@@ -727,27 +670,7 @@
           <w:rFonts w:ascii="Cambria Math" w:hAnsi="Cambria Math"/>
           <w:sz w:val="21"/>
         </w:rPr>
-        <w:t>N_rob(e)</w:t>
-      </w:r>
-      <w:r>
-        <w:br/>
-      </w:r>
-      <w:r>
-        <w:rPr>
-          <w:rFonts w:ascii="Cambria Math" w:hAnsi="Cambria Math"/>
-          <w:sz w:val="21"/>
-        </w:rPr>
-        <w:t>=</w:t>
-      </w:r>
-      <w:r>
-        <w:br/>
-      </w:r>
-      <w:r>
-        <w:rPr>
-          <w:rFonts w:ascii="Cambria Math" w:hAnsi="Cambria Math"/>
-          <w:sz w:val="21"/>
-        </w:rPr>
-        <w:t>Σ_k∈A1[μ_k≥ e]</w:t>
+        <w:t>N_rob(e) = Σₖ∈A1[μₖ≥ e]</w:t>
       </w:r>
     </w:p>
     <w:p>
@@ -761,7 +684,7 @@
         <w:rPr>
           <w:rFonts w:ascii="Cambria Math" w:hAnsi="Cambria Math" w:eastAsia="Yu Gothic"/>
         </w:rPr>
-        <w:t>p_k</w:t>
+        <w:t>pₖ</w:t>
       </w:r>
       <w:r>
         <w:rPr>
@@ -779,27 +702,7 @@
           <w:rFonts w:ascii="Cambria Math" w:hAnsi="Cambria Math"/>
           <w:sz w:val="21"/>
         </w:rPr>
-        <w:t>S_rob(e)</w:t>
-      </w:r>
-      <w:r>
-        <w:br/>
-      </w:r>
-      <w:r>
-        <w:rPr>
-          <w:rFonts w:ascii="Cambria Math" w:hAnsi="Cambria Math"/>
-          <w:sz w:val="21"/>
-        </w:rPr>
-        <w:t>=</w:t>
-      </w:r>
-      <w:r>
-        <w:br/>
-      </w:r>
-      <w:r>
-        <w:rPr>
-          <w:rFonts w:ascii="Cambria Math" w:hAnsi="Cambria Math"/>
-          <w:sz w:val="21"/>
-        </w:rPr>
-        <w:t>Σ_k p_k1[μ_k≥ e]</w:t>
+        <w:t>S_rob(e) = Σₖ pₖ₁[μₖ≥ e]</w:t>
       </w:r>
     </w:p>
     <w:p>
@@ -819,37 +722,7 @@
           <w:rFonts w:ascii="Cambria Math" w:hAnsi="Cambria Math"/>
           <w:sz w:val="21"/>
         </w:rPr>
-        <w:t>μ̄</w:t>
-      </w:r>
-      <w:r>
-        <w:br/>
-      </w:r>
-      <w:r>
-        <w:rPr>
-          <w:rFonts w:ascii="Cambria Math" w:hAnsi="Cambria Math"/>
-          <w:sz w:val="21"/>
-        </w:rPr>
-        <w:t>=</w:t>
-      </w:r>
-      <w:r>
-        <w:br/>
-      </w:r>
-      <w:r>
-        <w:rPr>
-          <w:rFonts w:ascii="Cambria Math" w:hAnsi="Cambria Math"/>
-          <w:sz w:val="21"/>
-        </w:rPr>
-        <w:t>(1)/(|A|)</w:t>
-      </w:r>
-      <w:r>
-        <w:br/>
-      </w:r>
-      <w:r>
-        <w:rPr>
-          <w:rFonts w:ascii="Cambria Math" w:hAnsi="Cambria Math"/>
-          <w:sz w:val="21"/>
-        </w:rPr>
-        <w:t>Σ_k∈Amax(μ_k,0)</w:t>
+        <w:t>μ̄ = (1)/(|A|) Σₖ∈Amax(μₖ,0)</w:t>
       </w:r>
     </w:p>
     <w:p>
@@ -858,6 +731,118 @@
           <w:rFonts w:ascii="Calibri" w:hAnsi="Calibri" w:eastAsia="Yu Gothic"/>
         </w:rPr>
         <w:t>を用いる。</w:t>
+      </w:r>
+    </w:p>
+    <w:p>
+      <w:pPr>
+        <w:pStyle w:val="Heading2"/>
+      </w:pPr>
+      <w:r>
+        <w:t>3.5 Curveの高さと面積</w:t>
+      </w:r>
+    </w:p>
+    <w:p>
+      <w:r>
+        <w:rPr>
+          <w:rFonts w:ascii="Calibri" w:hAnsi="Calibri" w:eastAsia="Yu Gothic"/>
+        </w:rPr>
+        <w:t>正規化robust repertoire curveを</w:t>
+      </w:r>
+    </w:p>
+    <w:p>
+      <w:pPr>
+        <w:pStyle w:val="DisplayEquation"/>
+      </w:pPr>
+      <w:r>
+        <w:rPr>
+          <w:rFonts w:ascii="Cambria Math" w:hAnsi="Cambria Math"/>
+          <w:sz w:val="21"/>
+        </w:rPr>
+        <w:t>R(e)=N_rob(e)/|A|</w:t>
+      </w:r>
+    </w:p>
+    <w:p>
+      <w:r>
+        <w:rPr>
+          <w:rFonts w:ascii="Calibri" w:hAnsi="Calibri" w:eastAsia="Yu Gothic"/>
+        </w:rPr>
+        <w:t>とする。marginが有限なら、非負確率変数のtail積分公式と同じ恒等式により、</w:t>
+      </w:r>
+    </w:p>
+    <w:p>
+      <w:pPr>
+        <w:pStyle w:val="DisplayEquation"/>
+      </w:pPr>
+      <w:r>
+        <w:rPr>
+          <w:rFonts w:ascii="Cambria Math" w:hAnsi="Cambria Math"/>
+          <w:sz w:val="21"/>
+        </w:rPr>
+        <w:t>μ̄=(1/|A|) Σₖ∈ Amax(μₖ,0) =∫₀^∞ R(z) dz</w:t>
+      </w:r>
+    </w:p>
+    <w:p>
+      <w:r>
+        <w:rPr>
+          <w:rFonts w:ascii="Calibri" w:hAnsi="Calibri" w:eastAsia="Yu Gothic"/>
+        </w:rPr>
+        <w:t xml:space="preserve">である。要求外乱budget </w:t>
+      </w:r>
+      <w:r>
+        <w:rPr>
+          <w:rFonts w:ascii="Cambria Math" w:hAnsi="Cambria Math" w:eastAsia="Yu Gothic"/>
+        </w:rPr>
+        <w:t>e&gt;0</w:t>
+      </w:r>
+      <w:r>
+        <w:rPr>
+          <w:rFonts w:ascii="Calibri" w:hAnsi="Calibri" w:eastAsia="Yu Gothic"/>
+        </w:rPr>
+        <w:t xml:space="preserve"> で無次元化すると、</w:t>
+      </w:r>
+    </w:p>
+    <w:p>
+      <w:pPr>
+        <w:pStyle w:val="DisplayEquation"/>
+      </w:pPr>
+      <w:r>
+        <w:rPr>
+          <w:rFonts w:ascii="Cambria Math" w:hAnsi="Cambria Math"/>
+          <w:sz w:val="21"/>
+        </w:rPr>
+        <w:t>μ̄/e=∫₀^∞ R(eu) du</w:t>
+      </w:r>
+    </w:p>
+    <w:p>
+      <w:r>
+        <w:rPr>
+          <w:rFonts w:ascii="Calibri" w:hAnsi="Calibri" w:eastAsia="Yu Gothic"/>
+        </w:rPr>
+        <w:t xml:space="preserve">を得る。従って、認証robust fraction </w:t>
+      </w:r>
+      <w:r>
+        <w:rPr>
+          <w:rFonts w:ascii="Cambria Math" w:hAnsi="Cambria Math" w:eastAsia="Yu Gothic"/>
+        </w:rPr>
+        <w:t>R(e)</w:t>
+      </w:r>
+      <w:r>
+        <w:rPr>
+          <w:rFonts w:ascii="Calibri" w:hAnsi="Calibri" w:eastAsia="Yu Gothic"/>
+        </w:rPr>
+        <w:t xml:space="preserve"> は要求点でのcurveの高さ、 normalized mean margin </w:t>
+      </w:r>
+      <w:r>
+        <w:rPr>
+          <w:rFonts w:ascii="Cambria Math" w:hAnsi="Cambria Math" w:eastAsia="Yu Gothic"/>
+        </w:rPr>
+        <w:t>μ̄/e</w:t>
+      </w:r>
+      <w:r>
+        <w:rPr>
+          <w:rFonts w:ascii="Calibri" w:hAnsi="Calibri" w:eastAsia="Yu Gothic"/>
+        </w:rPr>
+        <w:t xml:space="preserve"> は要求scaleで測ったcurveの面積である。 後述のrobust pairは、局所的な閾値通過割合とレパートリー全体の余裕総量を 同時に表す。</w:t>
       </w:r>
     </w:p>
     <w:p>
@@ -890,6 +875,14 @@
           <w:rFonts w:ascii="Calibri" w:hAnsi="Calibri" w:eastAsia="Yu Gothic"/>
         </w:rPr>
         <w:t>EXP-2026-008では未使用seed 501–530を用い、coupling 0.04と0.07の両群で全seedのraw countを16に一致させた。EXP-2026-009ではdiscovery seed 401–430で外乱強度とfeatureを選び、未使用seed 601–630で符号記憶予測を確認した。EXP-2026-010ではpilot seed 801–808でfamily別条件を選び、discovery seed 801–830でpredictorをfitし、未使用seed 901–930で4 familyを確認した。</w:t>
+      </w:r>
+    </w:p>
+    <w:p>
+      <w:r>
+        <w:rPr>
+          <w:rFonts w:ascii="Calibri" w:hAnsi="Calibri" w:eastAsia="Yu Gothic"/>
+        </w:rPr>
+        <w:t>EXP-2026-011のpilotは観測済みseed 801–830をfit、901–930をtestに用い、6 candidateからpooled leave-one-family-out MAE最小のrobust pairを選択した。その後、penalty、feature、baseline、閾値を固定し、他3 familyの既観測60 seedでfitしたmodelをheld-out familyの未使用seed 1201–1230へ適用した。</w:t>
       </w:r>
     </w:p>
     <w:p>
@@ -1362,7 +1355,7 @@
         <w:rPr>
           <w:rFonts w:ascii="Cambria Math" w:hAnsi="Cambria Math" w:eastAsia="Yu Gothic"/>
         </w:rPr>
-        <w:t>10^-9</w:t>
+        <w:t>10⁻⁹</w:t>
       </w:r>
       <w:r>
         <w:rPr>
@@ -1382,7 +1375,7 @@
         <w:rPr>
           <w:rFonts w:ascii="Cambria Math" w:hAnsi="Cambria Math" w:eastAsia="Yu Gothic"/>
         </w:rPr>
-        <w:t>d∈-1,1^4</w:t>
+        <w:t>d∈-1,1⁴</w:t>
       </w:r>
       <w:r>
         <w:rPr>
@@ -1400,7 +1393,7 @@
         <w:rPr>
           <w:rFonts w:ascii="Calibri" w:hAnsi="Calibri" w:eastAsia="Yu Gothic"/>
         </w:rPr>
-        <w:t xml:space="preserve"> を100 step一定に印加した。全時刻で元のorthant符号を保てば成功とした。一network・一外乱強度あたり256 challengeであり、EXP-2026-010のconfirmation総数は122,880だった。</w:t>
+        <w:t xml:space="preserve"> を100 step一定に印加した。全時刻で元のorthant符号を保てば成功とした。一network・一外乱強度あたり256 challengeであり、EXP-2026-010とEXP-2026-011の各confirmation総数は122,880だった。</w:t>
       </w:r>
     </w:p>
     <w:p>
@@ -1432,6 +1425,50 @@
       </w:r>
     </w:p>
     <w:p>
+      <w:r>
+        <w:rPr>
+          <w:rFonts w:ascii="Calibri" w:hAnsi="Calibri" w:eastAsia="Yu Gothic"/>
+        </w:rPr>
+        <w:t xml:space="preserve">EXP-2026-011ではfamily名をfeatureへ入れず、held-out familyのtask保持率をfitから 完全に除外した。各featureを学習fold内で標準化し、切片を罰しないridge回帰 （penalty </w:t>
+      </w:r>
+      <w:r>
+        <w:rPr>
+          <w:rFonts w:ascii="Cambria Math" w:hAnsi="Cambria Math" w:eastAsia="Yu Gothic"/>
+        </w:rPr>
+        <w:t>10⁻³</w:t>
+      </w:r>
+      <w:r>
+        <w:rPr>
+          <w:rFonts w:ascii="Calibri" w:hAnsi="Calibri" w:eastAsia="Yu Gothic"/>
+        </w:rPr>
+        <w:t xml:space="preserve">）をfitした。選択modelのfeatureは </w:t>
+      </w:r>
+      <w:r>
+        <w:rPr>
+          <w:rFonts w:ascii="Cambria Math" w:hAnsi="Cambria Math" w:eastAsia="Yu Gothic"/>
+        </w:rPr>
+        <w:t>μ̄/e</w:t>
+      </w:r>
+      <w:r>
+        <w:rPr>
+          <w:rFonts w:ascii="Calibri" w:hAnsi="Calibri" w:eastAsia="Yu Gothic"/>
+        </w:rPr>
+        <w:t xml:space="preserve"> とcertified robust fractionである。Primary baselineはraw countと、 normalized coupling、normalized off-diagonal norm、local Jacobian、minimum coordinate、nonnormalityからなる5-feature structural modelとした。 Normalized margin単独はsecondary baselineである。全予測を保持率の定義域 </w:t>
+      </w:r>
+      <w:r>
+        <w:rPr>
+          <w:rFonts w:ascii="Cambria Math" w:hAnsi="Cambria Math" w:eastAsia="Yu Gothic"/>
+        </w:rPr>
+        <w:t>[0,1]</w:t>
+      </w:r>
+      <w:r>
+        <w:rPr>
+          <w:rFonts w:ascii="Calibri" w:hAnsi="Calibri" w:eastAsia="Yu Gothic"/>
+        </w:rPr>
+        <w:t xml:space="preserve"> へclipした。</w:t>
+      </w:r>
+    </w:p>
+    <w:p>
       <w:pPr>
         <w:pStyle w:val="Heading2"/>
       </w:pPr>
@@ -1453,6 +1490,14 @@
           <w:rFonts w:ascii="Calibri" w:hAnsi="Calibri" w:eastAsia="Yu Gothic"/>
         </w:rPr>
         <w:t>EXP-2026-010の事前判定は、confirmation全480 networkでraw count 16、certificate下界違反0、4 familyすべてでmean marginとtask retentionのSpearmanが0.75超、pooled raw-count MAE minus margin MAEの95%区間下限が0超、の4項目である。Couplingとlocal Jacobianに対する誤差差はsecondary endpointとして事前に固定した。</w:t>
+      </w:r>
+    </w:p>
+    <w:p>
+      <w:r>
+        <w:rPr>
+          <w:rFonts w:ascii="Calibri" w:hAnsi="Calibri" w:eastAsia="Yu Gothic"/>
+        </w:rPr>
+        <w:t>EXP-2026-011では各confirmation seedの4 family・4 gainを平均して一標本とした paired誤差差を用いた。事前判定は、raw count 16、certificate違反0、全familyで robust-pair予測とのSpearman 0.75超、raw-count MAE minus robust-pair MAEの 95%区間下限0超、structural MAE minus robust-pair MAEの区間下限0超、の5項目 である。確認seedを観測する前にsource/test manifestを固定した。</w:t>
       </w:r>
     </w:p>
     <w:p>
@@ -2386,6 +2431,701 @@
     </w:p>
     <w:p>
       <w:pPr>
+        <w:pStyle w:val="Heading2"/>
+      </w:pPr>
+      <w:r>
+        <w:t>5.4 Family・seed二重holdout</w:t>
+      </w:r>
+    </w:p>
+    <w:p>
+      <w:r>
+        <w:rPr>
+          <w:rFonts w:ascii="Calibri" w:hAnsi="Calibri" w:eastAsia="Yu Gothic"/>
+        </w:rPr>
+        <w:t>EXP-2026-011の事前登録5判定はすべて成立した。全480 confirmation条件でraw countは16、全122,880 challengeでcertificate下界違反は0だった。Robust pairの pooled MAEは0.0822、pooled Spearmanは0.7975だった。</w:t>
+      </w:r>
+    </w:p>
+    <w:tbl>
+      <w:tblPr>
+        <w:tblW w:type="dxa" w:w="9360"/>
+        <w:tblLayout w:type="fixed"/>
+        <w:tblLook w:firstColumn="1" w:firstRow="1" w:lastColumn="0" w:lastRow="0" w:noHBand="0" w:noVBand="1" w:val="04A0"/>
+        <w:tblInd w:w="120" w:type="dxa"/>
+        <w:tblLayout w:type="fixed"/>
+        <w:tblBorders>
+          <w:top w:val="single" w:sz="4" w:color="CBD2DA"/>
+          <w:left w:val="single" w:sz="4" w:color="CBD2DA"/>
+          <w:bottom w:val="single" w:sz="4" w:color="CBD2DA"/>
+          <w:right w:val="single" w:sz="4" w:color="CBD2DA"/>
+          <w:insideH w:val="single" w:sz="4" w:color="CBD2DA"/>
+          <w:insideV w:val="single" w:sz="4" w:color="CBD2DA"/>
+        </w:tblBorders>
+        <w:tblCellMar>
+          <w:top w:w="80" w:type="dxa"/>
+          <w:bottom w:w="80" w:type="dxa"/>
+          <w:start w:w="120" w:type="dxa"/>
+          <w:end w:w="120" w:type="dxa"/>
+        </w:tblCellMar>
+      </w:tblPr>
+      <w:tblGrid>
+        <w:gridCol w:w="4000"/>
+        <w:gridCol w:w="1800"/>
+        <w:gridCol w:w="3560"/>
+      </w:tblGrid>
+      <w:tr>
+        <w:trPr>
+          <w:tblHeader w:val="true"/>
+        </w:trPr>
+        <w:tc>
+          <w:tcPr>
+            <w:tcW w:type="dxa" w:w="4000"/>
+            <w:vAlign w:val="center"/>
+            <w:shd w:fill="F4F6F9"/>
+          </w:tcPr>
+          <w:p>
+            <w:pPr>
+              <w:pStyle w:val="ScientificTableText"/>
+              <w:jc w:val="left"/>
+            </w:pPr>
+            <w:r>
+              <w:rPr>
+                <w:rFonts w:ascii="Calibri" w:hAnsi="Calibri" w:eastAsia="Yu Gothic"/>
+                <w:b/>
+              </w:rPr>
+              <w:t>Held-out family</w:t>
+            </w:r>
+          </w:p>
+        </w:tc>
+        <w:tc>
+          <w:tcPr>
+            <w:tcW w:type="dxa" w:w="1800"/>
+            <w:vAlign w:val="center"/>
+            <w:shd w:fill="F4F6F9"/>
+          </w:tcPr>
+          <w:p>
+            <w:pPr>
+              <w:pStyle w:val="ScientificTableText"/>
+              <w:jc w:val="center"/>
+            </w:pPr>
+            <w:r>
+              <w:rPr>
+                <w:rFonts w:ascii="Calibri" w:hAnsi="Calibri" w:eastAsia="Yu Gothic"/>
+                <w:b/>
+              </w:rPr>
+              <w:t>Robust-pair Spearman</w:t>
+            </w:r>
+          </w:p>
+        </w:tc>
+        <w:tc>
+          <w:tcPr>
+            <w:tcW w:type="dxa" w:w="3560"/>
+            <w:vAlign w:val="center"/>
+            <w:shd w:fill="F4F6F9"/>
+          </w:tcPr>
+          <w:p>
+            <w:pPr>
+              <w:pStyle w:val="ScientificTableText"/>
+              <w:jc w:val="center"/>
+            </w:pPr>
+            <w:r>
+              <w:rPr>
+                <w:rFonts w:ascii="Calibri" w:hAnsi="Calibri" w:eastAsia="Yu Gothic"/>
+                <w:b/>
+              </w:rPr>
+              <w:t>Robust-pair MAE</w:t>
+            </w:r>
+          </w:p>
+        </w:tc>
+      </w:tr>
+      <w:tr>
+        <w:tc>
+          <w:tcPr>
+            <w:tcW w:type="dxa" w:w="4000"/>
+            <w:vAlign w:val="center"/>
+          </w:tcPr>
+          <w:p>
+            <w:pPr>
+              <w:pStyle w:val="ScientificTableText"/>
+              <w:jc w:val="left"/>
+            </w:pPr>
+            <w:r>
+              <w:rPr>
+                <w:rFonts w:ascii="Calibri" w:hAnsi="Calibri" w:eastAsia="Yu Gothic"/>
+              </w:rPr>
+              <w:t>Dense symmetric</w:t>
+            </w:r>
+          </w:p>
+        </w:tc>
+        <w:tc>
+          <w:tcPr>
+            <w:tcW w:type="dxa" w:w="1800"/>
+            <w:vAlign w:val="center"/>
+          </w:tcPr>
+          <w:p>
+            <w:pPr>
+              <w:pStyle w:val="ScientificTableText"/>
+              <w:jc w:val="center"/>
+            </w:pPr>
+            <w:r>
+              <w:rPr>
+                <w:rFonts w:ascii="Calibri" w:hAnsi="Calibri" w:eastAsia="Yu Gothic"/>
+              </w:rPr>
+              <w:t>0.9572</w:t>
+            </w:r>
+          </w:p>
+        </w:tc>
+        <w:tc>
+          <w:tcPr>
+            <w:tcW w:type="dxa" w:w="3560"/>
+            <w:vAlign w:val="center"/>
+          </w:tcPr>
+          <w:p>
+            <w:pPr>
+              <w:pStyle w:val="ScientificTableText"/>
+              <w:jc w:val="center"/>
+            </w:pPr>
+            <w:r>
+              <w:rPr>
+                <w:rFonts w:ascii="Calibri" w:hAnsi="Calibri" w:eastAsia="Yu Gothic"/>
+              </w:rPr>
+              <w:t>0.0537</w:t>
+            </w:r>
+          </w:p>
+        </w:tc>
+      </w:tr>
+      <w:tr>
+        <w:tc>
+          <w:tcPr>
+            <w:tcW w:type="dxa" w:w="4000"/>
+            <w:vAlign w:val="center"/>
+          </w:tcPr>
+          <w:p>
+            <w:pPr>
+              <w:pStyle w:val="ScientificTableText"/>
+              <w:jc w:val="left"/>
+            </w:pPr>
+            <w:r>
+              <w:rPr>
+                <w:rFonts w:ascii="Calibri" w:hAnsi="Calibri" w:eastAsia="Yu Gothic"/>
+              </w:rPr>
+              <w:t>Sparse symmetric</w:t>
+            </w:r>
+          </w:p>
+        </w:tc>
+        <w:tc>
+          <w:tcPr>
+            <w:tcW w:type="dxa" w:w="1800"/>
+            <w:vAlign w:val="center"/>
+          </w:tcPr>
+          <w:p>
+            <w:pPr>
+              <w:pStyle w:val="ScientificTableText"/>
+              <w:jc w:val="center"/>
+            </w:pPr>
+            <w:r>
+              <w:rPr>
+                <w:rFonts w:ascii="Calibri" w:hAnsi="Calibri" w:eastAsia="Yu Gothic"/>
+              </w:rPr>
+              <w:t>0.8225</w:t>
+            </w:r>
+          </w:p>
+        </w:tc>
+        <w:tc>
+          <w:tcPr>
+            <w:tcW w:type="dxa" w:w="3560"/>
+            <w:vAlign w:val="center"/>
+          </w:tcPr>
+          <w:p>
+            <w:pPr>
+              <w:pStyle w:val="ScientificTableText"/>
+              <w:jc w:val="center"/>
+            </w:pPr>
+            <w:r>
+              <w:rPr>
+                <w:rFonts w:ascii="Calibri" w:hAnsi="Calibri" w:eastAsia="Yu Gothic"/>
+              </w:rPr>
+              <w:t>0.1289</w:t>
+            </w:r>
+          </w:p>
+        </w:tc>
+      </w:tr>
+      <w:tr>
+        <w:tc>
+          <w:tcPr>
+            <w:tcW w:type="dxa" w:w="4000"/>
+            <w:vAlign w:val="center"/>
+          </w:tcPr>
+          <w:p>
+            <w:pPr>
+              <w:pStyle w:val="ScientificTableText"/>
+              <w:jc w:val="left"/>
+            </w:pPr>
+            <w:r>
+              <w:rPr>
+                <w:rFonts w:ascii="Calibri" w:hAnsi="Calibri" w:eastAsia="Yu Gothic"/>
+              </w:rPr>
+              <w:t>Asymmetric dense</w:t>
+            </w:r>
+          </w:p>
+        </w:tc>
+        <w:tc>
+          <w:tcPr>
+            <w:tcW w:type="dxa" w:w="1800"/>
+            <w:vAlign w:val="center"/>
+          </w:tcPr>
+          <w:p>
+            <w:pPr>
+              <w:pStyle w:val="ScientificTableText"/>
+              <w:jc w:val="center"/>
+            </w:pPr>
+            <w:r>
+              <w:rPr>
+                <w:rFonts w:ascii="Calibri" w:hAnsi="Calibri" w:eastAsia="Yu Gothic"/>
+              </w:rPr>
+              <w:t>0.9534</w:t>
+            </w:r>
+          </w:p>
+        </w:tc>
+        <w:tc>
+          <w:tcPr>
+            <w:tcW w:type="dxa" w:w="3560"/>
+            <w:vAlign w:val="center"/>
+          </w:tcPr>
+          <w:p>
+            <w:pPr>
+              <w:pStyle w:val="ScientificTableText"/>
+              <w:jc w:val="center"/>
+            </w:pPr>
+            <w:r>
+              <w:rPr>
+                <w:rFonts w:ascii="Calibri" w:hAnsi="Calibri" w:eastAsia="Yu Gothic"/>
+              </w:rPr>
+              <w:t>0.0777</w:t>
+            </w:r>
+          </w:p>
+        </w:tc>
+      </w:tr>
+      <w:tr>
+        <w:tc>
+          <w:tcPr>
+            <w:tcW w:type="dxa" w:w="4000"/>
+            <w:vAlign w:val="center"/>
+          </w:tcPr>
+          <w:p>
+            <w:pPr>
+              <w:pStyle w:val="ScientificTableText"/>
+              <w:jc w:val="left"/>
+            </w:pPr>
+            <w:r>
+              <w:rPr>
+                <w:rFonts w:ascii="Calibri" w:hAnsi="Calibri" w:eastAsia="Yu Gothic"/>
+              </w:rPr>
+              <w:t>Feedforward non-normal</w:t>
+            </w:r>
+          </w:p>
+        </w:tc>
+        <w:tc>
+          <w:tcPr>
+            <w:tcW w:type="dxa" w:w="1800"/>
+            <w:vAlign w:val="center"/>
+          </w:tcPr>
+          <w:p>
+            <w:pPr>
+              <w:pStyle w:val="ScientificTableText"/>
+              <w:jc w:val="center"/>
+            </w:pPr>
+            <w:r>
+              <w:rPr>
+                <w:rFonts w:ascii="Calibri" w:hAnsi="Calibri" w:eastAsia="Yu Gothic"/>
+              </w:rPr>
+              <w:t>0.9469</w:t>
+            </w:r>
+          </w:p>
+        </w:tc>
+        <w:tc>
+          <w:tcPr>
+            <w:tcW w:type="dxa" w:w="3560"/>
+            <w:vAlign w:val="center"/>
+          </w:tcPr>
+          <w:p>
+            <w:pPr>
+              <w:pStyle w:val="ScientificTableText"/>
+              <w:jc w:val="center"/>
+            </w:pPr>
+            <w:r>
+              <w:rPr>
+                <w:rFonts w:ascii="Calibri" w:hAnsi="Calibri" w:eastAsia="Yu Gothic"/>
+              </w:rPr>
+              <w:t>0.0684</w:t>
+            </w:r>
+          </w:p>
+        </w:tc>
+      </w:tr>
+    </w:tbl>
+    <w:p>
+      <w:pPr>
+        <w:spacing w:before="0" w:after="40"/>
+      </w:pPr>
+    </w:p>
+    <w:p>
+      <w:r>
+        <w:rPr>
+          <w:rFonts w:ascii="Calibri" w:hAnsi="Calibri" w:eastAsia="Yu Gothic"/>
+        </w:rPr>
+        <w:t>Pilotで最大誤差だったsparse symmetricを除外せず、全familyで事前閾値0.75を 上回った。Pooled baselineとseed単位paired誤差差を次に示す。</w:t>
+      </w:r>
+    </w:p>
+    <w:tbl>
+      <w:tblPr>
+        <w:tblW w:type="dxa" w:w="9360"/>
+        <w:tblLayout w:type="fixed"/>
+        <w:tblLook w:firstColumn="1" w:firstRow="1" w:lastColumn="0" w:lastRow="0" w:noHBand="0" w:noVBand="1" w:val="04A0"/>
+        <w:tblInd w:w="120" w:type="dxa"/>
+        <w:tblLayout w:type="fixed"/>
+        <w:tblBorders>
+          <w:top w:val="single" w:sz="4" w:color="CBD2DA"/>
+          <w:left w:val="single" w:sz="4" w:color="CBD2DA"/>
+          <w:bottom w:val="single" w:sz="4" w:color="CBD2DA"/>
+          <w:right w:val="single" w:sz="4" w:color="CBD2DA"/>
+          <w:insideH w:val="single" w:sz="4" w:color="CBD2DA"/>
+          <w:insideV w:val="single" w:sz="4" w:color="CBD2DA"/>
+        </w:tblBorders>
+        <w:tblCellMar>
+          <w:top w:w="80" w:type="dxa"/>
+          <w:bottom w:w="80" w:type="dxa"/>
+          <w:start w:w="120" w:type="dxa"/>
+          <w:end w:w="120" w:type="dxa"/>
+        </w:tblCellMar>
+      </w:tblPr>
+      <w:tblGrid>
+        <w:gridCol w:w="2350"/>
+        <w:gridCol w:w="2850"/>
+        <w:gridCol w:w="2100"/>
+        <w:gridCol w:w="2060"/>
+      </w:tblGrid>
+      <w:tr>
+        <w:trPr>
+          <w:tblHeader w:val="true"/>
+        </w:trPr>
+        <w:tc>
+          <w:tcPr>
+            <w:tcW w:type="dxa" w:w="2350"/>
+            <w:vAlign w:val="center"/>
+            <w:shd w:fill="F4F6F9"/>
+          </w:tcPr>
+          <w:p>
+            <w:pPr>
+              <w:pStyle w:val="ScientificTableText"/>
+              <w:jc w:val="left"/>
+            </w:pPr>
+            <w:r>
+              <w:rPr>
+                <w:rFonts w:ascii="Calibri" w:hAnsi="Calibri" w:eastAsia="Yu Gothic"/>
+                <w:b/>
+              </w:rPr>
+              <w:t>Baseline</w:t>
+            </w:r>
+          </w:p>
+        </w:tc>
+        <w:tc>
+          <w:tcPr>
+            <w:tcW w:type="dxa" w:w="2850"/>
+            <w:vAlign w:val="center"/>
+            <w:shd w:fill="F4F6F9"/>
+          </w:tcPr>
+          <w:p>
+            <w:pPr>
+              <w:pStyle w:val="ScientificTableText"/>
+              <w:jc w:val="center"/>
+            </w:pPr>
+            <w:r>
+              <w:rPr>
+                <w:rFonts w:ascii="Calibri" w:hAnsi="Calibri" w:eastAsia="Yu Gothic"/>
+                <w:b/>
+              </w:rPr>
+              <w:t>Baseline MAE</w:t>
+            </w:r>
+          </w:p>
+        </w:tc>
+        <w:tc>
+          <w:tcPr>
+            <w:tcW w:type="dxa" w:w="2100"/>
+            <w:vAlign w:val="center"/>
+            <w:shd w:fill="F4F6F9"/>
+          </w:tcPr>
+          <w:p>
+            <w:pPr>
+              <w:pStyle w:val="ScientificTableText"/>
+              <w:jc w:val="center"/>
+            </w:pPr>
+            <w:r>
+              <w:rPr>
+                <w:rFonts w:ascii="Calibri" w:hAnsi="Calibri" w:eastAsia="Yu Gothic"/>
+                <w:b/>
+              </w:rPr>
+              <w:t>Baseline minus robust-pair MAE</w:t>
+            </w:r>
+          </w:p>
+        </w:tc>
+        <w:tc>
+          <w:tcPr>
+            <w:tcW w:type="dxa" w:w="2060"/>
+            <w:vAlign w:val="center"/>
+            <w:shd w:fill="F4F6F9"/>
+          </w:tcPr>
+          <w:p>
+            <w:pPr>
+              <w:pStyle w:val="ScientificTableText"/>
+              <w:jc w:val="center"/>
+            </w:pPr>
+            <w:r>
+              <w:rPr>
+                <w:rFonts w:ascii="Calibri" w:hAnsi="Calibri" w:eastAsia="Yu Gothic"/>
+                <w:b/>
+              </w:rPr>
+              <w:t>95%区間</w:t>
+            </w:r>
+          </w:p>
+        </w:tc>
+      </w:tr>
+      <w:tr>
+        <w:tc>
+          <w:tcPr>
+            <w:tcW w:type="dxa" w:w="2350"/>
+            <w:vAlign w:val="center"/>
+          </w:tcPr>
+          <w:p>
+            <w:pPr>
+              <w:pStyle w:val="ScientificTableText"/>
+              <w:jc w:val="left"/>
+            </w:pPr>
+            <w:r>
+              <w:rPr>
+                <w:rFonts w:ascii="Calibri" w:hAnsi="Calibri" w:eastAsia="Yu Gothic"/>
+              </w:rPr>
+              <w:t>Raw count</w:t>
+            </w:r>
+          </w:p>
+        </w:tc>
+        <w:tc>
+          <w:tcPr>
+            <w:tcW w:type="dxa" w:w="2850"/>
+            <w:vAlign w:val="center"/>
+          </w:tcPr>
+          <w:p>
+            <w:pPr>
+              <w:pStyle w:val="ScientificTableText"/>
+              <w:jc w:val="center"/>
+            </w:pPr>
+            <w:r>
+              <w:rPr>
+                <w:rFonts w:ascii="Calibri" w:hAnsi="Calibri" w:eastAsia="Yu Gothic"/>
+              </w:rPr>
+              <w:t>0.1308</w:t>
+            </w:r>
+          </w:p>
+        </w:tc>
+        <w:tc>
+          <w:tcPr>
+            <w:tcW w:type="dxa" w:w="2100"/>
+            <w:vAlign w:val="center"/>
+          </w:tcPr>
+          <w:p>
+            <w:pPr>
+              <w:pStyle w:val="ScientificTableText"/>
+              <w:jc w:val="center"/>
+            </w:pPr>
+            <w:r>
+              <w:rPr>
+                <w:rFonts w:ascii="Calibri" w:hAnsi="Calibri" w:eastAsia="Yu Gothic"/>
+              </w:rPr>
+              <w:t>0.0486</w:t>
+            </w:r>
+          </w:p>
+        </w:tc>
+        <w:tc>
+          <w:tcPr>
+            <w:tcW w:type="dxa" w:w="2060"/>
+            <w:vAlign w:val="center"/>
+          </w:tcPr>
+          <w:p>
+            <w:pPr>
+              <w:pStyle w:val="ScientificTableText"/>
+              <w:jc w:val="center"/>
+            </w:pPr>
+            <w:r>
+              <w:rPr>
+                <w:rFonts w:ascii="Calibri" w:hAnsi="Calibri" w:eastAsia="Yu Gothic"/>
+              </w:rPr>
+              <w:t>[0.0468, 0.0505]</w:t>
+            </w:r>
+          </w:p>
+        </w:tc>
+      </w:tr>
+      <w:tr>
+        <w:tc>
+          <w:tcPr>
+            <w:tcW w:type="dxa" w:w="2350"/>
+            <w:vAlign w:val="center"/>
+          </w:tcPr>
+          <w:p>
+            <w:pPr>
+              <w:pStyle w:val="ScientificTableText"/>
+              <w:jc w:val="left"/>
+            </w:pPr>
+            <w:r>
+              <w:rPr>
+                <w:rFonts w:ascii="Calibri" w:hAnsi="Calibri" w:eastAsia="Yu Gothic"/>
+              </w:rPr>
+              <w:t>Normalized margin</w:t>
+            </w:r>
+          </w:p>
+        </w:tc>
+        <w:tc>
+          <w:tcPr>
+            <w:tcW w:type="dxa" w:w="2850"/>
+            <w:vAlign w:val="center"/>
+          </w:tcPr>
+          <w:p>
+            <w:pPr>
+              <w:pStyle w:val="ScientificTableText"/>
+              <w:jc w:val="center"/>
+            </w:pPr>
+            <w:r>
+              <w:rPr>
+                <w:rFonts w:ascii="Calibri" w:hAnsi="Calibri" w:eastAsia="Yu Gothic"/>
+              </w:rPr>
+              <w:t>0.0886</w:t>
+            </w:r>
+          </w:p>
+        </w:tc>
+        <w:tc>
+          <w:tcPr>
+            <w:tcW w:type="dxa" w:w="2100"/>
+            <w:vAlign w:val="center"/>
+          </w:tcPr>
+          <w:p>
+            <w:pPr>
+              <w:pStyle w:val="ScientificTableText"/>
+              <w:jc w:val="center"/>
+            </w:pPr>
+            <w:r>
+              <w:rPr>
+                <w:rFonts w:ascii="Calibri" w:hAnsi="Calibri" w:eastAsia="Yu Gothic"/>
+              </w:rPr>
+              <w:t>0.0064</w:t>
+            </w:r>
+          </w:p>
+        </w:tc>
+        <w:tc>
+          <w:tcPr>
+            <w:tcW w:type="dxa" w:w="2060"/>
+            <w:vAlign w:val="center"/>
+          </w:tcPr>
+          <w:p>
+            <w:pPr>
+              <w:pStyle w:val="ScientificTableText"/>
+              <w:jc w:val="center"/>
+            </w:pPr>
+            <w:r>
+              <w:rPr>
+                <w:rFonts w:ascii="Calibri" w:hAnsi="Calibri" w:eastAsia="Yu Gothic"/>
+              </w:rPr>
+              <w:t>[0.0059, 0.0070]</w:t>
+            </w:r>
+          </w:p>
+        </w:tc>
+      </w:tr>
+      <w:tr>
+        <w:tc>
+          <w:tcPr>
+            <w:tcW w:type="dxa" w:w="2350"/>
+            <w:vAlign w:val="center"/>
+          </w:tcPr>
+          <w:p>
+            <w:pPr>
+              <w:pStyle w:val="ScientificTableText"/>
+              <w:jc w:val="left"/>
+            </w:pPr>
+            <w:r>
+              <w:rPr>
+                <w:rFonts w:ascii="Calibri" w:hAnsi="Calibri" w:eastAsia="Yu Gothic"/>
+              </w:rPr>
+              <w:t>Structural</w:t>
+            </w:r>
+          </w:p>
+        </w:tc>
+        <w:tc>
+          <w:tcPr>
+            <w:tcW w:type="dxa" w:w="2850"/>
+            <w:vAlign w:val="center"/>
+          </w:tcPr>
+          <w:p>
+            <w:pPr>
+              <w:pStyle w:val="ScientificTableText"/>
+              <w:jc w:val="center"/>
+            </w:pPr>
+            <w:r>
+              <w:rPr>
+                <w:rFonts w:ascii="Calibri" w:hAnsi="Calibri" w:eastAsia="Yu Gothic"/>
+              </w:rPr>
+              <w:t>0.1184</w:t>
+            </w:r>
+          </w:p>
+        </w:tc>
+        <w:tc>
+          <w:tcPr>
+            <w:tcW w:type="dxa" w:w="2100"/>
+            <w:vAlign w:val="center"/>
+          </w:tcPr>
+          <w:p>
+            <w:pPr>
+              <w:pStyle w:val="ScientificTableText"/>
+              <w:jc w:val="center"/>
+            </w:pPr>
+            <w:r>
+              <w:rPr>
+                <w:rFonts w:ascii="Calibri" w:hAnsi="Calibri" w:eastAsia="Yu Gothic"/>
+              </w:rPr>
+              <w:t>0.0362</w:t>
+            </w:r>
+          </w:p>
+        </w:tc>
+        <w:tc>
+          <w:tcPr>
+            <w:tcW w:type="dxa" w:w="2060"/>
+            <w:vAlign w:val="center"/>
+          </w:tcPr>
+          <w:p>
+            <w:pPr>
+              <w:pStyle w:val="ScientificTableText"/>
+              <w:jc w:val="center"/>
+            </w:pPr>
+            <w:r>
+              <w:rPr>
+                <w:rFonts w:ascii="Calibri" w:hAnsi="Calibri" w:eastAsia="Yu Gothic"/>
+              </w:rPr>
+              <w:t>[0.0319, 0.0404]</w:t>
+            </w:r>
+          </w:p>
+        </w:tc>
+      </w:tr>
+    </w:tbl>
+    <w:p>
+      <w:pPr>
+        <w:spacing w:before="0" w:after="40"/>
+      </w:pPr>
+    </w:p>
+    <w:p>
+      <w:r>
+        <w:rPr>
+          <w:rFonts w:ascii="Calibri" w:hAnsi="Calibri" w:eastAsia="Yu Gothic"/>
+        </w:rPr>
+        <w:t>Normalized margin比較はsecondary endpointである。全区間下限が0を上回ったが、 事後に主要判定へ追加していない。</w:t>
+      </w:r>
+    </w:p>
+    <w:p>
+      <w:pPr>
         <w:pStyle w:val="Heading1"/>
       </w:pPr>
       <w:r>
@@ -2425,7 +3165,31 @@
         <w:rPr>
           <w:rFonts w:ascii="Calibri" w:hAnsi="Calibri" w:eastAsia="Yu Gothic"/>
         </w:rPr>
-        <w:t>低外乱ではthreshold付きrobust fractionが有効であり、高外乱では連続的な平均marginがより情報を持った。従って、分析ツールは単一scoreへ縮約せず、raw count、certified count、</w:t>
+        <w:t xml:space="preserve">低外乱ではthreshold付きrobust fractionが有効であり、高外乱では連続的な平均marginがより情報を持った。EXP-2026-011では、curveの要求点での高さ </w:t>
+      </w:r>
+      <w:r>
+        <w:rPr>
+          <w:rFonts w:ascii="Cambria Math" w:hAnsi="Cambria Math" w:eastAsia="Yu Gothic"/>
+        </w:rPr>
+        <w:t>R(e)</w:t>
+      </w:r>
+      <w:r>
+        <w:rPr>
+          <w:rFonts w:ascii="Calibri" w:hAnsi="Calibri" w:eastAsia="Yu Gothic"/>
+        </w:rPr>
+        <w:t xml:space="preserve"> と無次元化面積 </w:t>
+      </w:r>
+      <w:r>
+        <w:rPr>
+          <w:rFonts w:ascii="Cambria Math" w:hAnsi="Cambria Math" w:eastAsia="Yu Gothic"/>
+        </w:rPr>
+        <w:t>μ̄/e</w:t>
+      </w:r>
+      <w:r>
+        <w:rPr>
+          <w:rFonts w:ascii="Calibri" w:hAnsi="Calibri" w:eastAsia="Yu Gothic"/>
+        </w:rPr>
+        <w:t xml:space="preserve"> の組が、いずれか単独より小さい未知seed MAEを示した。従って、分析ツールは単一scoreへ縮約せず、raw count、certified count、</w:t>
       </w:r>
       <w:r>
         <w:rPr>
@@ -2465,6 +3229,11 @@
       </w:r>
     </w:p>
     <w:p>
+      <w:r>
+        <w:br w:type="page"/>
+      </w:r>
+    </w:p>
+    <w:p>
       <w:pPr>
         <w:pStyle w:val="Heading2"/>
       </w:pPr>
@@ -2485,7 +3254,7 @@
         <w:rPr>
           <w:rFonts w:ascii="Calibri" w:hAnsi="Calibri" w:eastAsia="Yu Gothic"/>
         </w:rPr>
-        <w:t>ただしfamily内では局所baselineが優位な例もあった。次の検証では、family indicator、coupling、局所Jacobian、minimum coordinate、nonnormalityを同時に含む多変量modelへmarginを追加し、nested cross-validationで増分説明力を測る必要がある。</w:t>
+        <w:t>ただしfamily内では局所baselineが優位な例もあった。EXP-2026-011ではcoupling、局所Jacobian、minimum coordinate、nonnormalityを同時に含むstructural modelを事前登録baselineとし、robust pairがpooled MAEを上回った。これは線形ridgeの範囲での増分予測力であり、非線形model、family indicatorを用いた階層model、nested cross-validationとの比較は残る。</w:t>
       </w:r>
     </w:p>
     <w:p>
@@ -2519,7 +3288,7 @@
         <w:rPr>
           <w:rFonts w:ascii="Cambria Math" w:hAnsi="Cambria Math" w:eastAsia="Yu Gothic"/>
         </w:rPr>
-        <w:t>e_k</w:t>
+        <w:t>eₖ</w:t>
       </w:r>
       <w:r>
         <w:rPr>
@@ -2531,7 +3300,7 @@
         <w:rPr>
           <w:rFonts w:ascii="Cambria Math" w:hAnsi="Cambria Math" w:eastAsia="Yu Gothic"/>
         </w:rPr>
-        <w:t>μ_k</w:t>
+        <w:t>μₖ</w:t>
       </w:r>
       <w:r>
         <w:rPr>
@@ -2549,7 +3318,7 @@
           <w:rFonts w:ascii="Cambria Math" w:hAnsi="Cambria Math"/>
           <w:sz w:val="21"/>
         </w:rPr>
-        <w:t>ρ_k=(e_k)/(μ_k)</w:t>
+        <w:t>ρₖ=(eₖ)/(μₖ)</w:t>
       </w:r>
     </w:p>
     <w:p>
@@ -2563,7 +3332,7 @@
         <w:rPr>
           <w:rFonts w:ascii="Cambria Math" w:hAnsi="Cambria Math" w:eastAsia="Yu Gothic"/>
         </w:rPr>
-        <w:t>ρ_k&lt;1</w:t>
+        <w:t>ρₖ&lt;1</w:t>
       </w:r>
       <w:r>
         <w:rPr>
@@ -2575,7 +3344,7 @@
         <w:rPr>
           <w:rFonts w:ascii="Cambria Math" w:hAnsi="Cambria Math" w:eastAsia="Yu Gothic"/>
         </w:rPr>
-        <w:t>ρ_k≥1</w:t>
+        <w:t>ρₖ≥1</w:t>
       </w:r>
       <w:r>
         <w:rPr>
@@ -2589,7 +3358,7 @@
         <w:rPr>
           <w:rFonts w:ascii="Calibri" w:hAnsi="Calibri" w:eastAsia="Yu Gothic"/>
         </w:rPr>
-        <w:t>EXP-2026-010は、同じ状態数を持つ人工回路でもmargin分布により利用可能性が異なることを示した。この結果は上の仮説と整合するが、遺伝的設計、発生、可塑性、生物回路を観測していない。生物学的主張には、発生過程または学習maskを操作し、core margin、忘却、新規task獲得の因果関係を測る別研究が必要である。</w:t>
+        <w:t>EXP-2026-010は、同じ状態数を持つ人工回路でもmargin分布により利用可能性が異なることを示した。EXP-2026-011はさらに、要求budgetで残る状態割合と余裕総量の二成分が、fitから除外した構造の新規seedへ移送できることを示した。この結果は上の仮説と整合するが、遺伝的設計、発生、可塑性、生物回路を観測していない。生物学的主張には、発生過程または学習maskを操作し、core margin、忘却、新規task獲得の因果関係を測る別研究が必要である。</w:t>
       </w:r>
     </w:p>
     <w:p>
@@ -2655,7 +3424,7 @@
         <w:rPr>
           <w:rFonts w:ascii="Cambria Math" w:hAnsi="Cambria Math" w:eastAsia="Yu Gothic"/>
         </w:rPr>
-        <w:t>ρ_k</w:t>
+        <w:t>ρₖ</w:t>
       </w:r>
       <w:r>
         <w:rPr>
@@ -2701,7 +3470,7 @@
         <w:rPr>
           <w:rFonts w:ascii="Calibri" w:hAnsi="Calibri" w:eastAsia="Yu Gothic"/>
         </w:rPr>
-        <w:t>第六に、couplingとlocal Jacobianに対するpooled優位は事前登録secondary endpointである。第七に、familyを丸ごと未知にした予測、非線形多変量baseline、別task family、basin-weighted safe massは未検証である。第八に、生物学的core–reserve仮説と人間規模条件は本稿の実験から直接導かれない。</w:t>
+        <w:t>第六に、EXP-2026-010のcouplingとlocal Jacobianに対するpooled優位は事前登録secondary endpointである。第七に、EXP-2026-011はfold内で対象familyをfitから除外したが、candidate選択には4 familyすべてのpilot成績を用いた。candidate選択にも未使用の第五family、非線形baseline、別task family、basin-weighted safe massは未検証である。第八に、生物学的core–reserve仮説と人間規模条件は本稿の実験から直接導かれない。</w:t>
       </w:r>
     </w:p>
     <w:p>
@@ -2717,7 +3486,7 @@
         <w:rPr>
           <w:rFonts w:ascii="Calibri" w:hAnsi="Calibri" w:eastAsia="Yu Gothic"/>
         </w:rPr>
-        <w:t>自律アトラクタ数を完全に一致させても、有限外乱下で利用できる記憶状態は異なり得る。符号orthantごとのrobust invariant hyperbox marginを用いることで、この差を保証下界と経験予測の両面から記述できた。未使用seedと4 network familyで、平均marginは外乱下符号記憶保持率と高い順位相関を持ち、poolした予測ではraw count、coupling、局所Jacobianより小さいMAEを示した。</w:t>
+        <w:t>自律アトラクタ数を完全に一致させても、有限外乱下で利用できる記憶状態は異なり得る。符号orthantごとのrobust invariant hyperbox marginを用いることで、この差を保証下界と経験予測の両面から記述できた。未使用seedと4 network familyで平均marginは外乱下符号記憶保持率と高い順位相関を持った。さらにcurveの高さと面積からなるrobust pairは、familyをfitから除外した未知seed予測でraw countと多変量structural baselineより小さいMAEを示した。</w:t>
       </w:r>
     </w:p>
     <w:p>
@@ -2725,7 +3494,12 @@
         <w:rPr>
           <w:rFonts w:ascii="Calibri" w:hAnsi="Calibri" w:eastAsia="Yu Gothic"/>
         </w:rPr>
-        <w:t>本研究は「アトラクタの数」から「外乱budget付きの利用可能なアトラクタprofile」へ評価単位を移す。次の焦点は、未知family、確率外乱、高次元系、より豊かなset表現へ一般化し、最終的にmargin profileへの介入が同一予算baselineより学習、記憶、頑健性を改善するかを検証することである。</w:t>
+        <w:t>本研究は「アトラクタの数」から「外乱budget付きの利用可能なアトラクタprofile」へ評価単位を移す。次の焦点は、candidate選択にも未使用の第五family、確率外乱、高次元系、より豊かなset表現へ一般化し、最終的にmargin profileへの介入が同一予算baselineより学習、記憶、頑健性を改善するかを検証することである。</w:t>
+      </w:r>
+    </w:p>
+    <w:p>
+      <w:r>
+        <w:br w:type="page"/>
       </w:r>
     </w:p>
     <w:p>
@@ -2737,24 +3511,46 @@
       </w:r>
     </w:p>
     <w:p>
+      <w:pPr>
+        <w:pStyle w:val="Reproducibility"/>
+        <w:jc w:val="left"/>
+      </w:pPr>
       <w:r>
         <w:rPr>
           <w:rFonts w:ascii="Calibri" w:hAnsi="Calibri" w:eastAsia="Yu Gothic"/>
         </w:rPr>
-        <w:t xml:space="preserve">実験spec、seed、判定、導出済みartifact、主張台帳、実装、テストは本repositoryに保存した。主要記録はEXP-2026-008、EXP-2026-009、EXP-2026-010である。実行環境はDocker image digest、Git base commit、source manifest SHA-256 </w:t>
+        <w:t xml:space="preserve">実験spec、seed、判定、導出済みartifact、主張台帳、実装、テストは本repositoryに保存した。主要記録はEXP-2026-008、EXP-2026-009、EXP-2026-010、EXP-2026-011である。EXP-2026-011 confirmationはsource/test manifest SHA-256 </w:t>
       </w:r>
       <w:r>
         <w:rPr>
           <w:rFonts w:ascii="Consolas" w:hAnsi="Consolas" w:eastAsia="Yu Gothic"/>
           <w:sz w:val="19"/>
         </w:rPr>
-        <w:t>88a8d1a49af59acec345d3ce79c1030cfab7b3c73e6ecf4fa85685446e5d2266</w:t>
+        <w:t>b022077a3279917d02805a021048382f0b50f33387283d5c900a82b3ff9d0fcd</w:t>
       </w:r>
       <w:r>
         <w:rPr>
           <w:rFonts w:ascii="Calibri" w:hAnsi="Calibri" w:eastAsia="Yu Gothic"/>
         </w:rPr>
-        <w:t xml:space="preserve"> で固定した。全129テストが通過し、branch coverageは90%だった。</w:t>
+        <w:t xml:space="preserve"> で事前固定した。組版検証追加後の現行manifestは </w:t>
+      </w:r>
+      <w:r>
+        <w:rPr>
+          <w:rFonts w:ascii="Consolas" w:hAnsi="Consolas" w:eastAsia="Yu Gothic"/>
+          <w:sz w:val="19"/>
+        </w:rPr>
+        <w:t>7db1dc7182893688558eaf7cb7095a8f2ad16c2712620a49f79787df8b4d33f1</w:t>
+      </w:r>
+      <w:r>
+        <w:rPr>
+          <w:rFonts w:ascii="Calibri" w:hAnsi="Calibri" w:eastAsia="Yu Gothic"/>
+        </w:rPr>
+        <w:t xml:space="preserve"> であり、全145テストと11 subtestが通過し、branch coverageは88%だった。</w:t>
+      </w:r>
+    </w:p>
+    <w:p>
+      <w:r>
+        <w:br w:type="page"/>
       </w:r>
     </w:p>
     <w:p>
@@ -2768,6 +3564,7 @@
     <w:p>
       <w:pPr>
         <w:pStyle w:val="Bibliography"/>
+        <w:jc w:val="left"/>
       </w:pPr>
       <w:r>
         <w:rPr>
@@ -2779,6 +3576,7 @@
     <w:p>
       <w:pPr>
         <w:pStyle w:val="Bibliography"/>
+        <w:jc w:val="left"/>
       </w:pPr>
       <w:r>
         <w:rPr>
@@ -2790,6 +3588,7 @@
     <w:p>
       <w:pPr>
         <w:pStyle w:val="Bibliography"/>
+        <w:jc w:val="left"/>
       </w:pPr>
       <w:r>
         <w:rPr>
@@ -2801,6 +3600,7 @@
     <w:p>
       <w:pPr>
         <w:pStyle w:val="Bibliography"/>
+        <w:jc w:val="left"/>
       </w:pPr>
       <w:r>
         <w:rPr>
@@ -2812,6 +3612,7 @@
     <w:p>
       <w:pPr>
         <w:pStyle w:val="Bibliography"/>
+        <w:jc w:val="left"/>
       </w:pPr>
       <w:r>
         <w:rPr>
@@ -2823,6 +3624,7 @@
     <w:p>
       <w:pPr>
         <w:pStyle w:val="Bibliography"/>
+        <w:jc w:val="left"/>
       </w:pPr>
       <w:r>
         <w:rPr>
@@ -2834,6 +3636,7 @@
     <w:p>
       <w:pPr>
         <w:pStyle w:val="Bibliography"/>
+        <w:jc w:val="left"/>
       </w:pPr>
       <w:r>
         <w:rPr>
@@ -2845,6 +3648,7 @@
     <w:p>
       <w:pPr>
         <w:pStyle w:val="Bibliography"/>
+        <w:jc w:val="left"/>
       </w:pPr>
       <w:r>
         <w:rPr>
@@ -2856,6 +3660,7 @@
     <w:p>
       <w:pPr>
         <w:pStyle w:val="Bibliography"/>
+        <w:jc w:val="left"/>
       </w:pPr>
       <w:r>
         <w:rPr>
@@ -2867,6 +3672,7 @@
     <w:p>
       <w:pPr>
         <w:pStyle w:val="Bibliography"/>
+        <w:jc w:val="left"/>
       </w:pPr>
       <w:r>
         <w:rPr>
@@ -2878,6 +3684,7 @@
     <w:p>
       <w:pPr>
         <w:pStyle w:val="Bibliography"/>
+        <w:jc w:val="left"/>
       </w:pPr>
       <w:r>
         <w:rPr>
@@ -2889,6 +3696,7 @@
     <w:p>
       <w:pPr>
         <w:pStyle w:val="Bibliography"/>
+        <w:jc w:val="left"/>
       </w:pPr>
       <w:r>
         <w:rPr>
@@ -2900,6 +3708,7 @@
     <w:p>
       <w:pPr>
         <w:pStyle w:val="Bibliography"/>
+        <w:jc w:val="left"/>
       </w:pPr>
       <w:r>
         <w:rPr>
@@ -2911,6 +3720,7 @@
     <w:p>
       <w:pPr>
         <w:pStyle w:val="Bibliography"/>
+        <w:jc w:val="left"/>
       </w:pPr>
       <w:r>
         <w:rPr>
@@ -2922,6 +3732,7 @@
     <w:p>
       <w:pPr>
         <w:pStyle w:val="Bibliography"/>
+        <w:jc w:val="left"/>
       </w:pPr>
       <w:r>
         <w:rPr>
@@ -2932,9 +3743,11 @@
     </w:p>
     <w:sectPr>
       <w:headerReference w:type="default" r:id="rId9"/>
-      <w:footerReference w:type="default" r:id="rId10"/>
+      <w:headerReference w:type="even" r:id="rId10"/>
+      <w:footerReference w:type="default" r:id="rId11"/>
+      <w:footerReference w:type="even" r:id="rId12"/>
       <w:pgSz w:w="12240" w:h="15840"/>
-      <w:pgMar w:top="1440" w:right="1440" w:bottom="1440" w:left="1440" w:header="708" w:footer="708" w:gutter="0"/>
+      <w:pgMar w:top="1440" w:right="1440" w:bottom="1728" w:left="1440" w:header="708" w:footer="708" w:gutter="0"/>
       <w:cols w:space="720"/>
       <w:docGrid w:linePitch="360"/>
     </w:sectPr>
@@ -2966,7 +3779,64 @@
 </w:ftr>
 </file>
 
+<file path=word/footer2.xml><?xml version="1.0" encoding="utf-8"?>
+<w:ftr xmlns:m="http://schemas.openxmlformats.org/officeDocument/2006/math" xmlns:mc="http://schemas.openxmlformats.org/markup-compatibility/2006" xmlns:mo="http://schemas.microsoft.com/office/mac/office/2008/main" xmlns:mv="urn:schemas-microsoft-com:mac:vml" xmlns:o="urn:schemas-microsoft-com:office:office" xmlns:r="http://schemas.openxmlformats.org/officeDocument/2006/relationships" xmlns:v="urn:schemas-microsoft-com:vml" xmlns:w10="urn:schemas-microsoft-com:office:word" xmlns:w14="http://schemas.microsoft.com/office/word/2010/wordml" xmlns:w="http://schemas.openxmlformats.org/wordprocessingml/2006/main" xmlns:wne="http://schemas.microsoft.com/office/word/2006/wordml" xmlns:wp14="http://schemas.microsoft.com/office/word/2010/wordprocessingDrawing" xmlns:wp="http://schemas.openxmlformats.org/drawingml/2006/wordprocessingDrawing" xmlns:wpc="http://schemas.microsoft.com/office/word/2010/wordprocessingCanvas" xmlns:wpg="http://schemas.microsoft.com/office/word/2010/wordprocessingGroup" xmlns:wpi="http://schemas.microsoft.com/office/word/2010/wordprocessingInk" xmlns:wps="http://schemas.microsoft.com/office/word/2010/wordprocessingShape" mc:Ignorable="w14 wp14">
+  <w:p>
+    <w:pPr>
+      <w:pStyle w:val="Footer"/>
+      <w:spacing w:before="0" w:after="0"/>
+      <w:jc w:val="right"/>
+    </w:pPr>
+    <w:r>
+      <w:rPr>
+        <w:rFonts w:ascii="Calibri" w:hAnsi="Calibri" w:eastAsia="Yu Gothic"/>
+        <w:color w:val="5B6573"/>
+        <w:sz w:val="17"/>
+      </w:rPr>
+      <w:fldChar w:fldCharType="begin"/>
+      <w:instrText xml:space="preserve"> PAGE </w:instrText>
+      <w:fldChar w:fldCharType="separate"/>
+      <w:t>1</w:t>
+      <w:fldChar w:fldCharType="end"/>
+    </w:r>
+  </w:p>
+</w:ftr>
+</file>
+
 <file path=word/header1.xml><?xml version="1.0" encoding="utf-8"?>
+<w:hdr xmlns:m="http://schemas.openxmlformats.org/officeDocument/2006/math" xmlns:mc="http://schemas.openxmlformats.org/markup-compatibility/2006" xmlns:mo="http://schemas.microsoft.com/office/mac/office/2008/main" xmlns:mv="urn:schemas-microsoft-com:mac:vml" xmlns:o="urn:schemas-microsoft-com:office:office" xmlns:r="http://schemas.openxmlformats.org/officeDocument/2006/relationships" xmlns:v="urn:schemas-microsoft-com:vml" xmlns:w10="urn:schemas-microsoft-com:office:word" xmlns:w14="http://schemas.microsoft.com/office/word/2010/wordml" xmlns:w="http://schemas.openxmlformats.org/wordprocessingml/2006/main" xmlns:wne="http://schemas.microsoft.com/office/word/2006/wordml" xmlns:wp14="http://schemas.microsoft.com/office/word/2010/wordprocessingDrawing" xmlns:wp="http://schemas.openxmlformats.org/drawingml/2006/wordprocessingDrawing" xmlns:wpc="http://schemas.microsoft.com/office/word/2010/wordprocessingCanvas" xmlns:wpg="http://schemas.microsoft.com/office/word/2010/wordprocessingGroup" xmlns:wpi="http://schemas.microsoft.com/office/word/2010/wordprocessingInk" xmlns:wps="http://schemas.microsoft.com/office/word/2010/wordprocessingShape" mc:Ignorable="w14 wp14">
+  <w:p>
+    <w:pPr>
+      <w:pStyle w:val="Header"/>
+      <w:tabs>
+        <w:tab w:pos="9360" w:val="right"/>
+      </w:tabs>
+      <w:spacing w:after="0"/>
+    </w:pPr>
+    <w:r>
+      <w:rPr>
+        <w:rFonts w:ascii="Calibri" w:hAnsi="Calibri" w:eastAsia="Yu Gothic"/>
+        <w:color w:val="5B6573"/>
+        <w:sz w:val="17"/>
+      </w:rPr>
+      <w:t>Reservoir Dynamics Research</w:t>
+    </w:r>
+    <w:r>
+      <w:tab/>
+    </w:r>
+    <w:r>
+      <w:rPr>
+        <w:rFonts w:ascii="Calibri" w:hAnsi="Calibri" w:eastAsia="Yu Gothic"/>
+        <w:color w:val="5B6573"/>
+        <w:sz w:val="17"/>
+      </w:rPr>
+      <w:t>研究草稿</w:t>
+    </w:r>
+  </w:p>
+</w:hdr>
+</file>
+
+<file path=word/header2.xml><?xml version="1.0" encoding="utf-8"?>
 <w:hdr xmlns:m="http://schemas.openxmlformats.org/officeDocument/2006/math" xmlns:mc="http://schemas.openxmlformats.org/markup-compatibility/2006" xmlns:mo="http://schemas.microsoft.com/office/mac/office/2008/main" xmlns:mv="urn:schemas-microsoft-com:mac:vml" xmlns:o="urn:schemas-microsoft-com:office:office" xmlns:r="http://schemas.openxmlformats.org/officeDocument/2006/relationships" xmlns:v="urn:schemas-microsoft-com:vml" xmlns:w10="urn:schemas-microsoft-com:office:word" xmlns:w14="http://schemas.microsoft.com/office/word/2010/wordml" xmlns:w="http://schemas.openxmlformats.org/wordprocessingml/2006/main" xmlns:wne="http://schemas.microsoft.com/office/word/2006/wordml" xmlns:wp14="http://schemas.microsoft.com/office/word/2010/wordprocessingDrawing" xmlns:wp="http://schemas.openxmlformats.org/drawingml/2006/wordprocessingDrawing" xmlns:wpc="http://schemas.microsoft.com/office/word/2010/wordprocessingCanvas" xmlns:wpg="http://schemas.microsoft.com/office/word/2010/wordprocessingGroup" xmlns:wpi="http://schemas.microsoft.com/office/word/2010/wordprocessingInk" xmlns:wps="http://schemas.microsoft.com/office/word/2010/wordprocessingShape" mc:Ignorable="w14 wp14">
   <w:p>
     <w:pPr>
@@ -15144,14 +16014,28 @@
   <w:style w:type="paragraph" w:customStyle="1" w:styleId="Bibliography">
     <w:name w:val="Bibliography"/>
     <w:pPr>
-      <w:spacing w:before="0" w:after="100" w:line="280" w:lineRule="auto"/>
+      <w:spacing w:before="0" w:after="60" w:line="280" w:lineRule="auto"/>
       <w:ind w:left="432" w:hanging="432"/>
+      <w:jc w:val="left"/>
     </w:pPr>
     <w:rPr>
       <w:rFonts w:ascii="Calibri" w:hAnsi="Calibri" w:eastAsia="Yu Gothic"/>
       <w:b w:val="0"/>
       <w:color w:val="222222"/>
       <w:sz w:val="19"/>
+    </w:rPr>
+  </w:style>
+  <w:style w:type="paragraph" w:customStyle="1" w:styleId="Reproducibility">
+    <w:name w:val="Reproducibility"/>
+    <w:pPr>
+      <w:spacing w:before="0" w:after="160" w:line="300" w:lineRule="auto"/>
+      <w:jc w:val="left"/>
+    </w:pPr>
+    <w:rPr>
+      <w:rFonts w:ascii="Calibri" w:hAnsi="Calibri" w:eastAsia="Yu Gothic"/>
+      <w:b w:val="0"/>
+      <w:color w:val="222222"/>
+      <w:sz w:val="20"/>
     </w:rPr>
   </w:style>
   <w:style w:type="paragraph" w:customStyle="1" w:styleId="ScientificTableText">

</xml_diff>

<commit_message>
Expand reservoir dynamics research with spatial gating and componentwise
</commit_message>
<xml_diff>
--- a/docs/papers/robust-repertoire-memory-ja.docx
+++ b/docs/papers/robust-repertoire-memory-ja.docx
@@ -32,7 +32,7 @@
         <w:rPr>
           <w:rFonts w:ascii="Calibri" w:hAnsi="Calibri" w:eastAsia="Yu Gothic"/>
         </w:rPr>
-        <w:t>研究草稿 v0.5 2026年8月1日</w:t>
+        <w:t>研究草稿 v0.7 2026年8月2日</w:t>
       </w:r>
     </w:p>
     <w:p>
@@ -120,7 +120,23 @@
         <w:rPr>
           <w:rFonts w:ascii="Calibri" w:hAnsi="Calibri" w:eastAsia="Yu Gothic"/>
         </w:rPr>
-        <w:t>以上は、有限外乱下で利用可能な記憶状態を評価するにはアトラクタ数だけでなくmargin profileが必要である一方、既知構造で学習した低次元の線形較正を任意の力学系へ普遍化できないことを示す。またraw seed数をtask保存対称性で割り、component別profile、積則残差、移送certificateを保持する必要がある。本結果は4次元tanh RNN、一定外乱、符号保持task、hyperbox十分条件に限定される。</w:t>
+        <w:t>次に、非対称bridgeを持つ2+2・2+3 node系だけで方向別component-aware ridgeをfitし、係数を固定したまま未使用30 seedの3+5 node系へ外挿した。960点、983,040 challengeでcomponent-aware MAEは0.01232、global profileは0.03970、isolated task積だけのmodelは0.01699だった。seed単位bootstrapによるbaseline minus component MAEの95%区間下限は0.02474と0.004166で、certificate chainとtask下界に違反はなかった。一方、Spearmanはcomponent-aware 0.8116に対し二baselineが0.8542、0.9062であり、順位予測の支配は得られなかった。</w:t>
+      </w:r>
+    </w:p>
+    <w:p>
+      <w:r>
+        <w:rPr>
+          <w:rFonts w:ascii="Calibri" w:hAnsi="Calibri" w:eastAsia="Yu Gothic"/>
+        </w:rPr>
+        <w:t>さらに3+5 nodeの非対称core–reserve RNNへ有界拡散型の空間変調場を導入し、reserve-to-core bridgeだけを局所gateする介入を、同じFrobenius介入energyの一様global recurrent gainと比較した。未使用30 seed、270条件、2,851,200座標遷移で局所場は8必須core orthantを全条件保持した。global対照に対するcore保持差は0.3472 [0.2393, 0.4681]、reserve線形記憶容量差は0.07683 [0.06350, 0.09123]で、certificate違反は0だった。</w:t>
+      </w:r>
+    </w:p>
+    <w:p>
+      <w:r>
+        <w:rPr>
+          <w:rFonts w:ascii="Calibri" w:hAnsi="Calibri" w:eastAsia="Yu Gothic"/>
+        </w:rPr>
+        <w:t>以上は、有限外乱下で利用可能な記憶状態を評価するにはアトラクタ数だけでなくmargin profileが必要である一方、既知構造で学習した低次元の線形較正を任意の力学系へ普遍化できないことを示す。またraw seed数をtask保存対称性で割り、component別profile、方向別結合負荷、積則残差、移送certificateを保持し、局所介入へ接続する必要がある。本結果は低次元tanh RNN、符号保持と線形記憶、既知二module分割、hyperbox十分条件、単純なglobal対照に限定される。</w:t>
       </w:r>
     </w:p>
     <w:p>
@@ -163,7 +179,7 @@
         <w:rPr>
           <w:rFonts w:ascii="Calibri" w:hAnsi="Calibri" w:eastAsia="Yu Gothic"/>
         </w:rPr>
-        <w:t>本研究の問いは次の三点である。第一に、非対角tanh RNNの各符号orthantへ任意方向有界外乱に対する計算可能な安全marginを与えられるか。第二に、raw autonomous attractor countを一致させてもrobust repertoireを分離できるか。第三に、そのmargin profileが未知seedの外乱下記憶性能をraw count、coupling、局所Jacobianよりよく予測するか。</w:t>
+        <w:t>本研究の問いは次の五点である。第一に、非対角tanh RNNの各符号orthantへ任意方向有界外乱に対する計算可能な安全marginを与えられるか。第二に、raw autonomous attractor countを一致させてもrobust repertoireを分離できるか。第三に、そのmargin profileが未知seedの外乱下記憶性能をraw count、coupling、局所Jacobianよりよく予測するか。第四に、局所marginと方向別結合負荷を保持するcomponent表現が、小さい非対称系から異なるmodule sizeへ外挿できるか。第五に、marginを消費する結合へ局所的に介入すると、同一energyの一様介入より必須アトラクタとreserve記憶を両立できるか。</w:t>
       </w:r>
     </w:p>
     <w:p>
@@ -296,6 +312,36 @@
     </w:p>
     <w:p>
       <w:pPr>
+        <w:spacing w:before="0" w:after="80" w:line="290" w:lineRule="auto"/>
+        <w:numPr>
+          <w:ilvl w:val="0"/>
+          <w:numId w:val="10"/>
+        </w:numPr>
+      </w:pPr>
+      <w:r>
+        <w:rPr>
+          <w:rFonts w:ascii="Calibri" w:hAnsi="Calibri" w:eastAsia="Yu Gothic"/>
+        </w:rPr>
+        <w:t>方向別component margin・結合負荷・size imbalanceを用いる固定予測器を実装し、2+2・2+3系から3+5系へのMAE外挿優位と、その順位相関上の限界を事前登録確認した。</w:t>
+      </w:r>
+    </w:p>
+    <w:p>
+      <w:pPr>
+        <w:spacing w:before="0" w:after="80" w:line="290" w:lineRule="auto"/>
+        <w:numPr>
+          <w:ilvl w:val="0"/>
+          <w:numId w:val="10"/>
+        </w:numPr>
+      </w:pPr>
+      <w:r>
+        <w:rPr>
+          <w:rFonts w:ascii="Calibri" w:hAnsi="Calibri" w:eastAsia="Yu Gothic"/>
+        </w:rPr>
+        <w:t>有界拡散場、時変row gateのcore保護条件、energy-matched global対照を実装し、非対称3+5 core–reserve RNNで局所介入の因果的優位を事前登録確認した。</w:t>
+      </w:r>
+    </w:p>
+    <w:p>
+      <w:pPr>
         <w:pStyle w:val="Heading1"/>
       </w:pPr>
       <w:r>
@@ -368,10 +414,26 @@
     </w:p>
     <w:p>
       <w:pPr>
-        <w:pStyle w:val="Heading1"/>
+        <w:pStyle w:val="Heading2"/>
       </w:pPr>
       <w:r>
-        <w:t>3. 理論</w:t>
+        <w:t>2.4 神経系の時空間変調</w:t>
+      </w:r>
+    </w:p>
+    <w:p>
+      <w:r>
+        <w:rPr>
+          <w:rFonts w:ascii="Calibri" w:hAnsi="Calibri" w:eastAsia="Yu Gothic"/>
+        </w:rPr>
+        <w:t>神経回路の調整信号は空間的に一様とは限らない。局所的で短いGABA・glutamate入力が広く長いastrocyte Ca応答へ統合されること [18]、locus coeruleusが海馬astrocyteの秒単位の求心的統合を調整すること [19]、局所細胞外Caがsubsecondでstriatal cholinergic interneuronとdopamine放出を変えること [20] が報告されている。AstrocyteのNaおよびClも細胞・状態・細胞内位置により不均一である [21,22]。またACh–dopamineの時空間wave [23] と、dopamineがplasticityとexcitabilityを介してlatent behavioral attractorを形成・顕在化させる例 [24] がある。</w:t>
+      </w:r>
+    </w:p>
+    <w:p>
+      <w:r>
+        <w:rPr>
+          <w:rFonts w:ascii="Calibri" w:hAnsi="Calibri" w:eastAsia="Yu Gothic"/>
+        </w:rPr>
+        <w:t>これらは複数の時定数と局所性を持つ変調の存在を支持するが、本稿のcore–reserve分解、拡散場方程式、局所gateの最適性を直接示すものではない。本稿では生物機構を同定せず、空間選択的な制御が必須アトラクタのmarginとreserve能力を両立し得るかを人工系で検証する。</w:t>
       </w:r>
     </w:p>
     <w:p>
@@ -379,6 +441,38 @@
         <w:pStyle w:val="Heading2"/>
       </w:pPr>
       <w:r>
+        <w:t>2.5 Component合成とdynamical motif</w:t>
+      </w:r>
+    </w:p>
+    <w:p>
+      <w:r>
+        <w:rPr>
+          <w:rFonts w:ascii="Calibri" w:hAnsi="Calibri" w:eastAsia="Yu Gothic"/>
+        </w:rPr>
+        <w:t>相互結合した非線形subsystemについて、ISS Lyapunov関数と方向別gain operatorから全体系の安定性を構成するsmall-gain理論がある [25]。近年は、小規模subsystemで得たneural certificateを類似構造の大規模networkへ合成する枠組みも提案されている [26]。Attractor networkではmodularityがbasin体積と収束時間を改善し得る一方、最適値は中間的であり、module化を単調な利得とはみなせない [27]。</w:t>
+      </w:r>
+    </w:p>
+    <w:p>
+      <w:r>
+        <w:rPr>
+          <w:rFonts w:ascii="Calibri" w:hAnsi="Calibri" w:eastAsia="Yu Gothic"/>
+        </w:rPr>
+        <w:t>Multi-task RNNでattractor、decision boundary、rotation等のdynamical motifがtask間で再利用されるという結果 [13] は、global scoreをcomponent atlasへ分解する計算論的動機になる。ただし、これらの研究は本稿の符号記憶taskの積則、方向別hyperbox chain、2+2・2+3から3+5への予測外挿を証明しない。本稿はこの限定されたfamilyで、保証合成と経験較正を別々に検証する。</w:t>
+      </w:r>
+    </w:p>
+    <w:p>
+      <w:pPr>
+        <w:pStyle w:val="Heading1"/>
+      </w:pPr>
+      <w:r>
+        <w:t>3. 理論</w:t>
+      </w:r>
+    </w:p>
+    <w:p>
+      <w:pPr>
+        <w:pStyle w:val="Heading2"/>
+      </w:pPr>
+      <w:r>
         <w:t>3.1 対象系</w:t>
       </w:r>
     </w:p>
@@ -1096,10 +1190,222 @@
     </w:p>
     <w:p>
       <w:pPr>
-        <w:pStyle w:val="Heading1"/>
+        <w:pStyle w:val="Heading2"/>
       </w:pPr>
       <w:r>
-        <w:t>4. 方法</w:t>
+        <w:t>3.7 方向別component結合と合成certificate</w:t>
+      </w:r>
+    </w:p>
+    <w:p>
+      <w:r>
+        <w:rPr>
+          <w:rFonts w:ascii="Calibri" w:hAnsi="Calibri" w:eastAsia="Yu Gothic"/>
+        </w:rPr>
+        <w:t>非対称な二module系を</w:t>
+      </w:r>
+    </w:p>
+    <w:p>
+      <w:pPr>
+        <w:pStyle w:val="DisplayEquation"/>
+      </w:pPr>
+      <w:r>
+        <w:rPr>
+          <w:rFonts w:ascii="Cambria Math" w:hAnsi="Cambria Math"/>
+          <w:sz w:val="21"/>
+        </w:rPr>
+        <w:t>x⁺=tanh(Ax+By+ηₓ), y⁺=tanh(Cx+Dy+η_y)</w:t>
+      </w:r>
+    </w:p>
+    <w:p>
+      <w:r>
+        <w:rPr>
+          <w:rFonts w:ascii="Calibri" w:hAnsi="Calibri" w:eastAsia="Yu Gothic"/>
+        </w:rPr>
+        <w:t xml:space="preserve">とする。隔離moduleのrectangle marginを </w:t>
+      </w:r>
+      <w:r>
+        <w:rPr>
+          <w:rFonts w:ascii="Cambria Math" w:hAnsi="Cambria Math" w:eastAsia="Yu Gothic"/>
+        </w:rPr>
+        <w:t>Mₓ,M_y</w:t>
+      </w:r>
+      <w:r>
+        <w:rPr>
+          <w:rFonts w:ascii="Calibri" w:hAnsi="Calibri" w:eastAsia="Yu Gothic"/>
+        </w:rPr>
+        <w:t>、受信方向別のcross loadを</w:t>
+      </w:r>
+    </w:p>
+    <w:p>
+      <w:pPr>
+        <w:pStyle w:val="DisplayEquation"/>
+      </w:pPr>
+      <w:r>
+        <w:rPr>
+          <w:rFonts w:ascii="Cambria Math" w:hAnsi="Cambria Math"/>
+          <w:sz w:val="21"/>
+        </w:rPr>
+        <w:t>Lₓ=‖B‖∞, L_y=‖C‖∞</w:t>
+      </w:r>
+    </w:p>
+    <w:p>
+      <w:r>
+        <w:rPr>
+          <w:rFonts w:ascii="Calibri" w:hAnsi="Calibri" w:eastAsia="Yu Gothic"/>
+        </w:rPr>
+        <w:t xml:space="preserve">とすれば、tanhの単調性とcross項の三角不等式から結合後marginはそれぞれ </w:t>
+      </w:r>
+      <w:r>
+        <w:rPr>
+          <w:rFonts w:ascii="Cambria Math" w:hAnsi="Cambria Math" w:eastAsia="Yu Gothic"/>
+        </w:rPr>
+        <w:t>Mₓ-Lₓ</w:t>
+      </w:r>
+      <w:r>
+        <w:rPr>
+          <w:rFonts w:ascii="Calibri" w:hAnsi="Calibri" w:eastAsia="Yu Gothic"/>
+        </w:rPr>
+        <w:t>、</w:t>
+      </w:r>
+      <w:r>
+        <w:rPr>
+          <w:rFonts w:ascii="Cambria Math" w:hAnsi="Cambria Math" w:eastAsia="Yu Gothic"/>
+        </w:rPr>
+        <w:t>M_y-L_y</w:t>
+      </w:r>
+      <w:r>
+        <w:rPr>
+          <w:rFonts w:ascii="Calibri" w:hAnsi="Calibri" w:eastAsia="Yu Gothic"/>
+        </w:rPr>
+        <w:t xml:space="preserve"> 以上である。従って外乱budget </w:t>
+      </w:r>
+      <w:r>
+        <w:rPr>
+          <w:rFonts w:ascii="Cambria Math" w:hAnsi="Cambria Math" w:eastAsia="Yu Gothic"/>
+        </w:rPr>
+        <w:t>e</w:t>
+      </w:r>
+      <w:r>
+        <w:rPr>
+          <w:rFonts w:ascii="Calibri" w:hAnsi="Calibri" w:eastAsia="Yu Gothic"/>
+        </w:rPr>
+        <w:t xml:space="preserve"> に対して</w:t>
+      </w:r>
+    </w:p>
+    <w:p>
+      <w:pPr>
+        <w:pStyle w:val="DisplayEquation"/>
+      </w:pPr>
+      <w:r>
+        <w:rPr>
+          <w:rFonts w:ascii="Cambria Math" w:hAnsi="Cambria Math"/>
+          <w:sz w:val="21"/>
+        </w:rPr>
+        <w:t>Mₓ≥ e+Lₓ, M_y≥ e+L_y</w:t>
+      </w:r>
+    </w:p>
+    <w:p>
+      <w:r>
+        <w:rPr>
+          <w:rFonts w:ascii="Calibri" w:hAnsi="Calibri" w:eastAsia="Yu Gothic"/>
+        </w:rPr>
+        <w:t xml:space="preserve">は方向別十分条件となる。実cross-edgeの符号と各座標境界を用いるtransported rectangle、方向別norm、全cross負荷を一つのglobal normへ潰す条件の認証率を それぞれ </w:t>
+      </w:r>
+      <w:r>
+        <w:rPr>
+          <w:rFonts w:ascii="Cambria Math" w:hAnsi="Cambria Math" w:eastAsia="Yu Gothic"/>
+        </w:rPr>
+        <w:t>R_rect,R_dir,R_global</w:t>
+      </w:r>
+      <w:r>
+        <w:rPr>
+          <w:rFonts w:ascii="Calibri" w:hAnsi="Calibri" w:eastAsia="Yu Gothic"/>
+        </w:rPr>
+        <w:t xml:space="preserve"> とすると、本稿の hyperbox構成では</w:t>
+      </w:r>
+    </w:p>
+    <w:p>
+      <w:pPr>
+        <w:pStyle w:val="DisplayEquation"/>
+      </w:pPr>
+      <w:r>
+        <w:rPr>
+          <w:rFonts w:ascii="Cambria Math" w:hAnsi="Cambria Math"/>
+          <w:sz w:val="21"/>
+        </w:rPr>
+        <w:t>T_coupled≥ R_rect ≥ R_dir≥ R_global</w:t>
+      </w:r>
+    </w:p>
+    <w:p>
+      <w:r>
+        <w:rPr>
+          <w:rFonts w:ascii="Calibri" w:hAnsi="Calibri" w:eastAsia="Yu Gothic"/>
+        </w:rPr>
+        <w:t>を得る。最初の不等式は経験taskに対する保証照合、残りは情報を捨てる順序に 対応する。このchainは一般の非矩形安全集合に対する必要条件ではない。</w:t>
+      </w:r>
+    </w:p>
+    <w:p>
+      <w:r>
+        <w:rPr>
+          <w:rFonts w:ascii="Calibri" w:hAnsi="Calibri" w:eastAsia="Yu Gothic"/>
+        </w:rPr>
+        <w:t xml:space="preserve">高次元で全 </w:t>
+      </w:r>
+      <w:r>
+        <w:rPr>
+          <w:rFonts w:ascii="Cambria Math" w:hAnsi="Cambria Math" w:eastAsia="Yu Gothic"/>
+        </w:rPr>
+        <w:t>2ᵈ</w:t>
+      </w:r>
+      <w:r>
+        <w:rPr>
+          <w:rFonts w:ascii="Calibri" w:hAnsi="Calibri" w:eastAsia="Yu Gothic"/>
+        </w:rPr>
+        <w:t xml:space="preserve"> cornerを列挙する代わりに、moduleの符号に相対的な4個の 共有方向code </w:t>
+      </w:r>
+      <w:r>
+        <w:rPr>
+          <w:rFonts w:ascii="Cambria Math" w:hAnsi="Cambria Math" w:eastAsia="Yu Gothic"/>
+        </w:rPr>
+        <w:t>k</w:t>
+      </w:r>
+      <w:r>
+        <w:rPr>
+          <w:rFonts w:ascii="Calibri" w:hAnsi="Calibri" w:eastAsia="Yu Gothic"/>
+        </w:rPr>
+        <w:t xml:space="preserve"> を用いた。零結合時にはcode別成功率 </w:t>
+      </w:r>
+      <w:r>
+        <w:rPr>
+          <w:rFonts w:ascii="Cambria Math" w:hAnsi="Cambria Math" w:eastAsia="Yu Gothic"/>
+        </w:rPr>
+        <w:t>Tₓ,k,T_y,k</w:t>
+      </w:r>
+      <w:r>
+        <w:rPr>
+          <w:rFonts w:ascii="Calibri" w:hAnsi="Calibri" w:eastAsia="Yu Gothic"/>
+        </w:rPr>
+        <w:t xml:space="preserve"> から</w:t>
+      </w:r>
+    </w:p>
+    <w:p>
+      <w:pPr>
+        <w:pStyle w:val="DisplayEquation"/>
+      </w:pPr>
+      <w:r>
+        <w:rPr>
+          <w:rFonts w:ascii="Cambria Math" w:hAnsi="Cambria Math"/>
+          <w:sz w:val="21"/>
+        </w:rPr>
+        <w:t>T₀=(1)/(K)Σₖ₌₁^KTₓ,kT_y,k, K=4</w:t>
+      </w:r>
+    </w:p>
+    <w:p>
+      <w:r>
+        <w:rPr>
+          <w:rFonts w:ascii="Calibri" w:hAnsi="Calibri" w:eastAsia="Yu Gothic"/>
+        </w:rPr>
+        <w:t>が厳密に成り立つ。これは全方向一様分布の完全列挙ではなく、規模外挿を可能に する固定challenge設計である。</w:t>
       </w:r>
     </w:p>
     <w:p>
@@ -1107,7 +1413,7 @@
         <w:pStyle w:val="Heading2"/>
       </w:pPr>
       <w:r>
-        <w:t>4.1 段階的検証</w:t>
+        <w:t>3.8 有界空間変調場と局所gate</w:t>
       </w:r>
     </w:p>
     <w:p>
@@ -1115,15 +1421,43 @@
         <w:rPr>
           <w:rFonts w:ascii="Calibri" w:hAnsi="Calibri" w:eastAsia="Yu Gothic"/>
         </w:rPr>
-        <w:t>研究は探索と確認を分離した。EXP-2026-007ではcoupling 0.04と0.08を比較したが、raw countも平均2.1333低下し、count-matched判定は不成立だった。この陰性結果を保持し、事後探索でraw countを保つ0.07を選んだ。</w:t>
+        <w:t xml:space="preserve">nodeごとの変調状態を </w:t>
+      </w:r>
+      <w:r>
+        <w:rPr>
+          <w:rFonts w:ascii="Cambria Math" w:hAnsi="Cambria Math" w:eastAsia="Yu Gothic"/>
+        </w:rPr>
+        <w:t>zₜ∈[0,1]ⁿ</w:t>
+      </w:r>
+      <w:r>
+        <w:rPr>
+          <w:rFonts w:ascii="Calibri" w:hAnsi="Calibri" w:eastAsia="Yu Gothic"/>
+        </w:rPr>
+        <w:t xml:space="preserve">、sourceを </w:t>
+      </w:r>
+      <w:r>
+        <w:rPr>
+          <w:rFonts w:ascii="Cambria Math" w:hAnsi="Cambria Math" w:eastAsia="Yu Gothic"/>
+        </w:rPr>
+        <w:t>sₜ∈[0,1]ⁿ</w:t>
+      </w:r>
+      <w:r>
+        <w:rPr>
+          <w:rFonts w:ascii="Calibri" w:hAnsi="Calibri" w:eastAsia="Yu Gothic"/>
+        </w:rPr>
+        <w:t xml:space="preserve"> とし、</w:t>
       </w:r>
     </w:p>
     <w:p>
-      <w:r>
-        <w:rPr>
-          <w:rFonts w:ascii="Calibri" w:hAnsi="Calibri" w:eastAsia="Yu Gothic"/>
-        </w:rPr>
-        <w:t>EXP-2026-008では未使用seed 501–530を用い、coupling 0.04と0.07の両群で全seedのraw countを16に一致させた。EXP-2026-009ではdiscovery seed 401–430で外乱強度とfeatureを選び、未使用seed 601–630で符号記憶予測を確認した。EXP-2026-010ではpilot seed 801–808でfamily別条件を選び、discovery seed 801–830でpredictorをfitし、未使用seed 901–930で4 familyを確認した。</w:t>
+      <w:pPr>
+        <w:pStyle w:val="DisplayEquation"/>
+      </w:pPr>
+      <w:r>
+        <w:rPr>
+          <w:rFonts w:ascii="Cambria Math" w:hAnsi="Cambria Math"/>
+          <w:sz w:val="21"/>
+        </w:rPr>
+        <w:t>zₜ₊₁=(1-alpha-beta)zₜ+alpha Pzₜ+beta sₜ</w:t>
       </w:r>
     </w:p>
     <w:p>
@@ -1131,7 +1465,91 @@
         <w:rPr>
           <w:rFonts w:ascii="Calibri" w:hAnsi="Calibri" w:eastAsia="Yu Gothic"/>
         </w:rPr>
-        <w:t>EXP-2026-011のpilotは観測済みseed 801–830をfit、901–930をtestに用い、6 candidateからpooled leave-one-family-out MAE最小のrobust pairを選択した。その後、penalty、feature、baseline、閾値を固定し、他3 familyの既観測60 seedでfitしたmodelをheld-out familyの未使用seed 1201–1230へ適用した。</w:t>
+        <w:t>とする。</w:t>
+      </w:r>
+      <w:r>
+        <w:rPr>
+          <w:rFonts w:ascii="Cambria Math" w:hAnsi="Cambria Math" w:eastAsia="Yu Gothic"/>
+        </w:rPr>
+        <w:t>P</w:t>
+      </w:r>
+      <w:r>
+        <w:rPr>
+          <w:rFonts w:ascii="Calibri" w:hAnsi="Calibri" w:eastAsia="Yu Gothic"/>
+        </w:rPr>
+        <w:t xml:space="preserve"> が非負row-stochastic、</w:t>
+      </w:r>
+      <w:r>
+        <w:rPr>
+          <w:rFonts w:ascii="Cambria Math" w:hAnsi="Cambria Math" w:eastAsia="Yu Gothic"/>
+        </w:rPr>
+        <w:t>alpha,beta≥0</w:t>
+      </w:r>
+      <w:r>
+        <w:rPr>
+          <w:rFonts w:ascii="Calibri" w:hAnsi="Calibri" w:eastAsia="Yu Gothic"/>
+        </w:rPr>
+        <w:t xml:space="preserve">、 </w:t>
+      </w:r>
+      <w:r>
+        <w:rPr>
+          <w:rFonts w:ascii="Cambria Math" w:hAnsi="Cambria Math" w:eastAsia="Yu Gothic"/>
+        </w:rPr>
+        <w:t>alpha+beta≤1</w:t>
+      </w:r>
+      <w:r>
+        <w:rPr>
+          <w:rFonts w:ascii="Calibri" w:hAnsi="Calibri" w:eastAsia="Yu Gothic"/>
+        </w:rPr>
+        <w:t xml:space="preserve"> なら右辺はhypercube内の点の凸結合であり、 </w:t>
+      </w:r>
+      <w:r>
+        <w:rPr>
+          <w:rFonts w:ascii="Cambria Math" w:hAnsi="Cambria Math" w:eastAsia="Yu Gothic"/>
+        </w:rPr>
+        <w:t>zₜ∈[0,1]ⁿ</w:t>
+      </w:r>
+      <w:r>
+        <w:rPr>
+          <w:rFonts w:ascii="Calibri" w:hAnsi="Calibri" w:eastAsia="Yu Gothic"/>
+        </w:rPr>
+        <w:t xml:space="preserve"> は正不変である。局所gateを </w:t>
+      </w:r>
+      <w:r>
+        <w:rPr>
+          <w:rFonts w:ascii="Cambria Math" w:hAnsi="Cambria Math" w:eastAsia="Yu Gothic"/>
+        </w:rPr>
+        <w:t>gₜ=1-zₜ</w:t>
+      </w:r>
+      <w:r>
+        <w:rPr>
+          <w:rFonts w:ascii="Calibri" w:hAnsi="Calibri" w:eastAsia="Yu Gothic"/>
+        </w:rPr>
+        <w:t xml:space="preserve"> とし、 reserve-to-core行列 </w:t>
+      </w:r>
+      <w:r>
+        <w:rPr>
+          <w:rFonts w:ascii="Cambria Math" w:hAnsi="Cambria Math" w:eastAsia="Yu Gothic"/>
+        </w:rPr>
+        <w:t>G</w:t>
+      </w:r>
+      <w:r>
+        <w:rPr>
+          <w:rFonts w:ascii="Calibri" w:hAnsi="Calibri" w:eastAsia="Yu Gothic"/>
+        </w:rPr>
+        <w:t xml:space="preserve"> の受信行だけを </w:t>
+      </w:r>
+      <w:r>
+        <w:rPr>
+          <w:rFonts w:ascii="Cambria Math" w:hAnsi="Cambria Math" w:eastAsia="Yu Gothic"/>
+        </w:rPr>
+        <w:t>D(gₜ)G</w:t>
+      </w:r>
+      <w:r>
+        <w:rPr>
+          <w:rFonts w:ascii="Calibri" w:hAnsi="Calibri" w:eastAsia="Yu Gothic"/>
+        </w:rPr>
+        <w:t xml:space="preserve"> に置き換える。</w:t>
       </w:r>
     </w:p>
     <w:p>
@@ -1139,6 +1557,134 @@
         <w:rPr>
           <w:rFonts w:ascii="Calibri" w:hAnsi="Calibri" w:eastAsia="Yu Gothic"/>
         </w:rPr>
+        <w:t xml:space="preserve">各core座標の双安定安全marginを </w:t>
+      </w:r>
+      <w:r>
+        <w:rPr>
+          <w:rFonts w:ascii="Cambria Math" w:hAnsi="Cambria Math" w:eastAsia="Yu Gothic"/>
+        </w:rPr>
+        <w:t>μᵢ</w:t>
+      </w:r>
+      <w:r>
+        <w:rPr>
+          <w:rFonts w:ascii="Calibri" w:hAnsi="Calibri" w:eastAsia="Yu Gothic"/>
+        </w:rPr>
+        <w:t xml:space="preserve">、unmodeled load上界を </w:t>
+      </w:r>
+      <w:r>
+        <w:rPr>
+          <w:rFonts w:ascii="Cambria Math" w:hAnsi="Cambria Math" w:eastAsia="Yu Gothic"/>
+        </w:rPr>
+        <w:t>eᵢ</w:t>
+      </w:r>
+      <w:r>
+        <w:rPr>
+          <w:rFonts w:ascii="Calibri" w:hAnsi="Calibri" w:eastAsia="Yu Gothic"/>
+        </w:rPr>
+        <w:t xml:space="preserve"> と すれば、</w:t>
+      </w:r>
+    </w:p>
+    <w:p>
+      <w:pPr>
+        <w:pStyle w:val="DisplayEquation"/>
+      </w:pPr>
+      <w:r>
+        <w:rPr>
+          <w:rFonts w:ascii="Cambria Math" w:hAnsi="Cambria Math"/>
+          <w:sz w:val="21"/>
+        </w:rPr>
+        <w:t>supₜ( |[D(gₜ)G rₜ]ᵢ|+eᵢ )≤μᵢ</w:t>
+      </w:r>
+    </w:p>
+    <w:p>
+      <w:r>
+        <w:rPr>
+          <w:rFonts w:ascii="Calibri" w:hAnsi="Calibri" w:eastAsia="Yu Gothic"/>
+        </w:rPr>
+        <w:t xml:space="preserve">は、その座標の符号安全集合を保つ十分条件である。比較するglobal制御は </w:t>
+      </w:r>
+      <w:r>
+        <w:rPr>
+          <w:rFonts w:ascii="Cambria Math" w:hAnsi="Cambria Math" w:eastAsia="Yu Gothic"/>
+        </w:rPr>
+        <w:t>qW</w:t>
+      </w:r>
+      <w:r>
+        <w:rPr>
+          <w:rFonts w:ascii="Calibri" w:hAnsi="Calibri" w:eastAsia="Yu Gothic"/>
+        </w:rPr>
+        <w:t xml:space="preserve"> とし、局所介入との差のFrobenius二乗energy </w:t>
+      </w:r>
+      <w:r>
+        <w:rPr>
+          <w:rFonts w:ascii="Cambria Math" w:hAnsi="Cambria Math" w:eastAsia="Yu Gothic"/>
+        </w:rPr>
+        <w:t>‖W-D(gₜ)W‖_F²</w:t>
+      </w:r>
+      <w:r>
+        <w:rPr>
+          <w:rFonts w:ascii="Calibri" w:hAnsi="Calibri" w:eastAsia="Yu Gothic"/>
+        </w:rPr>
+        <w:t xml:space="preserve"> と </w:t>
+      </w:r>
+      <w:r>
+        <w:rPr>
+          <w:rFonts w:ascii="Cambria Math" w:hAnsi="Cambria Math" w:eastAsia="Yu Gothic"/>
+        </w:rPr>
+        <w:t>‖W-qW‖_F²</w:t>
+      </w:r>
+      <w:r>
+        <w:rPr>
+          <w:rFonts w:ascii="Calibri" w:hAnsi="Calibri" w:eastAsia="Yu Gothic"/>
+        </w:rPr>
+        <w:t xml:space="preserve"> を一致させる。これにより局所性の効果を、単なる介入量の差から 分離する。ただしこのglobal対照は一様scalarであり、最適制御ではない。</w:t>
+      </w:r>
+    </w:p>
+    <w:p>
+      <w:pPr>
+        <w:pStyle w:val="Heading1"/>
+      </w:pPr>
+      <w:r>
+        <w:t>4. 方法</w:t>
+      </w:r>
+    </w:p>
+    <w:p>
+      <w:pPr>
+        <w:pStyle w:val="Heading2"/>
+      </w:pPr>
+      <w:r>
+        <w:t>4.1 段階的検証</w:t>
+      </w:r>
+    </w:p>
+    <w:p>
+      <w:r>
+        <w:rPr>
+          <w:rFonts w:ascii="Calibri" w:hAnsi="Calibri" w:eastAsia="Yu Gothic"/>
+        </w:rPr>
+        <w:t>研究は探索と確認を分離した。EXP-2026-007ではcoupling 0.04と0.08を比較したが、raw countも平均2.1333低下し、count-matched判定は不成立だった。この陰性結果を保持し、事後探索でraw countを保つ0.07を選んだ。</w:t>
+      </w:r>
+    </w:p>
+    <w:p>
+      <w:r>
+        <w:rPr>
+          <w:rFonts w:ascii="Calibri" w:hAnsi="Calibri" w:eastAsia="Yu Gothic"/>
+        </w:rPr>
+        <w:t>EXP-2026-008では未使用seed 501–530を用い、coupling 0.04と0.07の両群で全seedのraw countを16に一致させた。EXP-2026-009ではdiscovery seed 401–430で外乱強度とfeatureを選び、未使用seed 601–630で符号記憶予測を確認した。EXP-2026-010ではpilot seed 801–808でfamily別条件を選び、discovery seed 801–830でpredictorをfitし、未使用seed 901–930で4 familyを確認した。</w:t>
+      </w:r>
+    </w:p>
+    <w:p>
+      <w:r>
+        <w:rPr>
+          <w:rFonts w:ascii="Calibri" w:hAnsi="Calibri" w:eastAsia="Yu Gothic"/>
+        </w:rPr>
+        <w:t>EXP-2026-011のpilotは観測済みseed 801–830をfit、901–930をtestに用い、6 candidateからpooled leave-one-family-out MAE最小のrobust pairを選択した。その後、penalty、feature、baseline、閾値を固定し、他3 familyの既観測60 seedでfitしたmodelをheld-out familyの未使用seed 1201–1230へ適用した。</w:t>
+      </w:r>
+    </w:p>
+    <w:p>
+      <w:r>
+        <w:rPr>
+          <w:rFonts w:ascii="Calibri" w:hAnsi="Calibri" w:eastAsia="Yu Gothic"/>
+        </w:rPr>
         <w:t xml:space="preserve">EXP-2026-012では、EXP-2026-011で固定したfeature、penalty、baseline、閾値を変更せず、既知4 familyの既観測seed 801–830と901–930、計960条件でfitした。候補選択にもparameter調整にも使用していない </w:t>
       </w:r>
       <w:r>
@@ -1194,6 +1740,22 @@
           <w:rFonts w:ascii="Calibri" w:hAnsi="Calibri" w:eastAsia="Yu Gothic"/>
         </w:rPr>
         <w:t>EXP-2026-014ではseed 1501–1510のpilotでcross strength 0–0.04のgridを評価し、結果観測後、未使用confirmation seedには触れずに平均絶対残差0.05、非零残差率0.5、集約曲線単調非減少の3経験判定を固定した。seed 1601–1630の構造gateで各internal gain・strengthの30 networkが30符号共役classになることを確認してから、同じgridのconfirmationを一度だけ評価した。</w:t>
+      </w:r>
+    </w:p>
+    <w:p>
+      <w:r>
+        <w:rPr>
+          <w:rFonts w:ascii="Calibri" w:hAnsi="Calibri" w:eastAsia="Yu Gothic"/>
+        </w:rPr>
+        <w:t>EXP-2026-015では開発専用seedでfeedback gainとnoise gridを較正した後、pilot seed 1801–1810を一度評価し、確認効果量閾値を固定した。確認taskの前にseed 1901–1930、3 feedback gainの各群が30絶対値構造classを持ち、3+5 module size、非対称性、双方向bridgeを満たすことを監査した。その後、未使用30 seed、3 feedback gain、3 noiseの270条件を一度だけ評価した。</w:t>
+      </w:r>
+    </w:p>
+    <w:p>
+      <w:r>
+        <w:rPr>
+          <w:rFonts w:ascii="Calibri" w:hAnsi="Calibri" w:eastAsia="Yu Gothic"/>
+        </w:rPr>
+        <w:t>EXP-2026-016では、pilot seed 2001–2010の2+2・2+3 moduleを用いて3予測器をfitし、係数・標準化統計・ridge penaltyをartifactへ固定した。pilot結果観測後、confirmation MAE 0.03以下、Spearman 0.75以上、global minus componentおよびproduct-only minus component MAEのbootstrap区間下限0.01、0.002以上を固定した。確認task前にseed 2101–2130の3+5 moduleについて、各internal gain・cross strength群が30絶対値構造class、非対称、双方向かつ正cross normであることを監査した。その後は再fitせず、未使用30 seedの960点を一度だけ評価した。</w:t>
       </w:r>
     </w:p>
     <w:p>
@@ -1894,11 +2456,11 @@
       </w:r>
     </w:p>
     <w:p>
-      <w:pPr>
-        <w:pStyle w:val="Heading2"/>
-      </w:pPr>
-      <w:r>
-        <w:t>4.3 固定点探索と符号記憶task</w:t>
+      <w:r>
+        <w:rPr>
+          <w:rFonts w:ascii="Calibri" w:hAnsi="Calibri" w:eastAsia="Yu Gothic"/>
+        </w:rPr>
+        <w:t>EXP-2026-015は別familyとして、自己結合1.5の3-node双安定coreと5-node収縮reserveを非対称かつ双方向bridgeで接続した。局所政策はreserve-to-core受信行だけを空間場でgateし、ungated政策は同じnetworkを無制御で用いた。Global政策は各時刻に局所政策と同じFrobenius介入energyを持つ一様recurrent gainを用いた。</w:t>
       </w:r>
     </w:p>
     <w:p>
@@ -1906,63 +2468,32 @@
         <w:rPr>
           <w:rFonts w:ascii="Calibri" w:hAnsi="Calibri" w:eastAsia="Yu Gothic"/>
         </w:rPr>
-        <w:t xml:space="preserve">全16 orthantについて初期状態 </w:t>
+        <w:t xml:space="preserve">EXP-2026-016の </w:t>
+      </w:r>
+      <w:r>
+        <w:rPr>
+          <w:rFonts w:ascii="Consolas" w:hAnsi="Consolas" w:eastAsia="Yu Gothic"/>
+          <w:sz w:val="19"/>
+        </w:rPr>
+        <w:t>asymmetric_modular</w:t>
+      </w:r>
+      <w:r>
+        <w:rPr>
+          <w:rFonts w:ascii="Calibri" w:hAnsi="Calibri" w:eastAsia="Yu Gothic"/>
+        </w:rPr>
+        <w:t xml:space="preserve"> familyは、各module内部に符号付き非対称edgeを持ち、二方向bridge </w:t>
       </w:r>
       <w:r>
         <w:rPr>
           <w:rFonts w:ascii="Cambria Math" w:hAnsi="Cambria Math" w:eastAsia="Yu Gothic"/>
         </w:rPr>
-        <w:t>0.9s</w:t>
+        <w:t>B,C</w:t>
       </w:r>
       <w:r>
         <w:rPr>
           <w:rFonts w:ascii="Calibri" w:hAnsi="Calibri" w:eastAsia="Yu Gothic"/>
         </w:rPr>
-        <w:t xml:space="preserve"> から自律系を500 step発展させ、最終残差 </w:t>
-      </w:r>
-      <w:r>
-        <w:rPr>
-          <w:rFonts w:ascii="Cambria Math" w:hAnsi="Cambria Math" w:eastAsia="Yu Gothic"/>
-        </w:rPr>
-        <w:t>10⁻⁹</w:t>
-      </w:r>
-      <w:r>
-        <w:rPr>
-          <w:rFonts w:ascii="Calibri" w:hAnsi="Calibri" w:eastAsia="Yu Gothic"/>
-        </w:rPr>
-        <w:t xml:space="preserve"> 以下かつ全時刻で符号を保つ場合に固定点を発見したとした。各固定点を4-bit符号記憶とみなした。</w:t>
-      </w:r>
-    </w:p>
-    <w:p>
-      <w:r>
-        <w:rPr>
-          <w:rFonts w:ascii="Calibri" w:hAnsi="Calibri" w:eastAsia="Yu Gothic"/>
-        </w:rPr>
-        <w:t xml:space="preserve">外乱方向 </w:t>
-      </w:r>
-      <w:r>
-        <w:rPr>
-          <w:rFonts w:ascii="Cambria Math" w:hAnsi="Cambria Math" w:eastAsia="Yu Gothic"/>
-        </w:rPr>
-        <w:t>d∈-1,1⁴</w:t>
-      </w:r>
-      <w:r>
-        <w:rPr>
-          <w:rFonts w:ascii="Calibri" w:hAnsi="Calibri" w:eastAsia="Yu Gothic"/>
-        </w:rPr>
-        <w:t xml:space="preserve"> の全16 cornerを列挙し、</w:t>
-      </w:r>
-      <w:r>
-        <w:rPr>
-          <w:rFonts w:ascii="Cambria Math" w:hAnsi="Cambria Math" w:eastAsia="Yu Gothic"/>
-        </w:rPr>
-        <w:t>η=ed</w:t>
-      </w:r>
-      <w:r>
-        <w:rPr>
-          <w:rFonts w:ascii="Calibri" w:hAnsi="Calibri" w:eastAsia="Yu Gothic"/>
-        </w:rPr>
-        <w:t xml:space="preserve"> を100 step一定に印加した。全時刻で元のorthant符号を保てば成功とした。一network・一外乱強度あたり256 challengeであり、EXP-2026-010とEXP-2026-011の各confirmation総数は122,880、EXP-2026-012は30,720、EXP-2026-014は368,640だった。</w:t>
+        <w:t xml:space="preserve"> を独立に生成した。Pilotは2+2と2+3、confirmationは3+5 nodeであり、internal gain 0.025、0.05、cross strength 0、0.01、0.02、0.04、外乱budget 0.08、0.12、0.16、0.20を用いた。Module分割は既知として評価器へ渡した。</w:t>
       </w:r>
     </w:p>
     <w:p>
@@ -1970,7 +2501,7 @@
         <w:pStyle w:val="Heading2"/>
       </w:pPr>
       <w:r>
-        <w:t>4.4 Predictorとbaseline</w:t>
+        <w:t>4.3 固定点探索と符号記憶task</w:t>
       </w:r>
     </w:p>
     <w:p>
@@ -1978,19 +2509,31 @@
         <w:rPr>
           <w:rFonts w:ascii="Calibri" w:hAnsi="Calibri" w:eastAsia="Yu Gothic"/>
         </w:rPr>
-        <w:t xml:space="preserve">EXP-2026-010ではfamilyごとにdiscovery 120条件で切片付き単回帰をfitし、confirmation 120条件へ係数を固定して適用した。主要featureは平均margin </w:t>
+        <w:t xml:space="preserve">全16 orthantについて初期状態 </w:t>
       </w:r>
       <w:r>
         <w:rPr>
           <w:rFonts w:ascii="Cambria Math" w:hAnsi="Cambria Math" w:eastAsia="Yu Gothic"/>
         </w:rPr>
-        <w:t>μ̄</w:t>
+        <w:t>0.9s</w:t>
       </w:r>
       <w:r>
         <w:rPr>
           <w:rFonts w:ascii="Calibri" w:hAnsi="Calibri" w:eastAsia="Yu Gothic"/>
         </w:rPr>
-        <w:t xml:space="preserve"> である。Baselineはraw attractor count、coupling gain、off-diagonal infinity norm、全固定点にわたるworst local Jacobian infinity norm、minimum signed fixed-point coordinate、nonnormality commutator normとした。</w:t>
+        <w:t xml:space="preserve"> から自律系を500 step発展させ、最終残差 </w:t>
+      </w:r>
+      <w:r>
+        <w:rPr>
+          <w:rFonts w:ascii="Cambria Math" w:hAnsi="Cambria Math" w:eastAsia="Yu Gothic"/>
+        </w:rPr>
+        <w:t>10⁻⁹</w:t>
+      </w:r>
+      <w:r>
+        <w:rPr>
+          <w:rFonts w:ascii="Calibri" w:hAnsi="Calibri" w:eastAsia="Yu Gothic"/>
+        </w:rPr>
+        <w:t xml:space="preserve"> 以下かつ全時刻で符号を保つ場合に固定点を発見したとした。各固定点を4-bit符号記憶とみなした。</w:t>
       </w:r>
     </w:p>
     <w:p>
@@ -1998,43 +2541,31 @@
         <w:rPr>
           <w:rFonts w:ascii="Calibri" w:hAnsi="Calibri" w:eastAsia="Yu Gothic"/>
         </w:rPr>
-        <w:t xml:space="preserve">EXP-2026-011ではfamily名をfeatureへ入れず、held-out familyのtask保持率をfitから 完全に除外した。各featureを学習fold内で標準化し、切片を罰しないridge回帰 （penalty </w:t>
+        <w:t xml:space="preserve">外乱方向 </w:t>
       </w:r>
       <w:r>
         <w:rPr>
           <w:rFonts w:ascii="Cambria Math" w:hAnsi="Cambria Math" w:eastAsia="Yu Gothic"/>
         </w:rPr>
-        <w:t>10⁻³</w:t>
+        <w:t>d∈-1,1⁴</w:t>
       </w:r>
       <w:r>
         <w:rPr>
           <w:rFonts w:ascii="Calibri" w:hAnsi="Calibri" w:eastAsia="Yu Gothic"/>
         </w:rPr>
-        <w:t xml:space="preserve">）をfitした。選択modelのfeatureは </w:t>
+        <w:t xml:space="preserve"> の全16 cornerを列挙し、</w:t>
       </w:r>
       <w:r>
         <w:rPr>
           <w:rFonts w:ascii="Cambria Math" w:hAnsi="Cambria Math" w:eastAsia="Yu Gothic"/>
         </w:rPr>
-        <w:t>μ̄/e</w:t>
+        <w:t>η=ed</w:t>
       </w:r>
       <w:r>
         <w:rPr>
           <w:rFonts w:ascii="Calibri" w:hAnsi="Calibri" w:eastAsia="Yu Gothic"/>
         </w:rPr>
-        <w:t xml:space="preserve"> とcertified robust fractionである。Primary baselineはraw countと、 normalized coupling、normalized off-diagonal norm、local Jacobian、minimum coordinate、nonnormalityからなる5-feature structural modelとした。 Normalized margin単独はsecondary baselineである。全予測を保持率の定義域 </w:t>
-      </w:r>
-      <w:r>
-        <w:rPr>
-          <w:rFonts w:ascii="Cambria Math" w:hAnsi="Cambria Math" w:eastAsia="Yu Gothic"/>
-        </w:rPr>
-        <w:t>[0,1]</w:t>
-      </w:r>
-      <w:r>
-        <w:rPr>
-          <w:rFonts w:ascii="Calibri" w:hAnsi="Calibri" w:eastAsia="Yu Gothic"/>
-        </w:rPr>
-        <w:t xml:space="preserve"> へclipした。</w:t>
+        <w:t xml:space="preserve"> を100 step一定に印加した。全時刻で元のorthant符号を保てば成功とした。一network・一外乱強度あたり256 challengeであり、EXP-2026-010とEXP-2026-011の各confirmation総数は122,880、EXP-2026-012は30,720、EXP-2026-014は368,640だった。</w:t>
       </w:r>
     </w:p>
     <w:p>
@@ -2042,7 +2573,19 @@
         <w:rPr>
           <w:rFonts w:ascii="Calibri" w:hAnsi="Calibri" w:eastAsia="Yu Gothic"/>
         </w:rPr>
-        <w:t>EXP-2026-012ではrobust pairを既知4 familyの全60 seedでfitし、外部familyへ適用した。学習family集合と評価family集合、学習seed集合と評価seed集合がそれぞれ交わらないことを評価器で検査した。Baselineとclip規約はEXP-2026-011から変更していない。</w:t>
+        <w:t xml:space="preserve">EXP-2026-016はdimensionに依存しない4個の符号相対方向codeを80 step印加した。各moduleの全符号orthantから500 stepで固定点を求め、結合系の同時符号保持を成功とした。Confirmationは960点、983,040 challengeである。これは全 </w:t>
+      </w:r>
+      <w:r>
+        <w:rPr>
+          <w:rFonts w:ascii="Cambria Math" w:hAnsi="Cambria Math" w:eastAsia="Yu Gothic"/>
+        </w:rPr>
+        <w:t>2ᵈ</w:t>
+      </w:r>
+      <w:r>
+        <w:rPr>
+          <w:rFonts w:ascii="Calibri" w:hAnsi="Calibri" w:eastAsia="Yu Gothic"/>
+        </w:rPr>
+        <w:t xml:space="preserve"> corner分布ではなく、零結合時のcode別積則を厳密に保つ整列taskである。</w:t>
       </w:r>
     </w:p>
     <w:p>
@@ -2050,7 +2593,7 @@
         <w:pStyle w:val="Heading2"/>
       </w:pPr>
       <w:r>
-        <w:t>4.5 統計と事前判定</w:t>
+        <w:t>4.4 Predictorとbaseline</w:t>
       </w:r>
     </w:p>
     <w:p>
@@ -2058,7 +2601,19 @@
         <w:rPr>
           <w:rFonts w:ascii="Calibri" w:hAnsi="Calibri" w:eastAsia="Yu Gothic"/>
         </w:rPr>
-        <w:t>Family別にSpearman順位相関とMAEを算出した。誤差差は同じseedの4 family・各4 gainを平均して一標本とし、30 seedを2,000回percentile bootstrapして95%区間を求めた。</w:t>
+        <w:t xml:space="preserve">EXP-2026-010ではfamilyごとにdiscovery 120条件で切片付き単回帰をfitし、confirmation 120条件へ係数を固定して適用した。主要featureは平均margin </w:t>
+      </w:r>
+      <w:r>
+        <w:rPr>
+          <w:rFonts w:ascii="Cambria Math" w:hAnsi="Cambria Math" w:eastAsia="Yu Gothic"/>
+        </w:rPr>
+        <w:t>μ̄</w:t>
+      </w:r>
+      <w:r>
+        <w:rPr>
+          <w:rFonts w:ascii="Calibri" w:hAnsi="Calibri" w:eastAsia="Yu Gothic"/>
+        </w:rPr>
+        <w:t xml:space="preserve"> である。Baselineはraw attractor count、coupling gain、off-diagonal infinity norm、全固定点にわたるworst local Jacobian infinity norm、minimum signed fixed-point coordinate、nonnormality commutator normとした。</w:t>
       </w:r>
     </w:p>
     <w:p>
@@ -2066,7 +2621,43 @@
         <w:rPr>
           <w:rFonts w:ascii="Calibri" w:hAnsi="Calibri" w:eastAsia="Yu Gothic"/>
         </w:rPr>
-        <w:t>EXP-2026-010の事前判定は、confirmation全480 networkでraw count 16、certificate下界違反0、4 familyすべてでmean marginとtask retentionのSpearmanが0.75超、pooled raw-count MAE minus margin MAEの95%区間下限が0超、の4項目である。Couplingとlocal Jacobianに対する誤差差はsecondary endpointとして事前に固定した。</w:t>
+        <w:t xml:space="preserve">EXP-2026-011ではfamily名をfeatureへ入れず、held-out familyのtask保持率をfitから 完全に除外した。各featureを学習fold内で標準化し、切片を罰しないridge回帰 （penalty </w:t>
+      </w:r>
+      <w:r>
+        <w:rPr>
+          <w:rFonts w:ascii="Cambria Math" w:hAnsi="Cambria Math" w:eastAsia="Yu Gothic"/>
+        </w:rPr>
+        <w:t>10⁻³</w:t>
+      </w:r>
+      <w:r>
+        <w:rPr>
+          <w:rFonts w:ascii="Calibri" w:hAnsi="Calibri" w:eastAsia="Yu Gothic"/>
+        </w:rPr>
+        <w:t xml:space="preserve">）をfitした。選択modelのfeatureは </w:t>
+      </w:r>
+      <w:r>
+        <w:rPr>
+          <w:rFonts w:ascii="Cambria Math" w:hAnsi="Cambria Math" w:eastAsia="Yu Gothic"/>
+        </w:rPr>
+        <w:t>μ̄/e</w:t>
+      </w:r>
+      <w:r>
+        <w:rPr>
+          <w:rFonts w:ascii="Calibri" w:hAnsi="Calibri" w:eastAsia="Yu Gothic"/>
+        </w:rPr>
+        <w:t xml:space="preserve"> とcertified robust fractionである。Primary baselineはraw countと、 normalized coupling、normalized off-diagonal norm、local Jacobian、minimum coordinate、nonnormalityからなる5-feature structural modelとした。 Normalized margin単独はsecondary baselineである。全予測を保持率の定義域 </w:t>
+      </w:r>
+      <w:r>
+        <w:rPr>
+          <w:rFonts w:ascii="Cambria Math" w:hAnsi="Cambria Math" w:eastAsia="Yu Gothic"/>
+        </w:rPr>
+        <w:t>[0,1]</w:t>
+      </w:r>
+      <w:r>
+        <w:rPr>
+          <w:rFonts w:ascii="Calibri" w:hAnsi="Calibri" w:eastAsia="Yu Gothic"/>
+        </w:rPr>
+        <w:t xml:space="preserve"> へclipした。</w:t>
       </w:r>
     </w:p>
     <w:p>
@@ -2074,7 +2665,7 @@
         <w:rPr>
           <w:rFonts w:ascii="Calibri" w:hAnsi="Calibri" w:eastAsia="Yu Gothic"/>
         </w:rPr>
-        <w:t>EXP-2026-011では各confirmation seedの4 family・4 gainを平均して一標本とした paired誤差差を用いた。事前判定は、raw count 16、certificate違反0、全familyで robust-pair予測とのSpearman 0.75超、raw-count MAE minus robust-pair MAEの 95%区間下限0超、structural MAE minus robust-pair MAEの区間下限0超、の5項目 である。確認seedを観測する前にsource/test manifestを固定した。</w:t>
+        <w:t>EXP-2026-012ではrobust pairを既知4 familyの全60 seedでfitし、外部familyへ適用した。学習family集合と評価family集合、学習seed集合と評価seed集合がそれぞれ交わらないことを評価器で検査した。Baselineとclip規約はEXP-2026-011から変更していない。</w:t>
       </w:r>
     </w:p>
     <w:p>
@@ -2082,6 +2673,58 @@
         <w:rPr>
           <w:rFonts w:ascii="Calibri" w:hAnsi="Calibri" w:eastAsia="Yu Gothic"/>
         </w:rPr>
+        <w:t xml:space="preserve">EXP-2026-016のglobal modelはdimension、raw attractor fraction、global certificate fraction、mean margin、全非対角infinity norm、normalized nonnormality、最大bridge normの7 featureを用いた。Component-aware modelはこれにisolated task積、component certificate積、directionalおよびtransported certificate率、方向別slackの平均・最小、load imbalance、size imbalanceの8 featureを加えた。Product-only modelはisolated task積だけを用いた。全modelは標準化ridge（penalty </w:t>
+      </w:r>
+      <w:r>
+        <w:rPr>
+          <w:rFonts w:ascii="Cambria Math" w:hAnsi="Cambria Math" w:eastAsia="Yu Gothic"/>
+        </w:rPr>
+        <w:t>10⁻³</w:t>
+      </w:r>
+      <w:r>
+        <w:rPr>
+          <w:rFonts w:ascii="Calibri" w:hAnsi="Calibri" w:eastAsia="Yu Gothic"/>
+        </w:rPr>
+        <w:t>）で、pilot後の係数をconfirmationへ固定した。</w:t>
+      </w:r>
+    </w:p>
+    <w:p>
+      <w:pPr>
+        <w:pStyle w:val="Heading2"/>
+      </w:pPr>
+      <w:r>
+        <w:t>4.5 統計と事前判定</w:t>
+      </w:r>
+    </w:p>
+    <w:p>
+      <w:r>
+        <w:rPr>
+          <w:rFonts w:ascii="Calibri" w:hAnsi="Calibri" w:eastAsia="Yu Gothic"/>
+        </w:rPr>
+        <w:t>Family別にSpearman順位相関とMAEを算出した。誤差差は同じseedの4 family・各4 gainを平均して一標本とし、30 seedを2,000回percentile bootstrapして95%区間を求めた。</w:t>
+      </w:r>
+    </w:p>
+    <w:p>
+      <w:r>
+        <w:rPr>
+          <w:rFonts w:ascii="Calibri" w:hAnsi="Calibri" w:eastAsia="Yu Gothic"/>
+        </w:rPr>
+        <w:t>EXP-2026-010の事前判定は、confirmation全480 networkでraw count 16、certificate下界違反0、4 familyすべてでmean marginとtask retentionのSpearmanが0.75超、pooled raw-count MAE minus margin MAEの95%区間下限が0超、の4項目である。Couplingとlocal Jacobianに対する誤差差はsecondary endpointとして事前に固定した。</w:t>
+      </w:r>
+    </w:p>
+    <w:p>
+      <w:r>
+        <w:rPr>
+          <w:rFonts w:ascii="Calibri" w:hAnsi="Calibri" w:eastAsia="Yu Gothic"/>
+        </w:rPr>
+        <w:t>EXP-2026-011では各confirmation seedの4 family・4 gainを平均して一標本とした paired誤差差を用いた。事前判定は、raw count 16、certificate違反0、全familyで robust-pair予測とのSpearman 0.75超、raw-count MAE minus robust-pair MAEの 95%区間下限0超、structural MAE minus robust-pair MAEの区間下限0超、の5項目 である。確認seedを観測する前にsource/test manifestを固定した。</w:t>
+      </w:r>
+    </w:p>
+    <w:p>
+      <w:r>
+        <w:rPr>
+          <w:rFonts w:ascii="Calibri" w:hAnsi="Calibri" w:eastAsia="Yu Gothic"/>
+        </w:rPr>
         <w:t xml:space="preserve">EXP-2026-012も同じ5判定を用いたが、family別ではなく第五family全120点のSpearmanを用いた。各seedの4 gainを一標本とする2,000回paired bootstrapを事前登録した。Source/test manifest SHA-256は </w:t>
       </w:r>
       <w:r>
@@ -2144,6 +2787,61 @@
           <w:sz w:val="19"/>
         </w:rPr>
         <w:t>a64556683a20ab733581ad6fe71ddc37dfb27cb3138b6dde50faaf6a02efe538</w:t>
+      </w:r>
+      <w:r>
+        <w:rPr>
+          <w:rFonts w:ascii="Calibri" w:hAnsi="Calibri" w:eastAsia="Yu Gothic"/>
+        </w:rPr>
+        <w:t xml:space="preserve"> である。</w:t>
+      </w:r>
+    </w:p>
+    <w:p>
+      <w:r>
+        <w:rPr>
+          <w:rFonts w:ascii="Calibri" w:hAnsi="Calibri" w:eastAsia="Yu Gothic"/>
+        </w:rPr>
+        <w:t xml:space="preserve">EXP-2026-015の主要判定は、場のhypercube不変性、energy一致、certificate違反0、構造class重複なし、非対称性、双方向bridge、局所政策の全core保持、最大feedbackでのungated優位差0.05以上、globalに対するcore保持差とreserve容量差のbootstrap区間下限がそれぞれ0.05と0.02以上、の10項目である。Coreは8 orthantすべてをchallengeし、reserveは同一確率入力に対する最大delay 6の線形記憶容量で評価した。Confirmation manifestは </w:t>
+      </w:r>
+      <w:r>
+        <w:rPr>
+          <w:rFonts w:ascii="Consolas" w:hAnsi="Consolas" w:eastAsia="Yu Gothic"/>
+          <w:sz w:val="19"/>
+        </w:rPr>
+        <w:t>823dc31303ae8d3c8c7b7610e8b6f8fcf8a297f5db240bd3a8c518989a3efca8</w:t>
+      </w:r>
+      <w:r>
+        <w:rPr>
+          <w:rFonts w:ascii="Calibri" w:hAnsi="Calibri" w:eastAsia="Yu Gothic"/>
+        </w:rPr>
+        <w:t xml:space="preserve"> である。</w:t>
+      </w:r>
+    </w:p>
+    <w:p>
+      <w:r>
+        <w:rPr>
+          <w:rFonts w:ascii="Calibri" w:hAnsi="Calibri" w:eastAsia="Yu Gothic"/>
+        </w:rPr>
+        <w:t xml:space="preserve">EXP-2026-016は、零結合task積則、transported certificateのtask下界、transported–directional–global chain、feature有限性、component MAE 0.03以下、Spearman 0.75以上、global minus componentおよびproduct-only minus component MAEのseed bootstrap区間下限0.01、0.002以上、という8実質判定と、それらのaggregateを固定した。構造gate通過と固定model hash一致もtask実行前提とし、順位相関のbaseline優位は登録していない。Confirmation manifestは </w:t>
+      </w:r>
+      <w:r>
+        <w:rPr>
+          <w:rFonts w:ascii="Consolas" w:hAnsi="Consolas" w:eastAsia="Yu Gothic"/>
+          <w:sz w:val="19"/>
+        </w:rPr>
+        <w:t>f013d7f40c2e2dd146fce6d61ea5d95288b3b8b0892b4413ea8c381817ebc170</w:t>
+      </w:r>
+      <w:r>
+        <w:rPr>
+          <w:rFonts w:ascii="Calibri" w:hAnsi="Calibri" w:eastAsia="Yu Gothic"/>
+        </w:rPr>
+        <w:t xml:space="preserve">、固定model SHA-256は </w:t>
+      </w:r>
+      <w:r>
+        <w:rPr>
+          <w:rFonts w:ascii="Consolas" w:hAnsi="Consolas" w:eastAsia="Yu Gothic"/>
+          <w:sz w:val="19"/>
+        </w:rPr>
+        <w:t>db0b50a648fb085ca687922a531fab5482af2a134bd01eefc3efe3dd85675a01</w:t>
       </w:r>
       <w:r>
         <w:rPr>
@@ -5874,10 +6572,292 @@
     </w:p>
     <w:p>
       <w:pPr>
-        <w:pStyle w:val="Heading1"/>
+        <w:pStyle w:val="Heading2"/>
       </w:pPr>
       <w:r>
-        <w:t>6. 考察</w:t>
+        <w:t>5.9 空間局所gateによるcore保護とreserve記憶</w:t>
+      </w:r>
+    </w:p>
+    <w:p>
+      <w:r>
+        <w:rPr>
+          <w:rFonts w:ascii="Calibri" w:hAnsi="Calibri" w:eastAsia="Yu Gothic"/>
+        </w:rPr>
+        <w:t>EXP-2026-015の事前固定10判定はすべて成立した。確認前構造gateでは90 networkが90絶対値構造classとなり、全て3+5 module、非対称、双方向bridgeだった。270条件、2,851,200座標遷移で局所政策の8必須orthant保持率は全て1、certificate違反は0、場の値域は[0, 0.99843]、energy-matching最大誤差は4.44×10⁻¹⁶だった。</w:t>
+      </w:r>
+    </w:p>
+    <w:tbl>
+      <w:tblPr>
+        <w:tblW w:type="dxa" w:w="9360"/>
+        <w:tblLayout w:type="fixed"/>
+        <w:tblLook w:firstColumn="1" w:firstRow="1" w:lastColumn="0" w:lastRow="0" w:noHBand="0" w:noVBand="1" w:val="04A0"/>
+        <w:tblInd w:w="120" w:type="dxa"/>
+        <w:tblLayout w:type="fixed"/>
+        <w:tblBorders>
+          <w:top w:val="single" w:sz="4" w:color="CBD2DA"/>
+          <w:left w:val="single" w:sz="4" w:color="CBD2DA"/>
+          <w:bottom w:val="single" w:sz="4" w:color="CBD2DA"/>
+          <w:right w:val="single" w:sz="4" w:color="CBD2DA"/>
+          <w:insideH w:val="single" w:sz="4" w:color="CBD2DA"/>
+          <w:insideV w:val="single" w:sz="4" w:color="CBD2DA"/>
+        </w:tblBorders>
+        <w:tblCellMar>
+          <w:top w:w="80" w:type="dxa"/>
+          <w:bottom w:w="80" w:type="dxa"/>
+          <w:start w:w="120" w:type="dxa"/>
+          <w:end w:w="120" w:type="dxa"/>
+        </w:tblCellMar>
+      </w:tblPr>
+      <w:tblGrid>
+        <w:gridCol w:w="4000"/>
+        <w:gridCol w:w="1800"/>
+        <w:gridCol w:w="3560"/>
+      </w:tblGrid>
+      <w:tr>
+        <w:trPr>
+          <w:tblHeader w:val="true"/>
+        </w:trPr>
+        <w:tc>
+          <w:tcPr>
+            <w:tcW w:type="dxa" w:w="4000"/>
+            <w:vAlign w:val="center"/>
+            <w:shd w:fill="F4F6F9"/>
+          </w:tcPr>
+          <w:p>
+            <w:pPr>
+              <w:pStyle w:val="ScientificTableText"/>
+              <w:jc w:val="left"/>
+            </w:pPr>
+            <w:r>
+              <w:rPr>
+                <w:rFonts w:ascii="Calibri" w:hAnsi="Calibri" w:eastAsia="Yu Gothic"/>
+                <w:b/>
+              </w:rPr>
+              <w:t>比較</w:t>
+            </w:r>
+          </w:p>
+        </w:tc>
+        <w:tc>
+          <w:tcPr>
+            <w:tcW w:type="dxa" w:w="1800"/>
+            <w:vAlign w:val="center"/>
+            <w:shd w:fill="F4F6F9"/>
+          </w:tcPr>
+          <w:p>
+            <w:pPr>
+              <w:pStyle w:val="ScientificTableText"/>
+              <w:jc w:val="center"/>
+            </w:pPr>
+            <w:r>
+              <w:rPr>
+                <w:rFonts w:ascii="Calibri" w:hAnsi="Calibri" w:eastAsia="Yu Gothic"/>
+                <w:b/>
+              </w:rPr>
+              <w:t>対応平均差</w:t>
+            </w:r>
+          </w:p>
+        </w:tc>
+        <w:tc>
+          <w:tcPr>
+            <w:tcW w:type="dxa" w:w="3560"/>
+            <w:vAlign w:val="center"/>
+            <w:shd w:fill="F4F6F9"/>
+          </w:tcPr>
+          <w:p>
+            <w:pPr>
+              <w:pStyle w:val="ScientificTableText"/>
+              <w:jc w:val="center"/>
+            </w:pPr>
+            <w:r>
+              <w:rPr>
+                <w:rFonts w:ascii="Calibri" w:hAnsi="Calibri" w:eastAsia="Yu Gothic"/>
+                <w:b/>
+              </w:rPr>
+              <w:t>95% bootstrap区間</w:t>
+            </w:r>
+          </w:p>
+        </w:tc>
+      </w:tr>
+      <w:tr>
+        <w:tc>
+          <w:tcPr>
+            <w:tcW w:type="dxa" w:w="4000"/>
+            <w:vAlign w:val="center"/>
+          </w:tcPr>
+          <w:p>
+            <w:pPr>
+              <w:pStyle w:val="ScientificTableText"/>
+              <w:jc w:val="left"/>
+            </w:pPr>
+            <w:r>
+              <w:rPr>
+                <w:rFonts w:ascii="Calibri" w:hAnsi="Calibri" w:eastAsia="Yu Gothic"/>
+              </w:rPr>
+              <w:t>Local minus global core retention</w:t>
+            </w:r>
+          </w:p>
+        </w:tc>
+        <w:tc>
+          <w:tcPr>
+            <w:tcW w:type="dxa" w:w="1800"/>
+            <w:vAlign w:val="center"/>
+          </w:tcPr>
+          <w:p>
+            <w:pPr>
+              <w:pStyle w:val="ScientificTableText"/>
+              <w:jc w:val="center"/>
+            </w:pPr>
+            <w:r>
+              <w:rPr>
+                <w:rFonts w:ascii="Calibri" w:hAnsi="Calibri" w:eastAsia="Yu Gothic"/>
+              </w:rPr>
+              <w:t>0.347222</w:t>
+            </w:r>
+          </w:p>
+        </w:tc>
+        <w:tc>
+          <w:tcPr>
+            <w:tcW w:type="dxa" w:w="3560"/>
+            <w:vAlign w:val="center"/>
+          </w:tcPr>
+          <w:p>
+            <w:pPr>
+              <w:pStyle w:val="ScientificTableText"/>
+              <w:jc w:val="center"/>
+            </w:pPr>
+            <w:r>
+              <w:rPr>
+                <w:rFonts w:ascii="Calibri" w:hAnsi="Calibri" w:eastAsia="Yu Gothic"/>
+              </w:rPr>
+              <w:t>[0.239317, 0.468056]</w:t>
+            </w:r>
+          </w:p>
+        </w:tc>
+      </w:tr>
+      <w:tr>
+        <w:tc>
+          <w:tcPr>
+            <w:tcW w:type="dxa" w:w="4000"/>
+            <w:vAlign w:val="center"/>
+          </w:tcPr>
+          <w:p>
+            <w:pPr>
+              <w:pStyle w:val="ScientificTableText"/>
+              <w:jc w:val="left"/>
+            </w:pPr>
+            <w:r>
+              <w:rPr>
+                <w:rFonts w:ascii="Calibri" w:hAnsi="Calibri" w:eastAsia="Yu Gothic"/>
+              </w:rPr>
+              <w:t>Local minus global reserve capacity</w:t>
+            </w:r>
+          </w:p>
+        </w:tc>
+        <w:tc>
+          <w:tcPr>
+            <w:tcW w:type="dxa" w:w="1800"/>
+            <w:vAlign w:val="center"/>
+          </w:tcPr>
+          <w:p>
+            <w:pPr>
+              <w:pStyle w:val="ScientificTableText"/>
+              <w:jc w:val="center"/>
+            </w:pPr>
+            <w:r>
+              <w:rPr>
+                <w:rFonts w:ascii="Calibri" w:hAnsi="Calibri" w:eastAsia="Yu Gothic"/>
+              </w:rPr>
+              <w:t>0.076829</w:t>
+            </w:r>
+          </w:p>
+        </w:tc>
+        <w:tc>
+          <w:tcPr>
+            <w:tcW w:type="dxa" w:w="3560"/>
+            <w:vAlign w:val="center"/>
+          </w:tcPr>
+          <w:p>
+            <w:pPr>
+              <w:pStyle w:val="ScientificTableText"/>
+              <w:jc w:val="center"/>
+            </w:pPr>
+            <w:r>
+              <w:rPr>
+                <w:rFonts w:ascii="Calibri" w:hAnsi="Calibri" w:eastAsia="Yu Gothic"/>
+              </w:rPr>
+              <w:t>[0.063495, 0.091225]</w:t>
+            </w:r>
+          </w:p>
+        </w:tc>
+      </w:tr>
+      <w:tr>
+        <w:tc>
+          <w:tcPr>
+            <w:tcW w:type="dxa" w:w="4000"/>
+            <w:vAlign w:val="center"/>
+          </w:tcPr>
+          <w:p>
+            <w:pPr>
+              <w:pStyle w:val="ScientificTableText"/>
+              <w:jc w:val="left"/>
+            </w:pPr>
+            <w:r>
+              <w:rPr>
+                <w:rFonts w:ascii="Calibri" w:hAnsi="Calibri" w:eastAsia="Yu Gothic"/>
+              </w:rPr>
+              <w:t>Local minus ungated core retention</w:t>
+            </w:r>
+          </w:p>
+        </w:tc>
+        <w:tc>
+          <w:tcPr>
+            <w:tcW w:type="dxa" w:w="1800"/>
+            <w:vAlign w:val="center"/>
+          </w:tcPr>
+          <w:p>
+            <w:pPr>
+              <w:pStyle w:val="ScientificTableText"/>
+              <w:jc w:val="center"/>
+            </w:pPr>
+            <w:r>
+              <w:rPr>
+                <w:rFonts w:ascii="Calibri" w:hAnsi="Calibri" w:eastAsia="Yu Gothic"/>
+              </w:rPr>
+              <w:t>0.124074</w:t>
+            </w:r>
+          </w:p>
+        </w:tc>
+        <w:tc>
+          <w:tcPr>
+            <w:tcW w:type="dxa" w:w="3560"/>
+            <w:vAlign w:val="center"/>
+          </w:tcPr>
+          <w:p>
+            <w:pPr>
+              <w:pStyle w:val="ScientificTableText"/>
+              <w:jc w:val="center"/>
+            </w:pPr>
+            <w:r>
+              <w:rPr>
+                <w:rFonts w:ascii="Calibri" w:hAnsi="Calibri" w:eastAsia="Yu Gothic"/>
+              </w:rPr>
+              <w:t>[0.044896, 0.213912]</w:t>
+            </w:r>
+          </w:p>
+        </w:tc>
+      </w:tr>
+    </w:tbl>
+    <w:p>
+      <w:pPr>
+        <w:spacing w:before="0" w:after="40"/>
+      </w:pPr>
+    </w:p>
+    <w:p>
+      <w:r>
+        <w:rPr>
+          <w:rFonts w:ascii="Calibri" w:hAnsi="Calibri" w:eastAsia="Yu Gothic"/>
+        </w:rPr>
+        <w:t>最大feedback gain 0.80では、noise 0、0.04、0.08に対するcore保持率が局所政策で全て1、ungatedで0.7875、0.7833、0.7750、globalで0.4708、0.4250、0.2792だった。従って、同じ介入energyでも一様な全結合減衰よりbridge局所gateの方が、必須core状態を保ちながらreserve内部の線形記憶を残した。これは単一のfeedback-driven局所政策と単純global対照の比較であり、局所制御一般の最適性を示さない。</w:t>
       </w:r>
     </w:p>
     <w:p>
@@ -5885,7 +6865,7 @@
         <w:pStyle w:val="Heading2"/>
       </w:pPr>
       <w:r>
-        <w:t>6.1 アトラクタ数から利用可能性へ</w:t>
+        <w:t>5.10 非対称・異サイズmoduleへのcomponent外挿</w:t>
       </w:r>
     </w:p>
     <w:p>
@@ -5893,63 +6873,805 @@
         <w:rPr>
           <w:rFonts w:ascii="Calibri" w:hAnsi="Calibri" w:eastAsia="Yu Gothic"/>
         </w:rPr>
-        <w:t>本結果の中心は、全networkが同じ16個の自律符号固定点を持つ条件でも、外乱下保持率が大きく異なることである。Raw countは存在を数えるが、有限外乱に対する安全性を含まない。</w:t>
-      </w:r>
-      <w:r>
-        <w:rPr>
-          <w:rFonts w:ascii="Cambria Math" w:hAnsi="Cambria Math" w:eastAsia="Yu Gothic"/>
-        </w:rPr>
-        <w:t>N_rob(e)</w:t>
-      </w:r>
-      <w:r>
-        <w:rPr>
-          <w:rFonts w:ascii="Calibri" w:hAnsi="Calibri" w:eastAsia="Yu Gothic"/>
-        </w:rPr>
-        <w:t xml:space="preserve"> とmargin分布は、要求外乱budgetに応じて利用可能な状態を数え直す。</w:t>
-      </w:r>
+        <w:t>EXP-2026-016の確認前構造gateでは、2 internal gain、4 cross strengthの各群で30 networkが30絶対値構造classとなり、全て3+5 module、非対称、双方向bridgeだった。固定pilot modelのhashは一致し、960点、983,040 challengeにおける事前登録9判定はすべて成立した。Task保持率は0.300781–1、零結合の最大絶対積則残差は0、全条件を含む最大絶対task積残差は0.185547だった。</w:t>
+      </w:r>
+    </w:p>
+    <w:tbl>
+      <w:tblPr>
+        <w:tblW w:type="dxa" w:w="9360"/>
+        <w:tblLayout w:type="fixed"/>
+        <w:tblLook w:firstColumn="1" w:firstRow="1" w:lastColumn="0" w:lastRow="0" w:noHBand="0" w:noVBand="1" w:val="04A0"/>
+        <w:tblInd w:w="120" w:type="dxa"/>
+        <w:tblLayout w:type="fixed"/>
+        <w:tblBorders>
+          <w:top w:val="single" w:sz="4" w:color="CBD2DA"/>
+          <w:left w:val="single" w:sz="4" w:color="CBD2DA"/>
+          <w:bottom w:val="single" w:sz="4" w:color="CBD2DA"/>
+          <w:right w:val="single" w:sz="4" w:color="CBD2DA"/>
+          <w:insideH w:val="single" w:sz="4" w:color="CBD2DA"/>
+          <w:insideV w:val="single" w:sz="4" w:color="CBD2DA"/>
+        </w:tblBorders>
+        <w:tblCellMar>
+          <w:top w:w="80" w:type="dxa"/>
+          <w:bottom w:w="80" w:type="dxa"/>
+          <w:start w:w="120" w:type="dxa"/>
+          <w:end w:w="120" w:type="dxa"/>
+        </w:tblCellMar>
+      </w:tblPr>
+      <w:tblGrid>
+        <w:gridCol w:w="4000"/>
+        <w:gridCol w:w="1800"/>
+        <w:gridCol w:w="3560"/>
+      </w:tblGrid>
+      <w:tr>
+        <w:trPr>
+          <w:tblHeader w:val="true"/>
+        </w:trPr>
+        <w:tc>
+          <w:tcPr>
+            <w:tcW w:type="dxa" w:w="4000"/>
+            <w:vAlign w:val="center"/>
+            <w:shd w:fill="F4F6F9"/>
+          </w:tcPr>
+          <w:p>
+            <w:pPr>
+              <w:pStyle w:val="ScientificTableText"/>
+              <w:jc w:val="left"/>
+            </w:pPr>
+            <w:r>
+              <w:rPr>
+                <w:rFonts w:ascii="Calibri" w:hAnsi="Calibri" w:eastAsia="Yu Gothic"/>
+                <w:b/>
+              </w:rPr>
+              <w:t>Model</w:t>
+            </w:r>
+          </w:p>
+        </w:tc>
+        <w:tc>
+          <w:tcPr>
+            <w:tcW w:type="dxa" w:w="1800"/>
+            <w:vAlign w:val="center"/>
+            <w:shd w:fill="F4F6F9"/>
+          </w:tcPr>
+          <w:p>
+            <w:pPr>
+              <w:pStyle w:val="ScientificTableText"/>
+              <w:jc w:val="center"/>
+            </w:pPr>
+            <w:r>
+              <w:rPr>
+                <w:rFonts w:ascii="Calibri" w:hAnsi="Calibri" w:eastAsia="Yu Gothic"/>
+                <w:b/>
+              </w:rPr>
+              <w:t>Confirmation MAE</w:t>
+            </w:r>
+          </w:p>
+        </w:tc>
+        <w:tc>
+          <w:tcPr>
+            <w:tcW w:type="dxa" w:w="3560"/>
+            <w:vAlign w:val="center"/>
+            <w:shd w:fill="F4F6F9"/>
+          </w:tcPr>
+          <w:p>
+            <w:pPr>
+              <w:pStyle w:val="ScientificTableText"/>
+              <w:jc w:val="center"/>
+            </w:pPr>
+            <w:r>
+              <w:rPr>
+                <w:rFonts w:ascii="Calibri" w:hAnsi="Calibri" w:eastAsia="Yu Gothic"/>
+                <w:b/>
+              </w:rPr>
+              <w:t>Spearman</w:t>
+            </w:r>
+          </w:p>
+        </w:tc>
+      </w:tr>
+      <w:tr>
+        <w:tc>
+          <w:tcPr>
+            <w:tcW w:type="dxa" w:w="4000"/>
+            <w:vAlign w:val="center"/>
+          </w:tcPr>
+          <w:p>
+            <w:pPr>
+              <w:pStyle w:val="ScientificTableText"/>
+              <w:jc w:val="left"/>
+            </w:pPr>
+            <w:r>
+              <w:rPr>
+                <w:rFonts w:ascii="Calibri" w:hAnsi="Calibri" w:eastAsia="Yu Gothic"/>
+              </w:rPr>
+              <w:t>Component-aware</w:t>
+            </w:r>
+          </w:p>
+        </w:tc>
+        <w:tc>
+          <w:tcPr>
+            <w:tcW w:type="dxa" w:w="1800"/>
+            <w:vAlign w:val="center"/>
+          </w:tcPr>
+          <w:p>
+            <w:pPr>
+              <w:pStyle w:val="ScientificTableText"/>
+              <w:jc w:val="center"/>
+            </w:pPr>
+            <w:r>
+              <w:rPr>
+                <w:rFonts w:ascii="Calibri" w:hAnsi="Calibri" w:eastAsia="Yu Gothic"/>
+              </w:rPr>
+              <w:t>0.012318</w:t>
+            </w:r>
+          </w:p>
+        </w:tc>
+        <w:tc>
+          <w:tcPr>
+            <w:tcW w:type="dxa" w:w="3560"/>
+            <w:vAlign w:val="center"/>
+          </w:tcPr>
+          <w:p>
+            <w:pPr>
+              <w:pStyle w:val="ScientificTableText"/>
+              <w:jc w:val="center"/>
+            </w:pPr>
+            <w:r>
+              <w:rPr>
+                <w:rFonts w:ascii="Calibri" w:hAnsi="Calibri" w:eastAsia="Yu Gothic"/>
+              </w:rPr>
+              <w:t>0.811620</w:t>
+            </w:r>
+          </w:p>
+        </w:tc>
+      </w:tr>
+      <w:tr>
+        <w:tc>
+          <w:tcPr>
+            <w:tcW w:type="dxa" w:w="4000"/>
+            <w:vAlign w:val="center"/>
+          </w:tcPr>
+          <w:p>
+            <w:pPr>
+              <w:pStyle w:val="ScientificTableText"/>
+              <w:jc w:val="left"/>
+            </w:pPr>
+            <w:r>
+              <w:rPr>
+                <w:rFonts w:ascii="Calibri" w:hAnsi="Calibri" w:eastAsia="Yu Gothic"/>
+              </w:rPr>
+              <w:t>Global profile</w:t>
+            </w:r>
+          </w:p>
+        </w:tc>
+        <w:tc>
+          <w:tcPr>
+            <w:tcW w:type="dxa" w:w="1800"/>
+            <w:vAlign w:val="center"/>
+          </w:tcPr>
+          <w:p>
+            <w:pPr>
+              <w:pStyle w:val="ScientificTableText"/>
+              <w:jc w:val="center"/>
+            </w:pPr>
+            <w:r>
+              <w:rPr>
+                <w:rFonts w:ascii="Calibri" w:hAnsi="Calibri" w:eastAsia="Yu Gothic"/>
+              </w:rPr>
+              <w:t>0.039698</w:t>
+            </w:r>
+          </w:p>
+        </w:tc>
+        <w:tc>
+          <w:tcPr>
+            <w:tcW w:type="dxa" w:w="3560"/>
+            <w:vAlign w:val="center"/>
+          </w:tcPr>
+          <w:p>
+            <w:pPr>
+              <w:pStyle w:val="ScientificTableText"/>
+              <w:jc w:val="center"/>
+            </w:pPr>
+            <w:r>
+              <w:rPr>
+                <w:rFonts w:ascii="Calibri" w:hAnsi="Calibri" w:eastAsia="Yu Gothic"/>
+              </w:rPr>
+              <w:t>0.854236</w:t>
+            </w:r>
+          </w:p>
+        </w:tc>
+      </w:tr>
+      <w:tr>
+        <w:tc>
+          <w:tcPr>
+            <w:tcW w:type="dxa" w:w="4000"/>
+            <w:vAlign w:val="center"/>
+          </w:tcPr>
+          <w:p>
+            <w:pPr>
+              <w:pStyle w:val="ScientificTableText"/>
+              <w:jc w:val="left"/>
+            </w:pPr>
+            <w:r>
+              <w:rPr>
+                <w:rFonts w:ascii="Calibri" w:hAnsi="Calibri" w:eastAsia="Yu Gothic"/>
+              </w:rPr>
+              <w:t>Product-only</w:t>
+            </w:r>
+          </w:p>
+        </w:tc>
+        <w:tc>
+          <w:tcPr>
+            <w:tcW w:type="dxa" w:w="1800"/>
+            <w:vAlign w:val="center"/>
+          </w:tcPr>
+          <w:p>
+            <w:pPr>
+              <w:pStyle w:val="ScientificTableText"/>
+              <w:jc w:val="center"/>
+            </w:pPr>
+            <w:r>
+              <w:rPr>
+                <w:rFonts w:ascii="Calibri" w:hAnsi="Calibri" w:eastAsia="Yu Gothic"/>
+              </w:rPr>
+              <w:t>0.016989</w:t>
+            </w:r>
+          </w:p>
+        </w:tc>
+        <w:tc>
+          <w:tcPr>
+            <w:tcW w:type="dxa" w:w="3560"/>
+            <w:vAlign w:val="center"/>
+          </w:tcPr>
+          <w:p>
+            <w:pPr>
+              <w:pStyle w:val="ScientificTableText"/>
+              <w:jc w:val="center"/>
+            </w:pPr>
+            <w:r>
+              <w:rPr>
+                <w:rFonts w:ascii="Calibri" w:hAnsi="Calibri" w:eastAsia="Yu Gothic"/>
+              </w:rPr>
+              <w:t>0.906200</w:t>
+            </w:r>
+          </w:p>
+        </w:tc>
+      </w:tr>
+    </w:tbl>
+    <w:p>
+      <w:pPr>
+        <w:spacing w:before="0" w:after="40"/>
+      </w:pPr>
     </w:p>
     <w:p>
       <w:r>
         <w:rPr>
           <w:rFonts w:ascii="Calibri" w:hAnsi="Calibri" w:eastAsia="Yu Gothic"/>
         </w:rPr>
-        <w:t xml:space="preserve">低外乱ではthreshold付きrobust fractionが有効であり、高外乱では連続的な平均marginがより情報を持った。EXP-2026-011では、curveの要求点での高さ </w:t>
-      </w:r>
-      <w:r>
-        <w:rPr>
-          <w:rFonts w:ascii="Cambria Math" w:hAnsi="Cambria Math" w:eastAsia="Yu Gothic"/>
-        </w:rPr>
-        <w:t>R(e)</w:t>
-      </w:r>
+        <w:t>seed単位bootstrapでglobal minus component MAEは0.027380、95%区間 [0.024736, 0.030278]、product-only minus componentは0.004671、[0.004166, 0.005115]だった。従ってcomponent表現は絶対保持率の較正を改善したが、順位相関では二baselineを上回らなかった。</w:t>
+      </w:r>
+    </w:p>
+    <w:tbl>
+      <w:tblPr>
+        <w:tblW w:type="dxa" w:w="9360"/>
+        <w:tblLayout w:type="fixed"/>
+        <w:tblLook w:firstColumn="1" w:firstRow="1" w:lastColumn="0" w:lastRow="0" w:noHBand="0" w:noVBand="1" w:val="04A0"/>
+        <w:tblInd w:w="120" w:type="dxa"/>
+        <w:tblLayout w:type="fixed"/>
+        <w:tblBorders>
+          <w:top w:val="single" w:sz="4" w:color="CBD2DA"/>
+          <w:left w:val="single" w:sz="4" w:color="CBD2DA"/>
+          <w:bottom w:val="single" w:sz="4" w:color="CBD2DA"/>
+          <w:right w:val="single" w:sz="4" w:color="CBD2DA"/>
+          <w:insideH w:val="single" w:sz="4" w:color="CBD2DA"/>
+          <w:insideV w:val="single" w:sz="4" w:color="CBD2DA"/>
+        </w:tblBorders>
+        <w:tblCellMar>
+          <w:top w:w="80" w:type="dxa"/>
+          <w:bottom w:w="80" w:type="dxa"/>
+          <w:start w:w="120" w:type="dxa"/>
+          <w:end w:w="120" w:type="dxa"/>
+        </w:tblCellMar>
+      </w:tblPr>
+      <w:tblGrid>
+        <w:gridCol w:w="2800"/>
+        <w:gridCol w:w="1640"/>
+        <w:gridCol w:w="1640"/>
+        <w:gridCol w:w="1640"/>
+        <w:gridCol w:w="1640"/>
+      </w:tblGrid>
+      <w:tr>
+        <w:trPr>
+          <w:tblHeader w:val="true"/>
+        </w:trPr>
+        <w:tc>
+          <w:tcPr>
+            <w:tcW w:type="dxa" w:w="2800"/>
+            <w:vAlign w:val="center"/>
+            <w:shd w:fill="F4F6F9"/>
+          </w:tcPr>
+          <w:p>
+            <w:pPr>
+              <w:pStyle w:val="ScientificTableText"/>
+              <w:jc w:val="left"/>
+            </w:pPr>
+            <w:r>
+              <w:rPr>
+                <w:rFonts w:ascii="Calibri" w:hAnsi="Calibri" w:eastAsia="Yu Gothic"/>
+                <w:b/>
+              </w:rPr>
+              <w:t>Cross strength</w:t>
+            </w:r>
+          </w:p>
+        </w:tc>
+        <w:tc>
+          <w:tcPr>
+            <w:tcW w:type="dxa" w:w="1640"/>
+            <w:vAlign w:val="center"/>
+            <w:shd w:fill="F4F6F9"/>
+          </w:tcPr>
+          <w:p>
+            <w:pPr>
+              <w:pStyle w:val="ScientificTableText"/>
+              <w:jc w:val="center"/>
+            </w:pPr>
+            <w:r>
+              <w:rPr>
+                <w:rFonts w:ascii="Calibri" w:hAnsi="Calibri" w:eastAsia="Yu Gothic"/>
+                <w:b/>
+              </w:rPr>
+              <w:t>Task保持率</w:t>
+            </w:r>
+          </w:p>
+        </w:tc>
+        <w:tc>
+          <w:tcPr>
+            <w:tcW w:type="dxa" w:w="1640"/>
+            <w:vAlign w:val="center"/>
+            <w:shd w:fill="F4F6F9"/>
+          </w:tcPr>
+          <w:p>
+            <w:pPr>
+              <w:pStyle w:val="ScientificTableText"/>
+              <w:jc w:val="center"/>
+            </w:pPr>
+            <w:r>
+              <w:rPr>
+                <w:rFonts w:ascii="Calibri" w:hAnsi="Calibri" w:eastAsia="Yu Gothic"/>
+                <w:b/>
+              </w:rPr>
+              <w:t>Transported率</w:t>
+            </w:r>
+          </w:p>
+        </w:tc>
+        <w:tc>
+          <w:tcPr>
+            <w:tcW w:type="dxa" w:w="1640"/>
+            <w:vAlign w:val="center"/>
+            <w:shd w:fill="F4F6F9"/>
+          </w:tcPr>
+          <w:p>
+            <w:pPr>
+              <w:pStyle w:val="ScientificTableText"/>
+              <w:jc w:val="center"/>
+            </w:pPr>
+            <w:r>
+              <w:rPr>
+                <w:rFonts w:ascii="Calibri" w:hAnsi="Calibri" w:eastAsia="Yu Gothic"/>
+                <w:b/>
+              </w:rPr>
+              <w:t>Directional率</w:t>
+            </w:r>
+          </w:p>
+        </w:tc>
+        <w:tc>
+          <w:tcPr>
+            <w:tcW w:type="dxa" w:w="1640"/>
+            <w:vAlign w:val="center"/>
+            <w:shd w:fill="F4F6F9"/>
+          </w:tcPr>
+          <w:p>
+            <w:pPr>
+              <w:pStyle w:val="ScientificTableText"/>
+              <w:jc w:val="center"/>
+            </w:pPr>
+            <w:r>
+              <w:rPr>
+                <w:rFonts w:ascii="Calibri" w:hAnsi="Calibri" w:eastAsia="Yu Gothic"/>
+                <w:b/>
+              </w:rPr>
+              <w:t>Global率</w:t>
+            </w:r>
+          </w:p>
+        </w:tc>
+      </w:tr>
+      <w:tr>
+        <w:tc>
+          <w:tcPr>
+            <w:tcW w:type="dxa" w:w="2800"/>
+            <w:vAlign w:val="center"/>
+          </w:tcPr>
+          <w:p>
+            <w:pPr>
+              <w:pStyle w:val="ScientificTableText"/>
+              <w:jc w:val="left"/>
+            </w:pPr>
+            <w:r>
+              <w:rPr>
+                <w:rFonts w:ascii="Calibri" w:hAnsi="Calibri" w:eastAsia="Yu Gothic"/>
+              </w:rPr>
+              <w:t>0</w:t>
+            </w:r>
+          </w:p>
+        </w:tc>
+        <w:tc>
+          <w:tcPr>
+            <w:tcW w:type="dxa" w:w="1640"/>
+            <w:vAlign w:val="center"/>
+          </w:tcPr>
+          <w:p>
+            <w:pPr>
+              <w:pStyle w:val="ScientificTableText"/>
+              <w:jc w:val="center"/>
+            </w:pPr>
+            <w:r>
+              <w:rPr>
+                <w:rFonts w:ascii="Calibri" w:hAnsi="Calibri" w:eastAsia="Yu Gothic"/>
+              </w:rPr>
+              <w:t>0.85309</w:t>
+            </w:r>
+          </w:p>
+        </w:tc>
+        <w:tc>
+          <w:tcPr>
+            <w:tcW w:type="dxa" w:w="1640"/>
+            <w:vAlign w:val="center"/>
+          </w:tcPr>
+          <w:p>
+            <w:pPr>
+              <w:pStyle w:val="ScientificTableText"/>
+              <w:jc w:val="center"/>
+            </w:pPr>
+            <w:r>
+              <w:rPr>
+                <w:rFonts w:ascii="Calibri" w:hAnsi="Calibri" w:eastAsia="Yu Gothic"/>
+              </w:rPr>
+              <w:t>0.73223</w:t>
+            </w:r>
+          </w:p>
+        </w:tc>
+        <w:tc>
+          <w:tcPr>
+            <w:tcW w:type="dxa" w:w="1640"/>
+            <w:vAlign w:val="center"/>
+          </w:tcPr>
+          <w:p>
+            <w:pPr>
+              <w:pStyle w:val="ScientificTableText"/>
+              <w:jc w:val="center"/>
+            </w:pPr>
+            <w:r>
+              <w:rPr>
+                <w:rFonts w:ascii="Calibri" w:hAnsi="Calibri" w:eastAsia="Yu Gothic"/>
+              </w:rPr>
+              <w:t>0.73223</w:t>
+            </w:r>
+          </w:p>
+        </w:tc>
+        <w:tc>
+          <w:tcPr>
+            <w:tcW w:type="dxa" w:w="1640"/>
+            <w:vAlign w:val="center"/>
+          </w:tcPr>
+          <w:p>
+            <w:pPr>
+              <w:pStyle w:val="ScientificTableText"/>
+              <w:jc w:val="center"/>
+            </w:pPr>
+            <w:r>
+              <w:rPr>
+                <w:rFonts w:ascii="Calibri" w:hAnsi="Calibri" w:eastAsia="Yu Gothic"/>
+              </w:rPr>
+              <w:t>0.73223</w:t>
+            </w:r>
+          </w:p>
+        </w:tc>
+      </w:tr>
+      <w:tr>
+        <w:tc>
+          <w:tcPr>
+            <w:tcW w:type="dxa" w:w="2800"/>
+            <w:vAlign w:val="center"/>
+          </w:tcPr>
+          <w:p>
+            <w:pPr>
+              <w:pStyle w:val="ScientificTableText"/>
+              <w:jc w:val="left"/>
+            </w:pPr>
+            <w:r>
+              <w:rPr>
+                <w:rFonts w:ascii="Calibri" w:hAnsi="Calibri" w:eastAsia="Yu Gothic"/>
+              </w:rPr>
+              <w:t>0.01</w:t>
+            </w:r>
+          </w:p>
+        </w:tc>
+        <w:tc>
+          <w:tcPr>
+            <w:tcW w:type="dxa" w:w="1640"/>
+            <w:vAlign w:val="center"/>
+          </w:tcPr>
+          <w:p>
+            <w:pPr>
+              <w:pStyle w:val="ScientificTableText"/>
+              <w:jc w:val="center"/>
+            </w:pPr>
+            <w:r>
+              <w:rPr>
+                <w:rFonts w:ascii="Calibri" w:hAnsi="Calibri" w:eastAsia="Yu Gothic"/>
+              </w:rPr>
+              <w:t>0.85273</w:t>
+            </w:r>
+          </w:p>
+        </w:tc>
+        <w:tc>
+          <w:tcPr>
+            <w:tcW w:type="dxa" w:w="1640"/>
+            <w:vAlign w:val="center"/>
+          </w:tcPr>
+          <w:p>
+            <w:pPr>
+              <w:pStyle w:val="ScientificTableText"/>
+              <w:jc w:val="center"/>
+            </w:pPr>
+            <w:r>
+              <w:rPr>
+                <w:rFonts w:ascii="Calibri" w:hAnsi="Calibri" w:eastAsia="Yu Gothic"/>
+              </w:rPr>
+              <w:t>0.71914</w:t>
+            </w:r>
+          </w:p>
+        </w:tc>
+        <w:tc>
+          <w:tcPr>
+            <w:tcW w:type="dxa" w:w="1640"/>
+            <w:vAlign w:val="center"/>
+          </w:tcPr>
+          <w:p>
+            <w:pPr>
+              <w:pStyle w:val="ScientificTableText"/>
+              <w:jc w:val="center"/>
+            </w:pPr>
+            <w:r>
+              <w:rPr>
+                <w:rFonts w:ascii="Calibri" w:hAnsi="Calibri" w:eastAsia="Yu Gothic"/>
+              </w:rPr>
+              <w:t>0.68216</w:t>
+            </w:r>
+          </w:p>
+        </w:tc>
+        <w:tc>
+          <w:tcPr>
+            <w:tcW w:type="dxa" w:w="1640"/>
+            <w:vAlign w:val="center"/>
+          </w:tcPr>
+          <w:p>
+            <w:pPr>
+              <w:pStyle w:val="ScientificTableText"/>
+              <w:jc w:val="center"/>
+            </w:pPr>
+            <w:r>
+              <w:rPr>
+                <w:rFonts w:ascii="Calibri" w:hAnsi="Calibri" w:eastAsia="Yu Gothic"/>
+              </w:rPr>
+              <w:t>0.66888</w:t>
+            </w:r>
+          </w:p>
+        </w:tc>
+      </w:tr>
+      <w:tr>
+        <w:tc>
+          <w:tcPr>
+            <w:tcW w:type="dxa" w:w="2800"/>
+            <w:vAlign w:val="center"/>
+          </w:tcPr>
+          <w:p>
+            <w:pPr>
+              <w:pStyle w:val="ScientificTableText"/>
+              <w:jc w:val="left"/>
+            </w:pPr>
+            <w:r>
+              <w:rPr>
+                <w:rFonts w:ascii="Calibri" w:hAnsi="Calibri" w:eastAsia="Yu Gothic"/>
+              </w:rPr>
+              <w:t>0.02</w:t>
+            </w:r>
+          </w:p>
+        </w:tc>
+        <w:tc>
+          <w:tcPr>
+            <w:tcW w:type="dxa" w:w="1640"/>
+            <w:vAlign w:val="center"/>
+          </w:tcPr>
+          <w:p>
+            <w:pPr>
+              <w:pStyle w:val="ScientificTableText"/>
+              <w:jc w:val="center"/>
+            </w:pPr>
+            <w:r>
+              <w:rPr>
+                <w:rFonts w:ascii="Calibri" w:hAnsi="Calibri" w:eastAsia="Yu Gothic"/>
+              </w:rPr>
+              <w:t>0.84934</w:t>
+            </w:r>
+          </w:p>
+        </w:tc>
+        <w:tc>
+          <w:tcPr>
+            <w:tcW w:type="dxa" w:w="1640"/>
+            <w:vAlign w:val="center"/>
+          </w:tcPr>
+          <w:p>
+            <w:pPr>
+              <w:pStyle w:val="ScientificTableText"/>
+              <w:jc w:val="center"/>
+            </w:pPr>
+            <w:r>
+              <w:rPr>
+                <w:rFonts w:ascii="Calibri" w:hAnsi="Calibri" w:eastAsia="Yu Gothic"/>
+              </w:rPr>
+              <w:t>0.70749</w:t>
+            </w:r>
+          </w:p>
+        </w:tc>
+        <w:tc>
+          <w:tcPr>
+            <w:tcW w:type="dxa" w:w="1640"/>
+            <w:vAlign w:val="center"/>
+          </w:tcPr>
+          <w:p>
+            <w:pPr>
+              <w:pStyle w:val="ScientificTableText"/>
+              <w:jc w:val="center"/>
+            </w:pPr>
+            <w:r>
+              <w:rPr>
+                <w:rFonts w:ascii="Calibri" w:hAnsi="Calibri" w:eastAsia="Yu Gothic"/>
+              </w:rPr>
+              <w:t>0.64362</w:t>
+            </w:r>
+          </w:p>
+        </w:tc>
+        <w:tc>
+          <w:tcPr>
+            <w:tcW w:type="dxa" w:w="1640"/>
+            <w:vAlign w:val="center"/>
+          </w:tcPr>
+          <w:p>
+            <w:pPr>
+              <w:pStyle w:val="ScientificTableText"/>
+              <w:jc w:val="center"/>
+            </w:pPr>
+            <w:r>
+              <w:rPr>
+                <w:rFonts w:ascii="Calibri" w:hAnsi="Calibri" w:eastAsia="Yu Gothic"/>
+              </w:rPr>
+              <w:t>0.63874</w:t>
+            </w:r>
+          </w:p>
+        </w:tc>
+      </w:tr>
+      <w:tr>
+        <w:tc>
+          <w:tcPr>
+            <w:tcW w:type="dxa" w:w="2800"/>
+            <w:vAlign w:val="center"/>
+          </w:tcPr>
+          <w:p>
+            <w:pPr>
+              <w:pStyle w:val="ScientificTableText"/>
+              <w:jc w:val="left"/>
+            </w:pPr>
+            <w:r>
+              <w:rPr>
+                <w:rFonts w:ascii="Calibri" w:hAnsi="Calibri" w:eastAsia="Yu Gothic"/>
+              </w:rPr>
+              <w:t>0.04</w:t>
+            </w:r>
+          </w:p>
+        </w:tc>
+        <w:tc>
+          <w:tcPr>
+            <w:tcW w:type="dxa" w:w="1640"/>
+            <w:vAlign w:val="center"/>
+          </w:tcPr>
+          <w:p>
+            <w:pPr>
+              <w:pStyle w:val="ScientificTableText"/>
+              <w:jc w:val="center"/>
+            </w:pPr>
+            <w:r>
+              <w:rPr>
+                <w:rFonts w:ascii="Calibri" w:hAnsi="Calibri" w:eastAsia="Yu Gothic"/>
+              </w:rPr>
+              <w:t>0.83455</w:t>
+            </w:r>
+          </w:p>
+        </w:tc>
+        <w:tc>
+          <w:tcPr>
+            <w:tcW w:type="dxa" w:w="1640"/>
+            <w:vAlign w:val="center"/>
+          </w:tcPr>
+          <w:p>
+            <w:pPr>
+              <w:pStyle w:val="ScientificTableText"/>
+              <w:jc w:val="center"/>
+            </w:pPr>
+            <w:r>
+              <w:rPr>
+                <w:rFonts w:ascii="Calibri" w:hAnsi="Calibri" w:eastAsia="Yu Gothic"/>
+              </w:rPr>
+              <w:t>0.66943</w:t>
+            </w:r>
+          </w:p>
+        </w:tc>
+        <w:tc>
+          <w:tcPr>
+            <w:tcW w:type="dxa" w:w="1640"/>
+            <w:vAlign w:val="center"/>
+          </w:tcPr>
+          <w:p>
+            <w:pPr>
+              <w:pStyle w:val="ScientificTableText"/>
+              <w:jc w:val="center"/>
+            </w:pPr>
+            <w:r>
+              <w:rPr>
+                <w:rFonts w:ascii="Calibri" w:hAnsi="Calibri" w:eastAsia="Yu Gothic"/>
+              </w:rPr>
+              <w:t>0.50885</w:t>
+            </w:r>
+          </w:p>
+        </w:tc>
+        <w:tc>
+          <w:tcPr>
+            <w:tcW w:type="dxa" w:w="1640"/>
+            <w:vAlign w:val="center"/>
+          </w:tcPr>
+          <w:p>
+            <w:pPr>
+              <w:pStyle w:val="ScientificTableText"/>
+              <w:jc w:val="center"/>
+            </w:pPr>
+            <w:r>
+              <w:rPr>
+                <w:rFonts w:ascii="Calibri" w:hAnsi="Calibri" w:eastAsia="Yu Gothic"/>
+              </w:rPr>
+              <w:t>0.48223</w:t>
+            </w:r>
+          </w:p>
+        </w:tc>
+      </w:tr>
+    </w:tbl>
+    <w:p>
+      <w:pPr>
+        <w:spacing w:before="0" w:after="40"/>
+      </w:pPr>
+    </w:p>
+    <w:p>
       <w:r>
         <w:rPr>
           <w:rFonts w:ascii="Calibri" w:hAnsi="Calibri" w:eastAsia="Yu Gothic"/>
         </w:rPr>
-        <w:t xml:space="preserve"> と無次元化面積 </w:t>
-      </w:r>
-      <w:r>
-        <w:rPr>
-          <w:rFonts w:ascii="Cambria Math" w:hAnsi="Cambria Math" w:eastAsia="Yu Gothic"/>
-        </w:rPr>
-        <w:t>μ̄/e</w:t>
-      </w:r>
-      <w:r>
-        <w:rPr>
-          <w:rFonts w:ascii="Calibri" w:hAnsi="Calibri" w:eastAsia="Yu Gothic"/>
-        </w:rPr>
-        <w:t xml:space="preserve"> の組が、いずれか単独より小さい未知seed MAEを示した。従って、分析ツールは単一scoreへ縮約せず、raw count、certified count、</w:t>
-      </w:r>
-      <w:r>
-        <w:rPr>
-          <w:rFonts w:ascii="Cambria Math" w:hAnsi="Cambria Math" w:eastAsia="Yu Gothic"/>
-        </w:rPr>
-        <w:t>N_rob(e)</w:t>
-      </w:r>
-      <w:r>
-        <w:rPr>
-          <w:rFonts w:ascii="Calibri" w:hAnsi="Calibri" w:eastAsia="Yu Gothic"/>
-        </w:rPr>
-        <w:t xml:space="preserve"> curve、margin分布、未認証率を保持すべきである。</w:t>
+        <w:t>全strengthでtask、transported、directional、globalのchain違反は0だった。実際のcross-edge情報を残すほど認証率が高く、最大strengthではtransportedがglobalより0.18720多くのchallengeを認証した。これは保証の保守性緩和であり、未認証challengeの失敗を意味しない。</w:t>
+      </w:r>
+    </w:p>
+    <w:p>
+      <w:pPr>
+        <w:pStyle w:val="Heading1"/>
+      </w:pPr>
+      <w:r>
+        <w:t>6. 考察</w:t>
       </w:r>
     </w:p>
     <w:p>
@@ -5957,7 +7679,7 @@
         <w:pStyle w:val="Heading2"/>
       </w:pPr>
       <w:r>
-        <w:t>6.2 保証と予測の分離</w:t>
+        <w:t>6.1 アトラクタ数から利用可能性へ</w:t>
       </w:r>
     </w:p>
     <w:p>
@@ -5965,7 +7687,19 @@
         <w:rPr>
           <w:rFonts w:ascii="Calibri" w:hAnsi="Calibri" w:eastAsia="Yu Gothic"/>
         </w:rPr>
-        <w:t>Hyperbox certificateは任意の時変成分別外乱に対する十分条件である。今回の一定corner taskでは、認証robust fractionは全条件で経験保持率の下界になった。ただし未認証orthantにも成功例があり、点予測としては保守的である。</w:t>
+        <w:t>本結果の中心は、全networkが同じ16個の自律符号固定点を持つ条件でも、外乱下保持率が大きく異なることである。Raw countは存在を数えるが、有限外乱に対する安全性を含まない。</w:t>
+      </w:r>
+      <w:r>
+        <w:rPr>
+          <w:rFonts w:ascii="Cambria Math" w:hAnsi="Cambria Math" w:eastAsia="Yu Gothic"/>
+        </w:rPr>
+        <w:t>N_rob(e)</w:t>
+      </w:r>
+      <w:r>
+        <w:rPr>
+          <w:rFonts w:ascii="Calibri" w:hAnsi="Calibri" w:eastAsia="Yu Gothic"/>
+        </w:rPr>
+        <w:t xml:space="preserve"> とmargin分布は、要求外乱budgetに応じて利用可能な状態を数え直す。</w:t>
       </w:r>
     </w:p>
     <w:p>
@@ -5973,7 +7707,43 @@
         <w:rPr>
           <w:rFonts w:ascii="Calibri" w:hAnsi="Calibri" w:eastAsia="Yu Gothic"/>
         </w:rPr>
-        <w:t>従ってツールは二つの出力を分ける必要がある。第一は反例が出れば理論または実装が誤っている保証下界、第二はdataset上の相関や交差検証誤差として評価する経験予測である。この分離により、「認証不能」を「失敗」と誤解することを避けられる。</w:t>
+        <w:t xml:space="preserve">低外乱ではthreshold付きrobust fractionが有効であり、高外乱では連続的な平均marginがより情報を持った。EXP-2026-011では、curveの要求点での高さ </w:t>
+      </w:r>
+      <w:r>
+        <w:rPr>
+          <w:rFonts w:ascii="Cambria Math" w:hAnsi="Cambria Math" w:eastAsia="Yu Gothic"/>
+        </w:rPr>
+        <w:t>R(e)</w:t>
+      </w:r>
+      <w:r>
+        <w:rPr>
+          <w:rFonts w:ascii="Calibri" w:hAnsi="Calibri" w:eastAsia="Yu Gothic"/>
+        </w:rPr>
+        <w:t xml:space="preserve"> と無次元化面積 </w:t>
+      </w:r>
+      <w:r>
+        <w:rPr>
+          <w:rFonts w:ascii="Cambria Math" w:hAnsi="Cambria Math" w:eastAsia="Yu Gothic"/>
+        </w:rPr>
+        <w:t>μ̄/e</w:t>
+      </w:r>
+      <w:r>
+        <w:rPr>
+          <w:rFonts w:ascii="Calibri" w:hAnsi="Calibri" w:eastAsia="Yu Gothic"/>
+        </w:rPr>
+        <w:t xml:space="preserve"> の組が、いずれか単独より小さい未知seed MAEを示した。従って、分析ツールは単一scoreへ縮約せず、raw count、certified count、</w:t>
+      </w:r>
+      <w:r>
+        <w:rPr>
+          <w:rFonts w:ascii="Cambria Math" w:hAnsi="Cambria Math" w:eastAsia="Yu Gothic"/>
+        </w:rPr>
+        <w:t>N_rob(e)</w:t>
+      </w:r>
+      <w:r>
+        <w:rPr>
+          <w:rFonts w:ascii="Calibri" w:hAnsi="Calibri" w:eastAsia="Yu Gothic"/>
+        </w:rPr>
+        <w:t xml:space="preserve"> curve、margin分布、未認証率を保持すべきである。</w:t>
       </w:r>
     </w:p>
     <w:p>
@@ -5981,7 +7751,7 @@
         <w:pStyle w:val="Heading2"/>
       </w:pPr>
       <w:r>
-        <w:t>6.3 局所安定性と有限外乱安全性</w:t>
+        <w:t>6.2 保証と予測の分離</w:t>
       </w:r>
     </w:p>
     <w:p>
@@ -5989,7 +7759,7 @@
         <w:rPr>
           <w:rFonts w:ascii="Calibri" w:hAnsi="Calibri" w:eastAsia="Yu Gothic"/>
         </w:rPr>
-        <w:t>Local Jacobianは固定点近傍の微小摂動増幅を測るが、符号境界までの有限距離とworst-case方向を直接含まない。Orthant marginは両者をhyperbox十分条件の形で含む。EXP-2026-010のpooled secondary解析でmarginがlocal Jacobianを上回ったことは、この差がtask予測に寄与する可能性を示す。</w:t>
+        <w:t>Hyperbox certificateは任意の時変成分別外乱に対する十分条件である。今回の一定corner taskでは、認証robust fractionは全条件で経験保持率の下界になった。ただし未認証orthantにも成功例があり、点予測としては保守的である。</w:t>
       </w:r>
     </w:p>
     <w:p>
@@ -5997,7 +7767,7 @@
         <w:rPr>
           <w:rFonts w:ascii="Calibri" w:hAnsi="Calibri" w:eastAsia="Yu Gothic"/>
         </w:rPr>
-        <w:t>ただしfamily内では局所baselineが優位な例もあった。EXP-2026-011ではcoupling、局所Jacobian、minimum coordinate、nonnormalityを同時に含むstructural modelを事前登録baselineとし、robust pairがpooled MAEを上回った。これは線形ridgeの範囲での増分予測力であり、非線形model、family indicatorを用いた階層model、nested cross-validationとの比較は残る。</w:t>
+        <w:t>従ってツールは二つの出力を分ける必要がある。第一は反例が出れば理論または実装が誤っている保証下界、第二はdataset上の相関や交差検証誤差として評価する経験予測である。この分離により、「認証不能」を「失敗」と誤解することを避けられる。</w:t>
       </w:r>
     </w:p>
     <w:p>
@@ -6005,6 +7775,30 @@
         <w:pStyle w:val="Heading2"/>
       </w:pPr>
       <w:r>
+        <w:t>6.3 局所安定性と有限外乱安全性</w:t>
+      </w:r>
+    </w:p>
+    <w:p>
+      <w:r>
+        <w:rPr>
+          <w:rFonts w:ascii="Calibri" w:hAnsi="Calibri" w:eastAsia="Yu Gothic"/>
+        </w:rPr>
+        <w:t>Local Jacobianは固定点近傍の微小摂動増幅を測るが、符号境界までの有限距離とworst-case方向を直接含まない。Orthant marginは両者をhyperbox十分条件の形で含む。EXP-2026-010のpooled secondary解析でmarginがlocal Jacobianを上回ったことは、この差がtask予測に寄与する可能性を示す。</w:t>
+      </w:r>
+    </w:p>
+    <w:p>
+      <w:r>
+        <w:rPr>
+          <w:rFonts w:ascii="Calibri" w:hAnsi="Calibri" w:eastAsia="Yu Gothic"/>
+        </w:rPr>
+        <w:t>ただしfamily内では局所baselineが優位な例もあった。EXP-2026-011ではcoupling、局所Jacobian、minimum coordinate、nonnormalityを同時に含むstructural modelを事前登録baselineとし、robust pairがpooled MAEを上回った。これは線形ridgeの範囲での増分予測力であり、非線形model、family indicatorを用いた階層model、nested cross-validationとの比較は残る。</w:t>
+      </w:r>
+    </w:p>
+    <w:p>
+      <w:pPr>
+        <w:pStyle w:val="Heading2"/>
+      </w:pPr>
+      <w:r>
         <w:t>6.4 Module積則と較正の非普遍性</w:t>
       </w:r>
     </w:p>
@@ -6141,7 +7935,15 @@
         <w:rPr>
           <w:rFonts w:ascii="Calibri" w:hAnsi="Calibri" w:eastAsia="Yu Gothic"/>
         </w:rPr>
-        <w:t>EXP-2026-014ではこの零次模型へ弱いcross couplingを加え、raw count 16を保ったまま平均絶対積則残差が0から0.0831へ増えることを未使用seedで確認した。平均signed残差は負だったが、平均絶対残差より絶対値が小さく、結合が全challengeで一方向に有害だったわけではない。従ってAtlasは結合normだけでなく、component別成功、signed/absolute積則残差、transported certificateを保持する必要がある。次は非対称bridgeとmodule size差でこの表現の外的妥当性を検証すべきである。</w:t>
+        <w:t>EXP-2026-014ではこの零次模型へ弱いcross couplingを加え、raw count 16を保ったまま平均絶対積則残差が0から0.0831へ増えることを未使用seedで確認した。平均signed残差は負だったが、平均絶対残差より絶対値が小さく、結合が全challengeで一方向に有害だったわけではない。従ってAtlasは結合normだけでなく、component別成功、signed/absolute積則残差、transported certificateを保持する必要がある。</w:t>
+      </w:r>
+    </w:p>
+    <w:p>
+      <w:r>
+        <w:rPr>
+          <w:rFonts w:ascii="Calibri" w:hAnsi="Calibri" w:eastAsia="Yu Gothic"/>
+        </w:rPr>
+        <w:t>EXP-2026-016は非対称bridgeとmodule size差へこの表現を外挿し、小さい二familyだけでfitしたcomponent-aware modelが未知3+5 familyでglobal profileとisolated task積より低いMAEを示した。これはcomponent分解が絶対保持率の較正へ増分情報を与える支持である。一方、順位相関は二baselineより低く、global featureの粗い順序づけを置き換えたわけではない。較正とrankingは異なる評価軸であり、「全指標で支配」と解釈しない。次は別generator、3 module以上、分割未知、stochastic/cue/readout task、非線形baselineで検証する必要がある。</w:t>
       </w:r>
     </w:p>
     <w:p>
@@ -6149,7 +7951,31 @@
         <w:pStyle w:val="Heading2"/>
       </w:pPr>
       <w:r>
-        <w:t>6.5 生得的機能コアと可塑的余剰への含意</w:t>
+        <w:t>6.5 Profileから空間局所介入へ</w:t>
+      </w:r>
+    </w:p>
+    <w:p>
+      <w:r>
+        <w:rPr>
+          <w:rFonts w:ascii="Calibri" w:hAnsi="Calibri" w:eastAsia="Yu Gothic"/>
+        </w:rPr>
+        <w:t>EXP-2026-015は、安全marginを観測指標として用いるだけでなく、marginを消費するreserve-to-core bridgeへ選択的に介入した。同一Frobenius energyのglobal制御はcore内部とreserve内部の再帰結合も一様に弱めるため、core誤遷移を十分抑えられない条件でreserve記憶も失った。局所gateはcoreへ流入するloadだけを削減し、reserve内部の時間応答を残した。</w:t>
+      </w:r>
+    </w:p>
+    <w:p>
+      <w:r>
+        <w:rPr>
+          <w:rFonts w:ascii="Calibri" w:hAnsi="Calibri" w:eastAsia="Yu Gothic"/>
+        </w:rPr>
+        <w:t>これは「局所性が常に優れる」という結論ではない。Global対照は一様scalarであり、network modelを使う低rank制御、MPC、最適なnode選択は局所政策を上回り得る。また局所政策も既知bridgeへ直接アクセスしている。次に必要なのは、同じ観測情報、model誤差、制御帯域、energyの下で、学習された受容体mapと強い制御baselineを比較することである。</w:t>
+      </w:r>
+    </w:p>
+    <w:p>
+      <w:pPr>
+        <w:pStyle w:val="Heading2"/>
+      </w:pPr>
+      <w:r>
+        <w:t>6.6 生得的機能コアと可塑的余剰への含意</w:t>
       </w:r>
     </w:p>
     <w:p>
@@ -6245,7 +8071,15 @@
         <w:rPr>
           <w:rFonts w:ascii="Calibri" w:hAnsi="Calibri" w:eastAsia="Yu Gothic"/>
         </w:rPr>
-        <w:t>EXP-2026-010は、同じ状態数を持つ人工回路でもmargin分布により利用可能性が異なることを示した。EXP-2026-011はさらに、要求budgetで残る状態割合と余裕総量の二成分が、fitから除外した構造の新規seedへ移送できることを示した。しかしEXP-2026-012では積構造への線形較正移送が失敗したため、回路のmodule構成を無視した普遍scoreとしては使えない。この結果は上の仮説と整合も反証もしない。遺伝的設計、発生、可塑性、生物回路を観測していないため、発生過程または学習maskを操作し、core margin、忘却、新規task獲得の因果関係を測る別研究が必要である。</w:t>
+        <w:t>EXP-2026-010は、同じ状態数を持つ人工回路でもmargin分布により利用可能性が異なることを示した。EXP-2026-011はさらに、要求budgetで残る状態割合と余裕総量の二成分が、fitから除外した構造の新規seedへ移送できることを示した。しかしEXP-2026-012では積構造への線形較正移送が失敗したため、回路のmodule構成を無視した普遍scoreとしては使えない。EXP-2026-016は局所margin、方向別load、size imbalanceを明示すれば一つの異サイズfamilyへ較正を移せることを示した。EXP-2026-015は、非対称core–reserve構造で局所的にfeedback loadを制御すれば、同一energyの一様制御よりcore保持とreserve記憶を両立できる人工的十分例を加えた。</w:t>
+      </w:r>
+    </w:p>
+    <w:p>
+      <w:r>
+        <w:rPr>
+          <w:rFonts w:ascii="Calibri" w:hAnsi="Calibri" w:eastAsia="Yu Gothic"/>
+        </w:rPr>
+        <w:t>Astrocyte、細胞外イオン、dopamine、AChに関する一次研究 [18–24] は、局所から広域、subsecondから分単位の変調が共存し得ることを支持する。しかし、いずれも本稿のcore–reserve分解または局所gate方程式を同定していない。本結果は長期仮説と整合する構成例であって、遺伝的設計、発生、可塑性、生物回路を実証していない。発生過程、受容体map、学習maskを操作し、core margin、忘却、新規task獲得の因果関係を測る別研究が必要である。</w:t>
       </w:r>
     </w:p>
     <w:p>
@@ -6253,7 +8087,7 @@
         <w:pStyle w:val="Heading2"/>
       </w:pPr>
       <w:r>
-        <w:t>6.6 人間規模の条件について</w:t>
+        <w:t>6.7 人間規模の条件について</w:t>
       </w:r>
     </w:p>
     <w:p>
@@ -6398,6 +8232,14 @@
           <w:rFonts w:ascii="Calibri" w:hAnsi="Calibri" w:eastAsia="Yu Gothic"/>
         </w:rPr>
         <w:t xml:space="preserve"> が必要である。大規模系では局所信頼度を1へ近づける だけでなく、冗長性、誤り訂正、階層的gating、失敗相関の制御が必要になる。 これは人間脳の実測下界ではなく、独立module仮定下の構成的scale条件である。</w:t>
+      </w:r>
+    </w:p>
+    <w:p>
+      <w:r>
+        <w:rPr>
+          <w:rFonts w:ascii="Calibri" w:hAnsi="Calibri" w:eastAsia="Yu Gothic"/>
+        </w:rPr>
+        <w:t>EXP-2026-016は2 module・最大8 nodeまでの範囲で、局所marginと方向別loadを残す表現がmodule size変更後の絶対保持率を較正できる一例を与えた。これを規模条件へ昇格するには、module分割の同定誤差、3 module以上でのcertificate合成計算量、失敗相関、stochastic外乱、cueとreadoutの影響に対する外挿誤差上界が必要である。従って人間規模のnode数またはアトラクタ数はまだ導かない。</w:t>
       </w:r>
     </w:p>
     <w:p>
@@ -6421,7 +8263,7 @@
         <w:rPr>
           <w:rFonts w:ascii="Calibri" w:hAnsi="Calibri" w:eastAsia="Yu Gothic"/>
         </w:rPr>
-        <w:t>第一に、対象は4次元tanh RNNであり、高次元、学習済み、spiking、物理reservoirへの一般化は未確認である。第二に、外乱は100 step一定のcorner方向であり、確率的、時間変動、状態依存外乱をtaskとして評価していない。Certificate自体は任意の時変成分別外乱を扱うが、経験照合の範囲は狭い。</w:t>
+        <w:t>第一に、robust repertoireの主実験は4次元tanh RNN、component外挿は4–8次元、空間場実験は8次元tanh RNNであり、高次元、学習済み、spiking、物理reservoirへの一般化は未確認である。第二に、repertoire taskの外乱は100 step一定のcorner方向、component外挿も80 step一定の4方向codeである。EXP-2026-015は確率外乱を用いたが、別のcore制御taskであり、stochastic repertoire predictorを確認していない。Certificate自体は任意の時変成分別外乱を扱うが、経験照合の範囲は狭い。</w:t>
       </w:r>
     </w:p>
     <w:p>
@@ -6437,7 +8279,7 @@
         <w:rPr>
           <w:rFonts w:ascii="Calibri" w:hAnsi="Calibri" w:eastAsia="Yu Gothic"/>
         </w:rPr>
-        <w:t>第六に、EXP-2026-010のcouplingとlocal Jacobianに対するpooled優位は事前登録secondary endpointである。第七に、EXP-2026-011はfold内で対象familyをfitから除外したが、candidate選択には4 familyすべてのpilot成績を用いた。第八に、EXP-2026-012の第五familyではrobust-pair線形modelが外挿に失敗した。さらに30 seedは符号共役で同値なため、modular family母集団に対する区間推定ではない。第九に、normalized margin単独の第五family相関は同じconfirmation上のsecondary結果であり、独立確認されていない。第十に、AUDIT-2026-001は符号対角共役だけを扱い、node permutation、一般similarity、近似共役は未監査である。第十一に、EXP-2026-013は独立な2+2 node moduleに限定される。第十二に、EXP-2026-014は対称二bridgeの弱結合だけを扱い、非対称結合、module size差、component-aware predictorのbaseline優位を検証していない。第十三に、別task family、basin-weighted safe mass、生物学的core–reserve仮説、人間規模条件は本稿の実験から直接導かれない。</w:t>
+        <w:t>第六に、EXP-2026-010のcouplingとlocal Jacobianに対するpooled優位は事前登録secondary endpointである。第七に、EXP-2026-011はfold内で対象familyをfitから除外したが、candidate選択には4 familyすべてのpilot成績を用いた。第八に、EXP-2026-012の第五familyではrobust-pair線形modelが外挿に失敗した。さらに30 seedは符号共役で同値なため、modular family母集団に対する区間推定ではない。第九に、normalized margin単独の第五family相関は同じconfirmation上のsecondary結果であり、独立確認されていない。第十に、AUDIT-2026-001は符号対角共役だけを扱い、node permutation、一般similarity、近似共役は未監査である。第十一に、EXP-2026-013は独立な2+2 node moduleに限定される。第十二に、EXP-2026-014は対称二bridgeの弱結合だけを扱う。第十三に、EXP-2026-016は非対称・異サイズを扱ったが、既知二module分割、一generator、整列4方向task、線形ridgeに限定され、順位相関ではbaselineを上回らなかった。第十四に、EXP-2026-015のglobal対照は一様scalarで、局所政策は既知bridgeへ直接アクセスした。低rank、MPC、学習済み制御との比較、場のmodel誤差と遅延、plasticity ruleは未検証である。第十五に、別task family、basin-weighted safe mass、生物学的core–reserve仮説、人間規模条件は本稿の実験から直接導かれない。</w:t>
       </w:r>
     </w:p>
     <w:p>
@@ -6461,7 +8303,15 @@
         <w:rPr>
           <w:rFonts w:ascii="Calibri" w:hAnsi="Calibri" w:eastAsia="Yu Gothic"/>
         </w:rPr>
-        <w:t>しかし、candidate選択にも未使用の独立module familyでは同じ線形modelが外挿に失敗した。さらに既存600 network条件は符号共役で192 classへ縮約された。異質独立moduleでは固定点、component certificate、task保持率の積則を確認し、対称弱結合ではraw countを保ったまま積則残差がcoupling normとともに増えることと、二種類のrectangle保証がtask下界を保つことを確認した。従ってAtlasはraw seed数とglobal scoreだけでなく、task保存対称性で割った有効構造class、component別profile、積則残差、移送certificateを保持すべきである。本研究の結論は「アトラクタ数から外乱budget付き・構造分解付きprofileへ評価単位を移す必要がある」までであり、「一つのglobal scoreまたは線形較正が任意の力学系へ通用する」ではない。次の焦点は非対称結合、module size差、確率外乱、高次元系、より豊かなset表現へ一般化し、最終的にprofileへの介入が同一予算baselineより学習、記憶、頑健性を改善するか検証することである。</w:t>
+        <w:t>しかし、candidate選択にも未使用の独立module familyでは同じ線形modelが外挿に失敗した。さらに既存600 network条件は符号共役で192 classへ縮約された。異質独立moduleでは固定点、component certificate、task保持率の積則を確認し、対称弱結合ではraw countを保ったまま積則残差がcoupling normとともに増えることと、二種類のrectangle保証がtask下界を保つことを確認した。方向別component modelは2+2・2+3から3+5系へ再fitなしで外挿し、global profileとisolated task積よりMAEを改善したが、順位相関では上回らなかった。非対称3+5 core–reserve系では、同一介入energyの局所場が一様global制御より必須core状態とreserve記憶を保った。</w:t>
+      </w:r>
+    </w:p>
+    <w:p>
+      <w:r>
+        <w:rPr>
+          <w:rFonts w:ascii="Calibri" w:hAnsi="Calibri" w:eastAsia="Yu Gothic"/>
+        </w:rPr>
+        <w:t>従ってAtlasはraw seed数とglobal scoreだけでなく、task保存対称性で割った有効構造class、component別profile、方向別load、積則残差、移送certificate、介入場とenergyを保持すべきである。本研究の結論は「アトラクタ数から外乱budget付き・構造分解付き・介入可能なprofileへ評価単位を移す必要がある」までであり、「一つのglobal score、線形較正、局所制御が任意の力学系へ通用する」ではない。次の焦点は別generator・3 module以上・未知分割でのcomponent外挿、stochastic repertoire、高次元系、より豊かなset表現、強いenergy-matched制御baselineである。</w:t>
       </w:r>
     </w:p>
     <w:p>
@@ -6481,7 +8331,7 @@
         <w:rPr>
           <w:rFonts w:ascii="Calibri" w:hAnsi="Calibri" w:eastAsia="Yu Gothic"/>
         </w:rPr>
-        <w:t xml:space="preserve">実験spec、seed、判定、導出済みartifact、主張台帳、実装、テストは本repositoryに保存した。主要記録はEXP-2026-008からEXP-2026-014とAUDIT-2026-001である。EXP-2026-011 confirmationはsource/test manifest SHA-256 </w:t>
+        <w:t xml:space="preserve">実験spec、seed、判定、導出済みartifact、主張台帳、実装、テストは本repositoryに保存した。主要記録はEXP-2026-008からEXP-2026-016とAUDIT-2026-001である。EXP-2026-011 confirmationはsource/test manifest SHA-256 </w:t>
       </w:r>
       <w:r>
         <w:rPr>
@@ -6546,7 +8396,46 @@
         <w:rPr>
           <w:rFonts w:ascii="Calibri" w:hAnsi="Calibri" w:eastAsia="Yu Gothic"/>
         </w:rPr>
-        <w:t xml:space="preserve"> で一度だけ実行した。</w:t>
+        <w:t xml:space="preserve"> で一度だけ実行した。EXP-2026-015はpilot後に確認閾値を固定し、確認前に全180 testと11 subtest、branch coverage 88%を確認した。Manifest </w:t>
+      </w:r>
+      <w:r>
+        <w:rPr>
+          <w:rFonts w:ascii="Consolas" w:hAnsi="Consolas" w:eastAsia="Yu Gothic"/>
+          <w:sz w:val="19"/>
+        </w:rPr>
+        <w:t>823dc31303ae8d3c8c7b7610e8b6f8fcf8a297f5db240bd3a8c518989a3efca8</w:t>
+      </w:r>
+      <w:r>
+        <w:rPr>
+          <w:rFonts w:ascii="Calibri" w:hAnsi="Calibri" w:eastAsia="Yu Gothic"/>
+        </w:rPr>
+        <w:t xml:space="preserve"> で未使用30 seedを一度だけ実行した。EXP-2026-016は確認前に全186 unittest、7 DOCX test、branch coverage 87%を確認し、manifest </w:t>
+      </w:r>
+      <w:r>
+        <w:rPr>
+          <w:rFonts w:ascii="Consolas" w:hAnsi="Consolas" w:eastAsia="Yu Gothic"/>
+          <w:sz w:val="19"/>
+        </w:rPr>
+        <w:t>f013d7f40c2e2dd146fce6d61ea5d95288b3b8b0892b4413ea8c381817ebc170</w:t>
+      </w:r>
+      <w:r>
+        <w:rPr>
+          <w:rFonts w:ascii="Calibri" w:hAnsi="Calibri" w:eastAsia="Yu Gothic"/>
+        </w:rPr>
+        <w:t xml:space="preserve"> と固定model hash </w:t>
+      </w:r>
+      <w:r>
+        <w:rPr>
+          <w:rFonts w:ascii="Consolas" w:hAnsi="Consolas" w:eastAsia="Yu Gothic"/>
+          <w:sz w:val="19"/>
+        </w:rPr>
+        <w:t>db0b50a648fb085ca687922a531fab5482af2a134bd01eefc3efe3dd85675a01</w:t>
+      </w:r>
+      <w:r>
+        <w:rPr>
+          <w:rFonts w:ascii="Calibri" w:hAnsi="Calibri" w:eastAsia="Yu Gothic"/>
+        </w:rPr>
+        <w:t xml:space="preserve"> で未使用30 seedを一度だけ実行した。</w:t>
       </w:r>
     </w:p>
     <w:p>
@@ -6764,6 +8653,126 @@
           <w:rFonts w:ascii="Calibri" w:hAnsi="Calibri" w:eastAsia="Yu Gothic"/>
         </w:rPr>
         <w:t>[17] Xia J, et al. Multiscale Structural Connectome Eigenmodes Constrain Human Brain Functional Dynamics. Communications Biology, 2026. https://doi.org/10.1038/s42003-026-10558-5</w:t>
+      </w:r>
+    </w:p>
+    <w:p>
+      <w:pPr>
+        <w:pStyle w:val="Bibliography"/>
+        <w:jc w:val="left"/>
+      </w:pPr>
+      <w:r>
+        <w:rPr>
+          <w:rFonts w:ascii="Calibri" w:hAnsi="Calibri" w:eastAsia="Yu Gothic"/>
+        </w:rPr>
+        <w:t>[18] Cahill MK, et al. Local and Transient Inputs to Astrocytes Generate Larger and Longer-Lasting Calcium Signals. Nature, 2024. https://doi.org/10.1038/s41586-024-07311-5</w:t>
+      </w:r>
+    </w:p>
+    <w:p>
+      <w:pPr>
+        <w:pStyle w:val="Bibliography"/>
+        <w:jc w:val="left"/>
+      </w:pPr>
+      <w:r>
+        <w:rPr>
+          <w:rFonts w:ascii="Calibri" w:hAnsi="Calibri" w:eastAsia="Yu Gothic"/>
+        </w:rPr>
+        <w:t>[19] Centripetal Integration of Past Events in Hippocampal Astrocytes Regulated by the Locus Coeruleus. Nature Neuroscience, 2024. https://doi.org/10.1038/s41593-024-01612-8</w:t>
+      </w:r>
+    </w:p>
+    <w:p>
+      <w:pPr>
+        <w:pStyle w:val="Bibliography"/>
+        <w:jc w:val="left"/>
+      </w:pPr>
+      <w:r>
+        <w:rPr>
+          <w:rFonts w:ascii="Calibri" w:hAnsi="Calibri" w:eastAsia="Yu Gothic"/>
+        </w:rPr>
+        <w:t>[20] Rapid Astrocyte Modulation of Local Extracellular Calcium Drives Striatal Cholinergic Interneurons and Dopamine Release. Nature Communications, 2024. https://doi.org/10.1038/s41467-024-54253-7</w:t>
+      </w:r>
+    </w:p>
+    <w:p>
+      <w:pPr>
+        <w:pStyle w:val="Bibliography"/>
+        <w:jc w:val="left"/>
+      </w:pPr>
+      <w:r>
+        <w:rPr>
+          <w:rFonts w:ascii="Calibri" w:hAnsi="Calibri" w:eastAsia="Yu Gothic"/>
+        </w:rPr>
+        <w:t>[21] Astrocytic Sodium Homeostasis Exhibits Cellular and Subcellular Heterogeneity and Controls Potassium Uptake. Nature Communications, 2026. https://doi.org/10.1038/s41467-026-73435-z</w:t>
+      </w:r>
+    </w:p>
+    <w:p>
+      <w:pPr>
+        <w:pStyle w:val="Bibliography"/>
+        <w:jc w:val="left"/>
+      </w:pPr>
+      <w:r>
+        <w:rPr>
+          <w:rFonts w:ascii="Calibri" w:hAnsi="Calibri" w:eastAsia="Yu Gothic"/>
+        </w:rPr>
+        <w:t>[22] Brain-State-Dependent Astrocytic Chloride. Nature Communications, 2023. https://doi.org/10.1038/s41467-023-37433-9</w:t>
+      </w:r>
+    </w:p>
+    <w:p>
+      <w:pPr>
+        <w:pStyle w:val="Bibliography"/>
+        <w:jc w:val="left"/>
+      </w:pPr>
+      <w:r>
+        <w:rPr>
+          <w:rFonts w:ascii="Calibri" w:hAnsi="Calibri" w:eastAsia="Yu Gothic"/>
+        </w:rPr>
+        <w:t>[23] Acetylcholine–Dopamine Waves as a Reaction–Diffusion System. Nature Communications, 2023. https://doi.org/10.1038/s41467-023-42311-5</w:t>
+      </w:r>
+    </w:p>
+    <w:p>
+      <w:pPr>
+        <w:pStyle w:val="Bibliography"/>
+        <w:jc w:val="left"/>
+      </w:pPr>
+      <w:r>
+        <w:rPr>
+          <w:rFonts w:ascii="Calibri" w:hAnsi="Calibri" w:eastAsia="Yu Gothic"/>
+        </w:rPr>
+        <w:t>[24] Dopamine Builds and Reveals Latent Behavioral Attractors. Nature Communications, 2024. https://doi.org/10.1038/s41467-024-53976-x</w:t>
+      </w:r>
+    </w:p>
+    <w:p>
+      <w:pPr>
+        <w:pStyle w:val="Bibliography"/>
+        <w:jc w:val="left"/>
+      </w:pPr>
+      <w:r>
+        <w:rPr>
+          <w:rFonts w:ascii="Calibri" w:hAnsi="Calibri" w:eastAsia="Yu Gothic"/>
+        </w:rPr>
+        <w:t>[25] Dashkovskiy SN, Rüffer BS, Wirth FR. Small Gain Theorems for Large Scale Systems and Construction of ISS Lyapunov Functions. SIAM Journal on Control and Optimization 48, 4089–4118, 2010. https://doi.org/10.1137/090746483</w:t>
+      </w:r>
+    </w:p>
+    <w:p>
+      <w:pPr>
+        <w:pStyle w:val="Bibliography"/>
+        <w:jc w:val="left"/>
+      </w:pPr>
+      <w:r>
+        <w:rPr>
+          <w:rFonts w:ascii="Calibri" w:hAnsi="Calibri" w:eastAsia="Yu Gothic"/>
+        </w:rPr>
+        <w:t>[26] Zhang S, Xiu Y, Qu G, Fan C. Compositional Neural Certificates for Networked Dynamical Systems. Proceedings of L4DC, PMLR 211, 272–285, 2023. https://proceedings.mlr.press/v211/zhang23a.html</w:t>
+      </w:r>
+    </w:p>
+    <w:p>
+      <w:pPr>
+        <w:pStyle w:val="Bibliography"/>
+        <w:jc w:val="left"/>
+      </w:pPr>
+      <w:r>
+        <w:rPr>
+          <w:rFonts w:ascii="Calibri" w:hAnsi="Calibri" w:eastAsia="Yu Gothic"/>
+        </w:rPr>
+        <w:t>[27] Pradhan N, Dasgupta S, Sinha S. Modular Organization Enhances the Robustness of Attractor Network Dynamics. Europhysics Letters 94, 38004, 2011. https://doi.org/10.1209/0295-5075/94/38004</w:t>
       </w:r>
     </w:p>
     <w:sectPr>

</xml_diff>

<commit_message>
Improve reservoir dynamics analysis and tuning workflows
</commit_message>
<xml_diff>
--- a/docs/papers/robust-repertoire-memory-ja.docx
+++ b/docs/papers/robust-repertoire-memory-ja.docx
@@ -32,7 +32,7 @@
         <w:rPr>
           <w:rFonts w:ascii="Calibri" w:hAnsi="Calibri" w:eastAsia="Yu Gothic"/>
         </w:rPr>
-        <w:t>研究草稿 v0.7 2026年8月2日</w:t>
+        <w:t>研究草稿 v0.9 2026年8月8日</w:t>
       </w:r>
     </w:p>
     <w:p>
@@ -128,15 +128,71 @@
         <w:rPr>
           <w:rFonts w:ascii="Calibri" w:hAnsi="Calibri" w:eastAsia="Yu Gothic"/>
         </w:rPr>
-        <w:t>さらに3+5 nodeの非対称core–reserve RNNへ有界拡散型の空間変調場を導入し、reserve-to-core bridgeだけを局所gateする介入を、同じFrobenius介入energyの一様global recurrent gainと比較した。未使用30 seed、270条件、2,851,200座標遷移で局所場は8必須core orthantを全条件保持した。global対照に対するcore保持差は0.3472 [0.2393, 0.4681]、reserve線形記憶容量差は0.07683 [0.06350, 0.09123]で、certificate違反は0だった。</w:t>
+        <w:t>さらに座標順を隠した2+2+3三module系へ進めた。強い一意affinity gapからtask値を見ずに240/240 networkのpartitionを回復し、局所16 orthantによる因子化certificateを全系128 orthantの直積列挙と960点すべてで一致させた。前実験の固定predictorを再fitせず適用したcomponent-aware MAEは0.01626、global 0.07993、product-only 0.02102で、491,520 challengeに対する事前登録12判定はすべて成立した。ただしglobalのSpearmanが0.9468で最良であり、方向別とglobal certificateが一致する等流入generatorだった。</w:t>
       </w:r>
     </w:p>
     <w:p>
-      <w:r>
-        <w:rPr>
-          <w:rFonts w:ascii="Calibri" w:hAnsi="Calibri" w:eastAsia="Yu Gothic"/>
-        </w:rPr>
-        <w:t>以上は、有限外乱下で利用可能な記憶状態を評価するにはアトラクタ数だけでなくmargin profileが必要である一方、既知構造で学習した低次元の線形較正を任意の力学系へ普遍化できないことを示す。またraw seed数をtask保存対称性で割り、component別profile、方向別結合負荷、積則残差、移送certificateを保持し、局所介入へ接続する必要がある。本結果は低次元tanh RNN、符号保持と線形記憶、既知二module分割、hyperbox十分条件、単純なglobal対照に限定される。</w:t>
+      <w:pPr>
+        <w:pStyle w:val="Reproducibility"/>
+        <w:jc w:val="left"/>
+      </w:pPr>
+      <w:r>
+        <w:rPr>
+          <w:rFonts w:ascii="Calibri" w:hAnsi="Calibri" w:eastAsia="Yu Gothic"/>
+        </w:rPr>
+        <w:t xml:space="preserve">この強いgapを二値条件のままにせず、最大gap </w:t>
+      </w:r>
+      <w:r>
+        <w:rPr>
+          <w:rFonts w:ascii="Cambria Math" w:hAnsi="Cambria Math" w:eastAsia="Yu Gothic"/>
+        </w:rPr>
+        <w:t>g₁</w:t>
+      </w:r>
+      <w:r>
+        <w:rPr>
+          <w:rFonts w:ascii="Calibri" w:hAnsi="Calibri" w:eastAsia="Yu Gothic"/>
+        </w:rPr>
+        <w:t xml:space="preserve"> と二番目 </w:t>
+      </w:r>
+      <w:r>
+        <w:rPr>
+          <w:rFonts w:ascii="Cambria Math" w:hAnsi="Cambria Math" w:eastAsia="Yu Gothic"/>
+        </w:rPr>
+        <w:t>g₂</w:t>
+      </w:r>
+      <w:r>
+        <w:rPr>
+          <w:rFonts w:ascii="Calibri" w:hAnsi="Calibri" w:eastAsia="Yu Gothic"/>
+        </w:rPr>
+        <w:t xml:space="preserve"> から、同じpartitionを保つentrywise十分半径 </w:t>
+      </w:r>
+      <w:r>
+        <w:rPr>
+          <w:rFonts w:ascii="Cambria Math" w:hAnsi="Cambria Math" w:eastAsia="Yu Gothic"/>
+        </w:rPr>
+        <w:t>rₚₐᵣₜ=min(g₁/2,(g₁-g₂)/4)</w:t>
+      </w:r>
+      <w:r>
+        <w:rPr>
+          <w:rFonts w:ascii="Calibri" w:hAnsi="Calibri" w:eastAsia="Yu Gothic"/>
+        </w:rPr>
+        <w:t xml:space="preserve"> を導出した。固定manifestと未使用30 seedの180 base network、8摂動方向、7相対振幅からなる10,080条件で事前登録8判定はすべて成立し、半径0.9倍以下の5,760条件でpartition回復率1、pair disagreement 0だった。探索域では半径2倍で回復率0.7375、4倍で0.1653へ低下したが、これはtask機能の失敗率ではない。</w:t>
+      </w:r>
+    </w:p>
+    <w:p>
+      <w:r>
+        <w:rPr>
+          <w:rFonts w:ascii="Calibri" w:hAnsi="Calibri" w:eastAsia="Yu Gothic"/>
+        </w:rPr>
+        <w:t>さらに3+5 nodeの非対称core–reserve RNNへ有界拡散型の空間変調場を導入し、reserve-to-core bridgeだけを局所gateする介入を、同じFrobenius介入energyの一様global recurrent gainと比較した。未使用30 seed、270条件、2,851,200座標遷移で局所場は8必須core orthantを全条件保持した。global対照に対するcore保持差は0.3472 [0.2393, 0.4681]、reserve線形記憶容量差は0.07683 [0.06350, 0.09123]で、certificate違反は0だった。</w:t>
+      </w:r>
+    </w:p>
+    <w:p>
+      <w:r>
+        <w:rPr>
+          <w:rFonts w:ascii="Calibri" w:hAnsi="Calibri" w:eastAsia="Yu Gothic"/>
+        </w:rPr>
+        <w:t>以上は、有限外乱下で利用可能な記憶状態を評価するにはアトラクタ数だけでなくmargin profileが必要である一方、既知構造で学習した低次元の線形較正を任意の力学系へ普遍化できないことを示す。またraw seed数をtask保存対称性で割り、component別profile、方向別結合負荷、積則残差、移送certificate、分割不確実性とそのentrywise保証半径を保持し、局所介入へ接続する必要がある。本結果は低次元tanh RNN、符号保持と線形記憶、強く分離可能な三module構造、hyperbox十分条件、単純なglobal対照に限定される。</w:t>
       </w:r>
     </w:p>
     <w:p>
@@ -179,7 +235,7 @@
         <w:rPr>
           <w:rFonts w:ascii="Calibri" w:hAnsi="Calibri" w:eastAsia="Yu Gothic"/>
         </w:rPr>
-        <w:t>本研究の問いは次の五点である。第一に、非対角tanh RNNの各符号orthantへ任意方向有界外乱に対する計算可能な安全marginを与えられるか。第二に、raw autonomous attractor countを一致させてもrobust repertoireを分離できるか。第三に、そのmargin profileが未知seedの外乱下記憶性能をraw count、coupling、局所Jacobianよりよく予測するか。第四に、局所marginと方向別結合負荷を保持するcomponent表現が、小さい非対称系から異なるmodule sizeへ外挿できるか。第五に、marginを消費する結合へ局所的に介入すると、同一energyの一様介入より必須アトラクタとreserve記憶を両立できるか。</w:t>
+        <w:t>本研究の問いは次の七点である。第一に、非対角tanh RNNの各符号orthantへ任意方向有界外乱に対する計算可能な安全marginを与えられるか。第二に、raw autonomous attractor countを一致させてもrobust repertoireを分離できるか。第三に、そのmargin profileが未知seedの外乱下記憶性能をraw count、coupling、局所Jacobianよりよく予測するか。第四に、局所marginと方向別結合負荷を保持するcomponent表現が、小さい非対称系から異なるmodule sizeへ外挿できるか。第五に、未知partitionをtask非依存に回復し、多component certificateを全状態列挙なしに合成できるか。第六に、そのpartitionを保つ構造摂動の十分半径を導出できるか。第七に、marginを消費する結合へ局所的に介入すると、同一energyの一様介入より必須アトラクタとreserve記憶を両立できるか。</w:t>
       </w:r>
     </w:p>
     <w:p>
@@ -337,6 +393,36 @@
         <w:rPr>
           <w:rFonts w:ascii="Calibri" w:hAnsi="Calibri" w:eastAsia="Yu Gothic"/>
         </w:rPr>
+        <w:t>task-free affinity-gap分割、任意module数の方向別load行列、因子化certificateを実装し、未知三moduleで局所列挙が全系直積と一致することと固定予測器のMAE移送を事前登録確認した。</w:t>
+      </w:r>
+    </w:p>
+    <w:p>
+      <w:pPr>
+        <w:spacing w:before="0" w:after="80" w:line="290" w:lineRule="auto"/>
+        <w:numPr>
+          <w:ilvl w:val="0"/>
+          <w:numId w:val="10"/>
+        </w:numPr>
+      </w:pPr>
+      <w:r>
+        <w:rPr>
+          <w:rFonts w:ascii="Calibri" w:hAnsi="Calibri" w:eastAsia="Yu Gothic"/>
+        </w:rPr>
+        <w:t>最大affinity gapと次点gapから同じpartitionを保つentrywise十分半径を導出し、固定manifestと未使用seedで半径内の完全不変性を事前登録確認した。</w:t>
+      </w:r>
+    </w:p>
+    <w:p>
+      <w:pPr>
+        <w:spacing w:before="0" w:after="80" w:line="290" w:lineRule="auto"/>
+        <w:numPr>
+          <w:ilvl w:val="0"/>
+          <w:numId w:val="10"/>
+        </w:numPr>
+      </w:pPr>
+      <w:r>
+        <w:rPr>
+          <w:rFonts w:ascii="Calibri" w:hAnsi="Calibri" w:eastAsia="Yu Gothic"/>
+        </w:rPr>
         <w:t>有界拡散場、時変row gateのcore保護条件、energy-matched global対照を実装し、非対称3+5 core–reserve RNNで局所介入の因果的優位を事前登録確認した。</w:t>
       </w:r>
     </w:p>
@@ -437,6 +523,14 @@
       </w:r>
     </w:p>
     <w:p>
+      <w:r>
+        <w:rPr>
+          <w:rFonts w:ascii="Calibri" w:hAnsi="Calibri" w:eastAsia="Yu Gothic"/>
+        </w:rPr>
+        <w:t>ヒト構造connectomeでは皮質領域の発生時期が構造中心性と相関し、神経新生時期が近い領域ほど結合確率と結合重みが大きいことが報告された [29]。発生期ヒト皮質では細胞subtype指定に関係する500超のgene co-expression networkとmeta-moduleも同定された [30]。これらは発生programが構造scaffoldへ制約を与えることと整合するが、発生module、構造module、力学的attractor moduleが一致する証拠ではない。</w:t>
+      </w:r>
+    </w:p>
+    <w:p>
       <w:pPr>
         <w:pStyle w:val="Heading2"/>
       </w:pPr>
@@ -450,6 +544,22 @@
           <w:rFonts w:ascii="Calibri" w:hAnsi="Calibri" w:eastAsia="Yu Gothic"/>
         </w:rPr>
         <w:t>相互結合した非線形subsystemについて、ISS Lyapunov関数と方向別gain operatorから全体系の安定性を構成するsmall-gain理論がある [25]。近年は、小規模subsystemで得たneural certificateを類似構造の大規模networkへ合成する枠組みも提案されている [26]。Attractor networkではmodularityがbasin体積と収束時間を改善し得る一方、最適値は中間的であり、module化を単調な利得とはみなせない [27]。</w:t>
+      </w:r>
+    </w:p>
+    <w:p>
+      <w:r>
+        <w:rPr>
+          <w:rFonts w:ascii="Calibri" w:hAnsi="Calibri" w:eastAsia="Yu Gothic"/>
+        </w:rPr>
+        <w:t>離散時間相互結合系についても、subsystem単位のISS certificateを規模に依存しにくい形で合成するsISS枠組みが2025年にプレプリントとして提案されている [28]。これは本稿の局所certificate合成と方向性が近いが、本稿のorthant hyperbox、task保持率、未知partition回復を証明するものではない。</w:t>
+      </w:r>
+    </w:p>
+    <w:p>
+      <w:r>
+        <w:rPr>
+          <w:rFonts w:ascii="Calibri" w:hAnsi="Calibri" w:eastAsia="Yu Gothic"/>
+        </w:rPr>
+        <w:t>Network communityの統計的有意性を小摂動に対するpartitionのrobustnessで測る方法が提案されている [31]。また競合partitionの分布が不均質なとき、単一consensusではdissensusを表現できない [32]。本稿は一般community分布を推定せず、最大affinity-gap推定器に限定して一点partitionが不変な決定論的半径を与える。構造module性だけでは人工RNNの機能specializationを保証せず、環境分離、資源制約、情報流条件が必要だったという結果 [33] も踏まえ、構造保証とtask保証を分離する。ヒトconnectomeの機能結合個体差がwithin-networkからbetween-networkへ系統的に変わり、構造結合変動とも関連した結果 [34] は、個体差を一様noiseではなく構造化摂動として扱う必要性を支持するが、本稿の半径を実測したものではない。</w:t>
       </w:r>
     </w:p>
     <w:p>
@@ -1413,7 +1523,7 @@
         <w:pStyle w:val="Heading2"/>
       </w:pPr>
       <w:r>
-        <w:t>3.8 有界空間変調場と局所gate</w:t>
+        <w:t>3.8 多component合成とtask-free分割</w:t>
       </w:r>
     </w:p>
     <w:p>
@@ -1421,31 +1531,43 @@
         <w:rPr>
           <w:rFonts w:ascii="Calibri" w:hAnsi="Calibri" w:eastAsia="Yu Gothic"/>
         </w:rPr>
-        <w:t xml:space="preserve">nodeごとの変調状態を </w:t>
+        <w:t xml:space="preserve">partitionを </w:t>
       </w:r>
       <w:r>
         <w:rPr>
           <w:rFonts w:ascii="Cambria Math" w:hAnsi="Cambria Math" w:eastAsia="Yu Gothic"/>
         </w:rPr>
-        <w:t>zₜ∈[0,1]ⁿ</w:t>
-      </w:r>
-      <w:r>
-        <w:rPr>
-          <w:rFonts w:ascii="Calibri" w:hAnsi="Calibri" w:eastAsia="Yu Gothic"/>
-        </w:rPr>
-        <w:t xml:space="preserve">、sourceを </w:t>
+        <w:t>I₁,ldots,Iₘ</w:t>
+      </w:r>
+      <w:r>
+        <w:rPr>
+          <w:rFonts w:ascii="Calibri" w:hAnsi="Calibri" w:eastAsia="Yu Gothic"/>
+        </w:rPr>
+        <w:t xml:space="preserve"> とし、module </w:t>
       </w:r>
       <w:r>
         <w:rPr>
           <w:rFonts w:ascii="Cambria Math" w:hAnsi="Cambria Math" w:eastAsia="Yu Gothic"/>
         </w:rPr>
-        <w:t>sₜ∈[0,1]ⁿ</w:t>
-      </w:r>
-      <w:r>
-        <w:rPr>
-          <w:rFonts w:ascii="Calibri" w:hAnsi="Calibri" w:eastAsia="Yu Gothic"/>
-        </w:rPr>
-        <w:t xml:space="preserve"> とし、</w:t>
+        <w:t>j</w:t>
+      </w:r>
+      <w:r>
+        <w:rPr>
+          <w:rFonts w:ascii="Calibri" w:hAnsi="Calibri" w:eastAsia="Yu Gothic"/>
+        </w:rPr>
+        <w:t xml:space="preserve"> からmodule </w:t>
+      </w:r>
+      <w:r>
+        <w:rPr>
+          <w:rFonts w:ascii="Cambria Math" w:hAnsi="Cambria Math" w:eastAsia="Yu Gothic"/>
+        </w:rPr>
+        <w:t>i</w:t>
+      </w:r>
+      <w:r>
+        <w:rPr>
+          <w:rFonts w:ascii="Calibri" w:hAnsi="Calibri" w:eastAsia="Yu Gothic"/>
+        </w:rPr>
+        <w:t xml:space="preserve"> への 受信方向別loadを</w:t>
       </w:r>
     </w:p>
     <w:p>
@@ -1457,7 +1579,7 @@
           <w:rFonts w:ascii="Cambria Math" w:hAnsi="Cambria Math"/>
           <w:sz w:val="21"/>
         </w:rPr>
-        <w:t>zₜ₊₁=(1-alpha-beta)zₜ+alpha Pzₜ+beta sₜ</w:t>
+        <w:t>Lᵢⱼ=maxᵣ∈ IᵢΣ_c∈ Iⱼ|W_rc|, ellᵢ=Σⱼₙₑ iLᵢⱼ</w:t>
       </w:r>
     </w:p>
     <w:p>
@@ -1465,123 +1587,43 @@
         <w:rPr>
           <w:rFonts w:ascii="Calibri" w:hAnsi="Calibri" w:eastAsia="Yu Gothic"/>
         </w:rPr>
-        <w:t>とする。</w:t>
+        <w:t xml:space="preserve">と定義する。module </w:t>
       </w:r>
       <w:r>
         <w:rPr>
           <w:rFonts w:ascii="Cambria Math" w:hAnsi="Cambria Math" w:eastAsia="Yu Gothic"/>
         </w:rPr>
-        <w:t>P</w:t>
-      </w:r>
-      <w:r>
-        <w:rPr>
-          <w:rFonts w:ascii="Calibri" w:hAnsi="Calibri" w:eastAsia="Yu Gothic"/>
-        </w:rPr>
-        <w:t xml:space="preserve"> が非負row-stochastic、</w:t>
+        <w:t>i</w:t>
+      </w:r>
+      <w:r>
+        <w:rPr>
+          <w:rFonts w:ascii="Calibri" w:hAnsi="Calibri" w:eastAsia="Yu Gothic"/>
+        </w:rPr>
+        <w:t xml:space="preserve"> のisolated marginが外乱 </w:t>
       </w:r>
       <w:r>
         <w:rPr>
           <w:rFonts w:ascii="Cambria Math" w:hAnsi="Cambria Math" w:eastAsia="Yu Gothic"/>
         </w:rPr>
-        <w:t>alpha,beta≥0</w:t>
-      </w:r>
-      <w:r>
-        <w:rPr>
-          <w:rFonts w:ascii="Calibri" w:hAnsi="Calibri" w:eastAsia="Yu Gothic"/>
-        </w:rPr>
-        <w:t xml:space="preserve">、 </w:t>
+        <w:t>e+ellᵢ</w:t>
+      </w:r>
+      <w:r>
+        <w:rPr>
+          <w:rFonts w:ascii="Calibri" w:hAnsi="Calibri" w:eastAsia="Yu Gothic"/>
+        </w:rPr>
+        <w:t xml:space="preserve"> 以上である orthant割合を </w:t>
       </w:r>
       <w:r>
         <w:rPr>
           <w:rFonts w:ascii="Cambria Math" w:hAnsi="Cambria Math" w:eastAsia="Yu Gothic"/>
         </w:rPr>
-        <w:t>alpha+beta≤1</w:t>
-      </w:r>
-      <w:r>
-        <w:rPr>
-          <w:rFonts w:ascii="Calibri" w:hAnsi="Calibri" w:eastAsia="Yu Gothic"/>
-        </w:rPr>
-        <w:t xml:space="preserve"> なら右辺はhypercube内の点の凸結合であり、 </w:t>
-      </w:r>
-      <w:r>
-        <w:rPr>
-          <w:rFonts w:ascii="Cambria Math" w:hAnsi="Cambria Math" w:eastAsia="Yu Gothic"/>
-        </w:rPr>
-        <w:t>zₜ∈[0,1]ⁿ</w:t>
-      </w:r>
-      <w:r>
-        <w:rPr>
-          <w:rFonts w:ascii="Calibri" w:hAnsi="Calibri" w:eastAsia="Yu Gothic"/>
-        </w:rPr>
-        <w:t xml:space="preserve"> は正不変である。局所gateを </w:t>
-      </w:r>
-      <w:r>
-        <w:rPr>
-          <w:rFonts w:ascii="Cambria Math" w:hAnsi="Cambria Math" w:eastAsia="Yu Gothic"/>
-        </w:rPr>
-        <w:t>gₜ=1-zₜ</w:t>
-      </w:r>
-      <w:r>
-        <w:rPr>
-          <w:rFonts w:ascii="Calibri" w:hAnsi="Calibri" w:eastAsia="Yu Gothic"/>
-        </w:rPr>
-        <w:t xml:space="preserve"> とし、 reserve-to-core行列 </w:t>
-      </w:r>
-      <w:r>
-        <w:rPr>
-          <w:rFonts w:ascii="Cambria Math" w:hAnsi="Cambria Math" w:eastAsia="Yu Gothic"/>
-        </w:rPr>
-        <w:t>G</w:t>
-      </w:r>
-      <w:r>
-        <w:rPr>
-          <w:rFonts w:ascii="Calibri" w:hAnsi="Calibri" w:eastAsia="Yu Gothic"/>
-        </w:rPr>
-        <w:t xml:space="preserve"> の受信行だけを </w:t>
-      </w:r>
-      <w:r>
-        <w:rPr>
-          <w:rFonts w:ascii="Cambria Math" w:hAnsi="Cambria Math" w:eastAsia="Yu Gothic"/>
-        </w:rPr>
-        <w:t>D(gₜ)G</w:t>
-      </w:r>
-      <w:r>
-        <w:rPr>
-          <w:rFonts w:ascii="Calibri" w:hAnsi="Calibri" w:eastAsia="Yu Gothic"/>
-        </w:rPr>
-        <w:t xml:space="preserve"> に置き換える。</w:t>
-      </w:r>
-    </w:p>
-    <w:p>
-      <w:r>
-        <w:rPr>
-          <w:rFonts w:ascii="Calibri" w:hAnsi="Calibri" w:eastAsia="Yu Gothic"/>
-        </w:rPr>
-        <w:t xml:space="preserve">各core座標の双安定安全marginを </w:t>
-      </w:r>
-      <w:r>
-        <w:rPr>
-          <w:rFonts w:ascii="Cambria Math" w:hAnsi="Cambria Math" w:eastAsia="Yu Gothic"/>
-        </w:rPr>
-        <w:t>μᵢ</w:t>
-      </w:r>
-      <w:r>
-        <w:rPr>
-          <w:rFonts w:ascii="Calibri" w:hAnsi="Calibri" w:eastAsia="Yu Gothic"/>
-        </w:rPr>
-        <w:t xml:space="preserve">、unmodeled load上界を </w:t>
-      </w:r>
-      <w:r>
-        <w:rPr>
-          <w:rFonts w:ascii="Cambria Math" w:hAnsi="Cambria Math" w:eastAsia="Yu Gothic"/>
-        </w:rPr>
-        <w:t>eᵢ</w:t>
-      </w:r>
-      <w:r>
-        <w:rPr>
-          <w:rFonts w:ascii="Calibri" w:hAnsi="Calibri" w:eastAsia="Yu Gothic"/>
-        </w:rPr>
-        <w:t xml:space="preserve"> と すれば、</w:t>
+        <w:t>rᵢ(e+ellᵢ)</w:t>
+      </w:r>
+      <w:r>
+        <w:rPr>
+          <w:rFonts w:ascii="Calibri" w:hAnsi="Calibri" w:eastAsia="Yu Gothic"/>
+        </w:rPr>
+        <w:t xml:space="preserve"> とすれば、三角不等式により</w:t>
       </w:r>
     </w:p>
     <w:p>
@@ -1593,6 +1635,414 @@
           <w:rFonts w:ascii="Cambria Math" w:hAnsi="Cambria Math"/>
           <w:sz w:val="21"/>
         </w:rPr>
+        <w:t>R_dir(e)=prodᵢ₌₁^mrᵢ(e+ellᵢ)</w:t>
+      </w:r>
+    </w:p>
+    <w:p>
+      <w:r>
+        <w:rPr>
+          <w:rFonts w:ascii="Calibri" w:hAnsi="Calibri" w:eastAsia="Yu Gothic"/>
+        </w:rPr>
+        <w:t xml:space="preserve">は全moduleが同時に符号安全集合へ残る方向別十分条件となる。平均・最小slackも 局所marginのsurvival積から計算でき、Cartesian productの明示列挙を要しない。 局所次元を </w:t>
+      </w:r>
+      <w:r>
+        <w:rPr>
+          <w:rFonts w:ascii="Cambria Math" w:hAnsi="Cambria Math" w:eastAsia="Yu Gothic"/>
+        </w:rPr>
+        <w:t>dᵢ</w:t>
+      </w:r>
+      <w:r>
+        <w:rPr>
+          <w:rFonts w:ascii="Calibri" w:hAnsi="Calibri" w:eastAsia="Yu Gothic"/>
+        </w:rPr>
+        <w:t xml:space="preserve">、最大値を </w:t>
+      </w:r>
+      <w:r>
+        <w:rPr>
+          <w:rFonts w:ascii="Cambria Math" w:hAnsi="Cambria Math" w:eastAsia="Yu Gothic"/>
+        </w:rPr>
+        <w:t>b</w:t>
+      </w:r>
+      <w:r>
+        <w:rPr>
+          <w:rFonts w:ascii="Calibri" w:hAnsi="Calibri" w:eastAsia="Yu Gothic"/>
+        </w:rPr>
+        <w:t xml:space="preserve"> とすれば、全系 </w:t>
+      </w:r>
+      <w:r>
+        <w:rPr>
+          <w:rFonts w:ascii="Cambria Math" w:hAnsi="Cambria Math" w:eastAsia="Yu Gothic"/>
+        </w:rPr>
+        <w:t>2^Σᵢ dᵢ</w:t>
+      </w:r>
+      <w:r>
+        <w:rPr>
+          <w:rFonts w:ascii="Calibri" w:hAnsi="Calibri" w:eastAsia="Yu Gothic"/>
+        </w:rPr>
+        <w:t xml:space="preserve"> orthantに 対し局所列挙量は</w:t>
+      </w:r>
+    </w:p>
+    <w:p>
+      <w:pPr>
+        <w:pStyle w:val="DisplayEquation"/>
+      </w:pPr>
+      <w:r>
+        <w:rPr>
+          <w:rFonts w:ascii="Cambria Math" w:hAnsi="Cambria Math"/>
+          <w:sz w:val="21"/>
+        </w:rPr>
+        <w:t>Σᵢ₌₁^m2ᵈᵢ≤ m2^b</w:t>
+      </w:r>
+    </w:p>
+    <w:p>
+      <w:r>
+        <w:rPr>
+          <w:rFonts w:ascii="Calibri" w:hAnsi="Calibri" w:eastAsia="Yu Gothic"/>
+        </w:rPr>
+        <w:t xml:space="preserve">である。従って </w:t>
+      </w:r>
+      <w:r>
+        <w:rPr>
+          <w:rFonts w:ascii="Cambria Math" w:hAnsi="Cambria Math" w:eastAsia="Yu Gothic"/>
+        </w:rPr>
+        <w:t>b</w:t>
+      </w:r>
+      <w:r>
+        <w:rPr>
+          <w:rFonts w:ascii="Calibri" w:hAnsi="Calibri" w:eastAsia="Yu Gothic"/>
+        </w:rPr>
+        <w:t xml:space="preserve"> が規模に依存せず、各moduleへの総流入 </w:t>
+      </w:r>
+      <w:r>
+        <w:rPr>
+          <w:rFonts w:ascii="Cambria Math" w:hAnsi="Cambria Math" w:eastAsia="Yu Gothic"/>
+        </w:rPr>
+        <w:t>ellᵢ</w:t>
+      </w:r>
+      <w:r>
+        <w:rPr>
+          <w:rFonts w:ascii="Calibri" w:hAnsi="Calibri" w:eastAsia="Yu Gothic"/>
+        </w:rPr>
+        <w:t xml:space="preserve"> が発散 しない場合、certificate抽出はmodule数に対して線形に保てる。ただし局所次元には 指数的であり、module分割の同定誤差も含まない。</w:t>
+      </w:r>
+    </w:p>
+    <w:p>
+      <w:r>
+        <w:rPr>
+          <w:rFonts w:ascii="Calibri" w:hAnsi="Calibri" w:eastAsia="Yu Gothic"/>
+        </w:rPr>
+        <w:t xml:space="preserve">未知partitionには対称affinity </w:t>
+      </w:r>
+      <w:r>
+        <w:rPr>
+          <w:rFonts w:ascii="Cambria Math" w:hAnsi="Cambria Math" w:eastAsia="Yu Gothic"/>
+        </w:rPr>
+        <w:t>Aᵤᵥ=max(|Wᵤᵥ|,|Wᵥᵤ|)</w:t>
+      </w:r>
+      <w:r>
+        <w:rPr>
+          <w:rFonts w:ascii="Calibri" w:hAnsi="Calibri" w:eastAsia="Yu Gothic"/>
+        </w:rPr>
+        <w:t xml:space="preserve"> を用いた。最小module内affinityが最大module間 affinityより大きく、その境界gapが全affinity隣接gapの中で一意に最大なら、最大gap 中点でthresholdした無向graphの連結成分は真のpartitionを回復する。これは強い 十分条件であり、一般のcommunity detection consistencyではない。</w:t>
+      </w:r>
+    </w:p>
+    <w:p>
+      <w:r>
+        <w:rPr>
+          <w:rFonts w:ascii="Calibri" w:hAnsi="Calibri" w:eastAsia="Yu Gothic"/>
+        </w:rPr>
+        <w:t xml:space="preserve">全pair affinityを重複を残して昇順に並べ、最大隣接gapを </w:t>
+      </w:r>
+      <w:r>
+        <w:rPr>
+          <w:rFonts w:ascii="Cambria Math" w:hAnsi="Cambria Math" w:eastAsia="Yu Gothic"/>
+        </w:rPr>
+        <w:t>g₁</w:t>
+      </w:r>
+      <w:r>
+        <w:rPr>
+          <w:rFonts w:ascii="Calibri" w:hAnsi="Calibri" w:eastAsia="Yu Gothic"/>
+        </w:rPr>
+        <w:t xml:space="preserve">、二番目を </w:t>
+      </w:r>
+      <w:r>
+        <w:rPr>
+          <w:rFonts w:ascii="Cambria Math" w:hAnsi="Cambria Math" w:eastAsia="Yu Gothic"/>
+        </w:rPr>
+        <w:t>g₂</w:t>
+      </w:r>
+      <w:r>
+        <w:rPr>
+          <w:rFonts w:ascii="Calibri" w:hAnsi="Calibri" w:eastAsia="Yu Gothic"/>
+        </w:rPr>
+        <w:t xml:space="preserve"> とする。重み摂動 </w:t>
+      </w:r>
+      <w:r>
+        <w:rPr>
+          <w:rFonts w:ascii="Cambria Math" w:hAnsi="Cambria Math" w:eastAsia="Yu Gothic"/>
+        </w:rPr>
+        <w:t>Delta W</w:t>
+      </w:r>
+      <w:r>
+        <w:rPr>
+          <w:rFonts w:ascii="Calibri" w:hAnsi="Calibri" w:eastAsia="Yu Gothic"/>
+        </w:rPr>
+        <w:t xml:space="preserve"> に対し各pair affinityの変化は </w:t>
+      </w:r>
+      <w:r>
+        <w:rPr>
+          <w:rFonts w:ascii="Cambria Math" w:hAnsi="Cambria Math" w:eastAsia="Yu Gothic"/>
+        </w:rPr>
+        <w:t>‖Delta W‖ₘₐₓ</w:t>
+      </w:r>
+      <w:r>
+        <w:rPr>
+          <w:rFonts w:ascii="Calibri" w:hAnsi="Calibri" w:eastAsia="Yu Gothic"/>
+        </w:rPr>
+        <w:t xml:space="preserve"> 以下である。順序統計量も同じ上限で変化するため、各隣接gapの変化はその2倍以下である。従って</w:t>
+      </w:r>
+    </w:p>
+    <w:p>
+      <w:pPr>
+        <w:pStyle w:val="DisplayEquation"/>
+      </w:pPr>
+      <w:r>
+        <w:rPr>
+          <w:rFonts w:ascii="Cambria Math" w:hAnsi="Cambria Math"/>
+          <w:sz w:val="21"/>
+        </w:rPr>
+        <w:t>r_edge=g₁/2, r_select=(g₁-g₂)/4,</w:t>
+      </w:r>
+    </w:p>
+    <w:p>
+      <w:pPr>
+        <w:pStyle w:val="DisplayEquation"/>
+      </w:pPr>
+      <w:r>
+        <w:rPr>
+          <w:rFonts w:ascii="Cambria Math" w:hAnsi="Cambria Math"/>
+          <w:sz w:val="21"/>
+        </w:rPr>
+        <w:t>rₚₐᵣₜ=min(r_edge,r_select)</w:t>
+      </w:r>
+    </w:p>
+    <w:p>
+      <w:r>
+        <w:rPr>
+          <w:rFonts w:ascii="Calibri" w:hAnsi="Calibri" w:eastAsia="Yu Gothic"/>
+        </w:rPr>
+        <w:t>とすれば、</w:t>
+      </w:r>
+      <w:r>
+        <w:rPr>
+          <w:rFonts w:ascii="Cambria Math" w:hAnsi="Cambria Math" w:eastAsia="Yu Gothic"/>
+        </w:rPr>
+        <w:t>‖Delta W‖ₘₐₓ&lt;rₚₐᵣₜ</w:t>
+      </w:r>
+      <w:r>
+        <w:rPr>
+          <w:rFonts w:ascii="Calibri" w:hAnsi="Calibri" w:eastAsia="Yu Gothic"/>
+        </w:rPr>
+        <w:t xml:space="preserve"> のときthreshold前後のedge集合と最大gapの選択が同時に保たれ、連結成分partitionは不変である。等号ではtieが生じ得るため保証しない。二partition間の差は、全unordered node pairの共所属判定が異なる割合 </w:t>
+      </w:r>
+      <w:r>
+        <w:rPr>
+          <w:rFonts w:ascii="Cambria Math" w:hAnsi="Cambria Math" w:eastAsia="Yu Gothic"/>
+        </w:rPr>
+        <w:t>dₚₐᵢᵣ</w:t>
+      </w:r>
+      <w:r>
+        <w:rPr>
+          <w:rFonts w:ascii="Calibri" w:hAnsi="Calibri" w:eastAsia="Yu Gothic"/>
+        </w:rPr>
+        <w:t xml:space="preserve"> でlabel-freeに測る。この半径は十分条件であり、半径外でpartitionが必ず変わることを意味しない。</w:t>
+      </w:r>
+    </w:p>
+    <w:p>
+      <w:pPr>
+        <w:pStyle w:val="Heading2"/>
+      </w:pPr>
+      <w:r>
+        <w:t>3.9 有界空間変調場と局所gate</w:t>
+      </w:r>
+    </w:p>
+    <w:p>
+      <w:r>
+        <w:rPr>
+          <w:rFonts w:ascii="Calibri" w:hAnsi="Calibri" w:eastAsia="Yu Gothic"/>
+        </w:rPr>
+        <w:t xml:space="preserve">nodeごとの変調状態を </w:t>
+      </w:r>
+      <w:r>
+        <w:rPr>
+          <w:rFonts w:ascii="Cambria Math" w:hAnsi="Cambria Math" w:eastAsia="Yu Gothic"/>
+        </w:rPr>
+        <w:t>zₜ∈[0,1]ⁿ</w:t>
+      </w:r>
+      <w:r>
+        <w:rPr>
+          <w:rFonts w:ascii="Calibri" w:hAnsi="Calibri" w:eastAsia="Yu Gothic"/>
+        </w:rPr>
+        <w:t xml:space="preserve">、sourceを </w:t>
+      </w:r>
+      <w:r>
+        <w:rPr>
+          <w:rFonts w:ascii="Cambria Math" w:hAnsi="Cambria Math" w:eastAsia="Yu Gothic"/>
+        </w:rPr>
+        <w:t>sₜ∈[0,1]ⁿ</w:t>
+      </w:r>
+      <w:r>
+        <w:rPr>
+          <w:rFonts w:ascii="Calibri" w:hAnsi="Calibri" w:eastAsia="Yu Gothic"/>
+        </w:rPr>
+        <w:t xml:space="preserve"> とし、</w:t>
+      </w:r>
+    </w:p>
+    <w:p>
+      <w:pPr>
+        <w:pStyle w:val="DisplayEquation"/>
+      </w:pPr>
+      <w:r>
+        <w:rPr>
+          <w:rFonts w:ascii="Cambria Math" w:hAnsi="Cambria Math"/>
+          <w:sz w:val="21"/>
+        </w:rPr>
+        <w:t>zₜ₊₁=(1-alpha-beta)zₜ+alpha Pzₜ+beta sₜ</w:t>
+      </w:r>
+    </w:p>
+    <w:p>
+      <w:r>
+        <w:rPr>
+          <w:rFonts w:ascii="Calibri" w:hAnsi="Calibri" w:eastAsia="Yu Gothic"/>
+        </w:rPr>
+        <w:t>とする。</w:t>
+      </w:r>
+      <w:r>
+        <w:rPr>
+          <w:rFonts w:ascii="Cambria Math" w:hAnsi="Cambria Math" w:eastAsia="Yu Gothic"/>
+        </w:rPr>
+        <w:t>P</w:t>
+      </w:r>
+      <w:r>
+        <w:rPr>
+          <w:rFonts w:ascii="Calibri" w:hAnsi="Calibri" w:eastAsia="Yu Gothic"/>
+        </w:rPr>
+        <w:t xml:space="preserve"> が非負row-stochastic、</w:t>
+      </w:r>
+      <w:r>
+        <w:rPr>
+          <w:rFonts w:ascii="Cambria Math" w:hAnsi="Cambria Math" w:eastAsia="Yu Gothic"/>
+        </w:rPr>
+        <w:t>alpha,beta≥0</w:t>
+      </w:r>
+      <w:r>
+        <w:rPr>
+          <w:rFonts w:ascii="Calibri" w:hAnsi="Calibri" w:eastAsia="Yu Gothic"/>
+        </w:rPr>
+        <w:t xml:space="preserve">、 </w:t>
+      </w:r>
+      <w:r>
+        <w:rPr>
+          <w:rFonts w:ascii="Cambria Math" w:hAnsi="Cambria Math" w:eastAsia="Yu Gothic"/>
+        </w:rPr>
+        <w:t>alpha+beta≤1</w:t>
+      </w:r>
+      <w:r>
+        <w:rPr>
+          <w:rFonts w:ascii="Calibri" w:hAnsi="Calibri" w:eastAsia="Yu Gothic"/>
+        </w:rPr>
+        <w:t xml:space="preserve"> なら右辺はhypercube内の点の凸結合であり、 </w:t>
+      </w:r>
+      <w:r>
+        <w:rPr>
+          <w:rFonts w:ascii="Cambria Math" w:hAnsi="Cambria Math" w:eastAsia="Yu Gothic"/>
+        </w:rPr>
+        <w:t>zₜ∈[0,1]ⁿ</w:t>
+      </w:r>
+      <w:r>
+        <w:rPr>
+          <w:rFonts w:ascii="Calibri" w:hAnsi="Calibri" w:eastAsia="Yu Gothic"/>
+        </w:rPr>
+        <w:t xml:space="preserve"> は正不変である。局所gateを </w:t>
+      </w:r>
+      <w:r>
+        <w:rPr>
+          <w:rFonts w:ascii="Cambria Math" w:hAnsi="Cambria Math" w:eastAsia="Yu Gothic"/>
+        </w:rPr>
+        <w:t>gₜ=1-zₜ</w:t>
+      </w:r>
+      <w:r>
+        <w:rPr>
+          <w:rFonts w:ascii="Calibri" w:hAnsi="Calibri" w:eastAsia="Yu Gothic"/>
+        </w:rPr>
+        <w:t xml:space="preserve"> とし、 reserve-to-core行列 </w:t>
+      </w:r>
+      <w:r>
+        <w:rPr>
+          <w:rFonts w:ascii="Cambria Math" w:hAnsi="Cambria Math" w:eastAsia="Yu Gothic"/>
+        </w:rPr>
+        <w:t>G</w:t>
+      </w:r>
+      <w:r>
+        <w:rPr>
+          <w:rFonts w:ascii="Calibri" w:hAnsi="Calibri" w:eastAsia="Yu Gothic"/>
+        </w:rPr>
+        <w:t xml:space="preserve"> の受信行だけを </w:t>
+      </w:r>
+      <w:r>
+        <w:rPr>
+          <w:rFonts w:ascii="Cambria Math" w:hAnsi="Cambria Math" w:eastAsia="Yu Gothic"/>
+        </w:rPr>
+        <w:t>D(gₜ)G</w:t>
+      </w:r>
+      <w:r>
+        <w:rPr>
+          <w:rFonts w:ascii="Calibri" w:hAnsi="Calibri" w:eastAsia="Yu Gothic"/>
+        </w:rPr>
+        <w:t xml:space="preserve"> に置き換える。</w:t>
+      </w:r>
+    </w:p>
+    <w:p>
+      <w:r>
+        <w:rPr>
+          <w:rFonts w:ascii="Calibri" w:hAnsi="Calibri" w:eastAsia="Yu Gothic"/>
+        </w:rPr>
+        <w:t xml:space="preserve">各core座標の双安定安全marginを </w:t>
+      </w:r>
+      <w:r>
+        <w:rPr>
+          <w:rFonts w:ascii="Cambria Math" w:hAnsi="Cambria Math" w:eastAsia="Yu Gothic"/>
+        </w:rPr>
+        <w:t>μᵢ</w:t>
+      </w:r>
+      <w:r>
+        <w:rPr>
+          <w:rFonts w:ascii="Calibri" w:hAnsi="Calibri" w:eastAsia="Yu Gothic"/>
+        </w:rPr>
+        <w:t xml:space="preserve">、unmodeled load上界を </w:t>
+      </w:r>
+      <w:r>
+        <w:rPr>
+          <w:rFonts w:ascii="Cambria Math" w:hAnsi="Cambria Math" w:eastAsia="Yu Gothic"/>
+        </w:rPr>
+        <w:t>eᵢ</w:t>
+      </w:r>
+      <w:r>
+        <w:rPr>
+          <w:rFonts w:ascii="Calibri" w:hAnsi="Calibri" w:eastAsia="Yu Gothic"/>
+        </w:rPr>
+        <w:t xml:space="preserve"> と すれば、</w:t>
+      </w:r>
+    </w:p>
+    <w:p>
+      <w:pPr>
+        <w:pStyle w:val="DisplayEquation"/>
+      </w:pPr>
+      <w:r>
+        <w:rPr>
+          <w:rFonts w:ascii="Cambria Math" w:hAnsi="Cambria Math"/>
+          <w:sz w:val="21"/>
+        </w:rPr>
         <w:t>supₜ( |[D(gₜ)G rₜ]ᵢ|+eᵢ )≤μᵢ</w:t>
       </w:r>
     </w:p>
@@ -1756,6 +2206,26 @@
           <w:rFonts w:ascii="Calibri" w:hAnsi="Calibri" w:eastAsia="Yu Gothic"/>
         </w:rPr>
         <w:t>EXP-2026-016では、pilot seed 2001–2010の2+2・2+3 moduleを用いて3予測器をfitし、係数・標準化統計・ridge penaltyをartifactへ固定した。pilot結果観測後、confirmation MAE 0.03以下、Spearman 0.75以上、global minus componentおよびproduct-only minus component MAEのbootstrap区間下限0.01、0.002以上を固定した。確認task前にseed 2101–2130の3+5 moduleについて、各internal gain・cross strength群が30絶対値構造class、非対称、双方向かつ正cross normであることを監査した。その後は再fitせず、未使用30 seedの960点を一度だけ評価した。</w:t>
+      </w:r>
+    </w:p>
+    <w:p>
+      <w:r>
+        <w:rPr>
+          <w:rFonts w:ascii="Calibri" w:hAnsi="Calibri" w:eastAsia="Yu Gothic"/>
+        </w:rPr>
+        <w:t>EXP-2026-017では、TDD中にtask値へ触れた2201–2230をdevelopment専用へ降格し、判定観測前にconfirmation集合を2301–2330へ置換した。確認familyは座標順をseed依存に並べ替えた2+2+3 moduleである。task前の構造gateで全240 networkの一意affinity gap、真のpartitionとの完全一致、絶対値構造重複なし、非対称内部block、全module pairの双方向bridgeを確認した。EXP-2026-016の固定model、family、grid、12判定を変更せず、960点を一度だけ評価した。</w:t>
+      </w:r>
+    </w:p>
+    <w:p>
+      <w:pPr>
+        <w:pStyle w:val="Reproducibility"/>
+        <w:jc w:val="left"/>
+      </w:pPr>
+      <w:r>
+        <w:rPr>
+          <w:rFonts w:ascii="Calibri" w:hAnsi="Calibri" w:eastAsia="Yu Gothic"/>
+        </w:rPr>
+        <w:t>EXP-2026-018は分割曖昧性だけを扱い、task、方向別load不均衡、module数、readoutを同時に変えなかった。Development seed 2401–2430で実装と識別性を確認後、source/test manifestを固定し、未使用confirmation seed 2501–2530を一度だけ評価した。各phaseは180 base network、8個の固定摂動方向、相対振幅0、0.25、0.50、0.90、1.10、2.0、4.0の10,080構造条件からなる。</w:t>
       </w:r>
     </w:p>
     <w:p>
@@ -2497,11 +2967,24 @@
       </w:r>
     </w:p>
     <w:p>
-      <w:pPr>
-        <w:pStyle w:val="Heading2"/>
-      </w:pPr>
-      <w:r>
-        <w:t>4.3 固定点探索と符号記憶task</w:t>
+      <w:r>
+        <w:rPr>
+          <w:rFonts w:ascii="Calibri" w:hAnsi="Calibri" w:eastAsia="Yu Gothic"/>
+        </w:rPr>
+        <w:t xml:space="preserve">EXP-2026-017の </w:t>
+      </w:r>
+      <w:r>
+        <w:rPr>
+          <w:rFonts w:ascii="Consolas" w:hAnsi="Consolas" w:eastAsia="Yu Gothic"/>
+          <w:sz w:val="19"/>
+        </w:rPr>
+        <w:t>multicomponent_modular</w:t>
+      </w:r>
+      <w:r>
+        <w:rPr>
+          <w:rFonts w:ascii="Calibri" w:hAnsi="Calibri" w:eastAsia="Yu Gothic"/>
+        </w:rPr>
+        <w:t xml:space="preserve"> familyは2+2+3 nodeで、同じinternal gain、最大総流入bridge strength、外乱budgetを用いた。全module内部を非対称、全正strengthのmodule pairを双方向かつ非転置とし、観測前に全座標をpermutationした。Generatorはmodule内最小affinityがmodule間最大affinityを上回る一意gapを明示的に持つ。真のpartitionは構造gateだけに用い、profile抽出器には渡さなかった。</w:t>
       </w:r>
     </w:p>
     <w:p>
@@ -2509,83 +2992,7 @@
         <w:rPr>
           <w:rFonts w:ascii="Calibri" w:hAnsi="Calibri" w:eastAsia="Yu Gothic"/>
         </w:rPr>
-        <w:t xml:space="preserve">全16 orthantについて初期状態 </w:t>
-      </w:r>
-      <w:r>
-        <w:rPr>
-          <w:rFonts w:ascii="Cambria Math" w:hAnsi="Cambria Math" w:eastAsia="Yu Gothic"/>
-        </w:rPr>
-        <w:t>0.9s</w:t>
-      </w:r>
-      <w:r>
-        <w:rPr>
-          <w:rFonts w:ascii="Calibri" w:hAnsi="Calibri" w:eastAsia="Yu Gothic"/>
-        </w:rPr>
-        <w:t xml:space="preserve"> から自律系を500 step発展させ、最終残差 </w:t>
-      </w:r>
-      <w:r>
-        <w:rPr>
-          <w:rFonts w:ascii="Cambria Math" w:hAnsi="Cambria Math" w:eastAsia="Yu Gothic"/>
-        </w:rPr>
-        <w:t>10⁻⁹</w:t>
-      </w:r>
-      <w:r>
-        <w:rPr>
-          <w:rFonts w:ascii="Calibri" w:hAnsi="Calibri" w:eastAsia="Yu Gothic"/>
-        </w:rPr>
-        <w:t xml:space="preserve"> 以下かつ全時刻で符号を保つ場合に固定点を発見したとした。各固定点を4-bit符号記憶とみなした。</w:t>
-      </w:r>
-    </w:p>
-    <w:p>
-      <w:r>
-        <w:rPr>
-          <w:rFonts w:ascii="Calibri" w:hAnsi="Calibri" w:eastAsia="Yu Gothic"/>
-        </w:rPr>
-        <w:t xml:space="preserve">外乱方向 </w:t>
-      </w:r>
-      <w:r>
-        <w:rPr>
-          <w:rFonts w:ascii="Cambria Math" w:hAnsi="Cambria Math" w:eastAsia="Yu Gothic"/>
-        </w:rPr>
-        <w:t>d∈-1,1⁴</w:t>
-      </w:r>
-      <w:r>
-        <w:rPr>
-          <w:rFonts w:ascii="Calibri" w:hAnsi="Calibri" w:eastAsia="Yu Gothic"/>
-        </w:rPr>
-        <w:t xml:space="preserve"> の全16 cornerを列挙し、</w:t>
-      </w:r>
-      <w:r>
-        <w:rPr>
-          <w:rFonts w:ascii="Cambria Math" w:hAnsi="Cambria Math" w:eastAsia="Yu Gothic"/>
-        </w:rPr>
-        <w:t>η=ed</w:t>
-      </w:r>
-      <w:r>
-        <w:rPr>
-          <w:rFonts w:ascii="Calibri" w:hAnsi="Calibri" w:eastAsia="Yu Gothic"/>
-        </w:rPr>
-        <w:t xml:space="preserve"> を100 step一定に印加した。全時刻で元のorthant符号を保てば成功とした。一network・一外乱強度あたり256 challengeであり、EXP-2026-010とEXP-2026-011の各confirmation総数は122,880、EXP-2026-012は30,720、EXP-2026-014は368,640だった。</w:t>
-      </w:r>
-    </w:p>
-    <w:p>
-      <w:r>
-        <w:rPr>
-          <w:rFonts w:ascii="Calibri" w:hAnsi="Calibri" w:eastAsia="Yu Gothic"/>
-        </w:rPr>
-        <w:t xml:space="preserve">EXP-2026-016はdimensionに依存しない4個の符号相対方向codeを80 step印加した。各moduleの全符号orthantから500 stepで固定点を求め、結合系の同時符号保持を成功とした。Confirmationは960点、983,040 challengeである。これは全 </w:t>
-      </w:r>
-      <w:r>
-        <w:rPr>
-          <w:rFonts w:ascii="Cambria Math" w:hAnsi="Cambria Math" w:eastAsia="Yu Gothic"/>
-        </w:rPr>
-        <w:t>2ᵈ</w:t>
-      </w:r>
-      <w:r>
-        <w:rPr>
-          <w:rFonts w:ascii="Calibri" w:hAnsi="Calibri" w:eastAsia="Yu Gothic"/>
-        </w:rPr>
-        <w:t xml:space="preserve"> corner分布ではなく、零結合時のcode別積則を厳密に保つ整列taskである。</w:t>
+        <w:t>EXP-2026-018は同じ2+2+3 generatorのbridge strength 0.01、0.02、0.04を用いた。Base重みごとに保証半径を計算し、対角を保った独立一様な非対角entry方向をseedで固定したうえで振幅だけを半径倍率に従って変えた。同じbase・方向では摂動方向を共通化した。生成時partitionは構造監査だけに用いた。</w:t>
       </w:r>
     </w:p>
     <w:p>
@@ -2593,7 +3000,7 @@
         <w:pStyle w:val="Heading2"/>
       </w:pPr>
       <w:r>
-        <w:t>4.4 Predictorとbaseline</w:t>
+        <w:t>4.3 固定点探索と符号記憶task</w:t>
       </w:r>
     </w:p>
     <w:p>
@@ -2601,19 +3008,31 @@
         <w:rPr>
           <w:rFonts w:ascii="Calibri" w:hAnsi="Calibri" w:eastAsia="Yu Gothic"/>
         </w:rPr>
-        <w:t xml:space="preserve">EXP-2026-010ではfamilyごとにdiscovery 120条件で切片付き単回帰をfitし、confirmation 120条件へ係数を固定して適用した。主要featureは平均margin </w:t>
+        <w:t xml:space="preserve">全16 orthantについて初期状態 </w:t>
       </w:r>
       <w:r>
         <w:rPr>
           <w:rFonts w:ascii="Cambria Math" w:hAnsi="Cambria Math" w:eastAsia="Yu Gothic"/>
         </w:rPr>
-        <w:t>μ̄</w:t>
-      </w:r>
-      <w:r>
-        <w:rPr>
-          <w:rFonts w:ascii="Calibri" w:hAnsi="Calibri" w:eastAsia="Yu Gothic"/>
-        </w:rPr>
-        <w:t xml:space="preserve"> である。Baselineはraw attractor count、coupling gain、off-diagonal infinity norm、全固定点にわたるworst local Jacobian infinity norm、minimum signed fixed-point coordinate、nonnormality commutator normとした。</w:t>
+        <w:t>0.9s</w:t>
+      </w:r>
+      <w:r>
+        <w:rPr>
+          <w:rFonts w:ascii="Calibri" w:hAnsi="Calibri" w:eastAsia="Yu Gothic"/>
+        </w:rPr>
+        <w:t xml:space="preserve"> から自律系を500 step発展させ、最終残差 </w:t>
+      </w:r>
+      <w:r>
+        <w:rPr>
+          <w:rFonts w:ascii="Cambria Math" w:hAnsi="Cambria Math" w:eastAsia="Yu Gothic"/>
+        </w:rPr>
+        <w:t>10⁻⁹</w:t>
+      </w:r>
+      <w:r>
+        <w:rPr>
+          <w:rFonts w:ascii="Calibri" w:hAnsi="Calibri" w:eastAsia="Yu Gothic"/>
+        </w:rPr>
+        <w:t xml:space="preserve"> 以下かつ全時刻で符号を保つ場合に固定点を発見したとした。各固定点を4-bit符号記憶とみなした。</w:t>
       </w:r>
     </w:p>
     <w:p>
@@ -2621,43 +3040,31 @@
         <w:rPr>
           <w:rFonts w:ascii="Calibri" w:hAnsi="Calibri" w:eastAsia="Yu Gothic"/>
         </w:rPr>
-        <w:t xml:space="preserve">EXP-2026-011ではfamily名をfeatureへ入れず、held-out familyのtask保持率をfitから 完全に除外した。各featureを学習fold内で標準化し、切片を罰しないridge回帰 （penalty </w:t>
+        <w:t xml:space="preserve">外乱方向 </w:t>
       </w:r>
       <w:r>
         <w:rPr>
           <w:rFonts w:ascii="Cambria Math" w:hAnsi="Cambria Math" w:eastAsia="Yu Gothic"/>
         </w:rPr>
-        <w:t>10⁻³</w:t>
-      </w:r>
-      <w:r>
-        <w:rPr>
-          <w:rFonts w:ascii="Calibri" w:hAnsi="Calibri" w:eastAsia="Yu Gothic"/>
-        </w:rPr>
-        <w:t xml:space="preserve">）をfitした。選択modelのfeatureは </w:t>
+        <w:t>d∈-1,1⁴</w:t>
+      </w:r>
+      <w:r>
+        <w:rPr>
+          <w:rFonts w:ascii="Calibri" w:hAnsi="Calibri" w:eastAsia="Yu Gothic"/>
+        </w:rPr>
+        <w:t xml:space="preserve"> の全16 cornerを列挙し、</w:t>
       </w:r>
       <w:r>
         <w:rPr>
           <w:rFonts w:ascii="Cambria Math" w:hAnsi="Cambria Math" w:eastAsia="Yu Gothic"/>
         </w:rPr>
-        <w:t>μ̄/e</w:t>
-      </w:r>
-      <w:r>
-        <w:rPr>
-          <w:rFonts w:ascii="Calibri" w:hAnsi="Calibri" w:eastAsia="Yu Gothic"/>
-        </w:rPr>
-        <w:t xml:space="preserve"> とcertified robust fractionである。Primary baselineはraw countと、 normalized coupling、normalized off-diagonal norm、local Jacobian、minimum coordinate、nonnormalityからなる5-feature structural modelとした。 Normalized margin単独はsecondary baselineである。全予測を保持率の定義域 </w:t>
-      </w:r>
-      <w:r>
-        <w:rPr>
-          <w:rFonts w:ascii="Cambria Math" w:hAnsi="Cambria Math" w:eastAsia="Yu Gothic"/>
-        </w:rPr>
-        <w:t>[0,1]</w:t>
-      </w:r>
-      <w:r>
-        <w:rPr>
-          <w:rFonts w:ascii="Calibri" w:hAnsi="Calibri" w:eastAsia="Yu Gothic"/>
-        </w:rPr>
-        <w:t xml:space="preserve"> へclipした。</w:t>
+        <w:t>η=ed</w:t>
+      </w:r>
+      <w:r>
+        <w:rPr>
+          <w:rFonts w:ascii="Calibri" w:hAnsi="Calibri" w:eastAsia="Yu Gothic"/>
+        </w:rPr>
+        <w:t xml:space="preserve"> を100 step一定に印加した。全時刻で元のorthant符号を保てば成功とした。一network・一外乱強度あたり256 challengeであり、EXP-2026-010とEXP-2026-011の各confirmation総数は122,880、EXP-2026-012は30,720、EXP-2026-014は368,640だった。</w:t>
       </w:r>
     </w:p>
     <w:p>
@@ -2665,7 +3072,19 @@
         <w:rPr>
           <w:rFonts w:ascii="Calibri" w:hAnsi="Calibri" w:eastAsia="Yu Gothic"/>
         </w:rPr>
-        <w:t>EXP-2026-012ではrobust pairを既知4 familyの全60 seedでfitし、外部familyへ適用した。学習family集合と評価family集合、学習seed集合と評価seed集合がそれぞれ交わらないことを評価器で検査した。Baselineとclip規約はEXP-2026-011から変更していない。</w:t>
+        <w:t xml:space="preserve">EXP-2026-016はdimensionに依存しない4個の符号相対方向codeを80 step印加した。各moduleの全符号orthantから500 stepで固定点を求め、結合系の同時符号保持を成功とした。Confirmationは960点、983,040 challengeである。これは全 </w:t>
+      </w:r>
+      <w:r>
+        <w:rPr>
+          <w:rFonts w:ascii="Cambria Math" w:hAnsi="Cambria Math" w:eastAsia="Yu Gothic"/>
+        </w:rPr>
+        <w:t>2ᵈ</w:t>
+      </w:r>
+      <w:r>
+        <w:rPr>
+          <w:rFonts w:ascii="Calibri" w:hAnsi="Calibri" w:eastAsia="Yu Gothic"/>
+        </w:rPr>
+        <w:t xml:space="preserve"> corner分布ではなく、零結合時のcode別積則を厳密に保つ整列taskである。</w:t>
       </w:r>
     </w:p>
     <w:p>
@@ -2673,19 +3092,7 @@
         <w:rPr>
           <w:rFonts w:ascii="Calibri" w:hAnsi="Calibri" w:eastAsia="Yu Gothic"/>
         </w:rPr>
-        <w:t xml:space="preserve">EXP-2026-016のglobal modelはdimension、raw attractor fraction、global certificate fraction、mean margin、全非対角infinity norm、normalized nonnormality、最大bridge normの7 featureを用いた。Component-aware modelはこれにisolated task積、component certificate積、directionalおよびtransported certificate率、方向別slackの平均・最小、load imbalance、size imbalanceの8 featureを加えた。Product-only modelはisolated task積だけを用いた。全modelは標準化ridge（penalty </w:t>
-      </w:r>
-      <w:r>
-        <w:rPr>
-          <w:rFonts w:ascii="Cambria Math" w:hAnsi="Cambria Math" w:eastAsia="Yu Gothic"/>
-        </w:rPr>
-        <w:t>10⁻³</w:t>
-      </w:r>
-      <w:r>
-        <w:rPr>
-          <w:rFonts w:ascii="Calibri" w:hAnsi="Calibri" w:eastAsia="Yu Gothic"/>
-        </w:rPr>
-        <w:t>）で、pilot後の係数をconfirmationへ固定した。</w:t>
+        <w:t>EXP-2026-017も同じ4 codeと80 stepを用い、非連続な推定座標indexごとに局所taskを評価した。Confirmationは960点、491,520 challengeである。Certificate監査では全128 orthantを列挙したが、因子化profileは各moduleの4、4、8 orthant、合計16だけから計算した。</w:t>
       </w:r>
     </w:p>
     <w:p>
@@ -2693,7 +3100,7 @@
         <w:pStyle w:val="Heading2"/>
       </w:pPr>
       <w:r>
-        <w:t>4.5 統計と事前判定</w:t>
+        <w:t>4.4 Predictorとbaseline</w:t>
       </w:r>
     </w:p>
     <w:p>
@@ -2701,7 +3108,19 @@
         <w:rPr>
           <w:rFonts w:ascii="Calibri" w:hAnsi="Calibri" w:eastAsia="Yu Gothic"/>
         </w:rPr>
-        <w:t>Family別にSpearman順位相関とMAEを算出した。誤差差は同じseedの4 family・各4 gainを平均して一標本とし、30 seedを2,000回percentile bootstrapして95%区間を求めた。</w:t>
+        <w:t xml:space="preserve">EXP-2026-010ではfamilyごとにdiscovery 120条件で切片付き単回帰をfitし、confirmation 120条件へ係数を固定して適用した。主要featureは平均margin </w:t>
+      </w:r>
+      <w:r>
+        <w:rPr>
+          <w:rFonts w:ascii="Cambria Math" w:hAnsi="Cambria Math" w:eastAsia="Yu Gothic"/>
+        </w:rPr>
+        <w:t>μ̄</w:t>
+      </w:r>
+      <w:r>
+        <w:rPr>
+          <w:rFonts w:ascii="Calibri" w:hAnsi="Calibri" w:eastAsia="Yu Gothic"/>
+        </w:rPr>
+        <w:t xml:space="preserve"> である。Baselineはraw attractor count、coupling gain、off-diagonal infinity norm、全固定点にわたるworst local Jacobian infinity norm、minimum signed fixed-point coordinate、nonnormality commutator normとした。</w:t>
       </w:r>
     </w:p>
     <w:p>
@@ -2709,7 +3128,43 @@
         <w:rPr>
           <w:rFonts w:ascii="Calibri" w:hAnsi="Calibri" w:eastAsia="Yu Gothic"/>
         </w:rPr>
-        <w:t>EXP-2026-010の事前判定は、confirmation全480 networkでraw count 16、certificate下界違反0、4 familyすべてでmean marginとtask retentionのSpearmanが0.75超、pooled raw-count MAE minus margin MAEの95%区間下限が0超、の4項目である。Couplingとlocal Jacobianに対する誤差差はsecondary endpointとして事前に固定した。</w:t>
+        <w:t xml:space="preserve">EXP-2026-011ではfamily名をfeatureへ入れず、held-out familyのtask保持率をfitから 完全に除外した。各featureを学習fold内で標準化し、切片を罰しないridge回帰 （penalty </w:t>
+      </w:r>
+      <w:r>
+        <w:rPr>
+          <w:rFonts w:ascii="Cambria Math" w:hAnsi="Cambria Math" w:eastAsia="Yu Gothic"/>
+        </w:rPr>
+        <w:t>10⁻³</w:t>
+      </w:r>
+      <w:r>
+        <w:rPr>
+          <w:rFonts w:ascii="Calibri" w:hAnsi="Calibri" w:eastAsia="Yu Gothic"/>
+        </w:rPr>
+        <w:t xml:space="preserve">）をfitした。選択modelのfeatureは </w:t>
+      </w:r>
+      <w:r>
+        <w:rPr>
+          <w:rFonts w:ascii="Cambria Math" w:hAnsi="Cambria Math" w:eastAsia="Yu Gothic"/>
+        </w:rPr>
+        <w:t>μ̄/e</w:t>
+      </w:r>
+      <w:r>
+        <w:rPr>
+          <w:rFonts w:ascii="Calibri" w:hAnsi="Calibri" w:eastAsia="Yu Gothic"/>
+        </w:rPr>
+        <w:t xml:space="preserve"> とcertified robust fractionである。Primary baselineはraw countと、 normalized coupling、normalized off-diagonal norm、local Jacobian、minimum coordinate、nonnormalityからなる5-feature structural modelとした。 Normalized margin単独はsecondary baselineである。全予測を保持率の定義域 </w:t>
+      </w:r>
+      <w:r>
+        <w:rPr>
+          <w:rFonts w:ascii="Cambria Math" w:hAnsi="Cambria Math" w:eastAsia="Yu Gothic"/>
+        </w:rPr>
+        <w:t>[0,1]</w:t>
+      </w:r>
+      <w:r>
+        <w:rPr>
+          <w:rFonts w:ascii="Calibri" w:hAnsi="Calibri" w:eastAsia="Yu Gothic"/>
+        </w:rPr>
+        <w:t xml:space="preserve"> へclipした。</w:t>
       </w:r>
     </w:p>
     <w:p>
@@ -2717,7 +3172,7 @@
         <w:rPr>
           <w:rFonts w:ascii="Calibri" w:hAnsi="Calibri" w:eastAsia="Yu Gothic"/>
         </w:rPr>
-        <w:t>EXP-2026-011では各confirmation seedの4 family・4 gainを平均して一標本とした paired誤差差を用いた。事前判定は、raw count 16、certificate違反0、全familyで robust-pair予測とのSpearman 0.75超、raw-count MAE minus robust-pair MAEの 95%区間下限0超、structural MAE minus robust-pair MAEの区間下限0超、の5項目 である。確認seedを観測する前にsource/test manifestを固定した。</w:t>
+        <w:t>EXP-2026-012ではrobust pairを既知4 familyの全60 seedでfitし、外部familyへ適用した。学習family集合と評価family集合、学習seed集合と評価seed集合がそれぞれ交わらないことを評価器で検査した。Baselineとclip規約はEXP-2026-011から変更していない。</w:t>
       </w:r>
     </w:p>
     <w:p>
@@ -2725,6 +3180,74 @@
         <w:rPr>
           <w:rFonts w:ascii="Calibri" w:hAnsi="Calibri" w:eastAsia="Yu Gothic"/>
         </w:rPr>
+        <w:t xml:space="preserve">EXP-2026-016のglobal modelはdimension、raw attractor fraction、global certificate fraction、mean margin、全非対角infinity norm、normalized nonnormality、最大bridge normの7 featureを用いた。Component-aware modelはこれにisolated task積、component certificate積、directionalおよびtransported certificate率、方向別slackの平均・最小、load imbalance、size imbalanceの8 featureを加えた。Product-only modelはisolated task積だけを用いた。全modelは標準化ridge（penalty </w:t>
+      </w:r>
+      <w:r>
+        <w:rPr>
+          <w:rFonts w:ascii="Cambria Math" w:hAnsi="Cambria Math" w:eastAsia="Yu Gothic"/>
+        </w:rPr>
+        <w:t>10⁻³</w:t>
+      </w:r>
+      <w:r>
+        <w:rPr>
+          <w:rFonts w:ascii="Calibri" w:hAnsi="Calibri" w:eastAsia="Yu Gothic"/>
+        </w:rPr>
+        <w:t>）で、pilot後の係数をconfirmationへ固定した。</w:t>
+      </w:r>
+    </w:p>
+    <w:p>
+      <w:r>
+        <w:rPr>
+          <w:rFonts w:ascii="Calibri" w:hAnsi="Calibri" w:eastAsia="Yu Gothic"/>
+        </w:rPr>
+        <w:t>EXP-2026-017は上記三modelの係数、標準化統計、feature名を変更しなかった。三module値はisolated task/certificateの積、最大総流入load、loadとsizeの対称imbalance、survival積による平均・最小slackとして集約した。Oracle partitionは保証監査だけに用い、推定partitionとのfeature・予測一致を検査した。</w:t>
+      </w:r>
+    </w:p>
+    <w:p>
+      <w:pPr>
+        <w:pStyle w:val="Heading2"/>
+      </w:pPr>
+      <w:r>
+        <w:t>4.5 統計と事前判定</w:t>
+      </w:r>
+    </w:p>
+    <w:p>
+      <w:r>
+        <w:rPr>
+          <w:rFonts w:ascii="Calibri" w:hAnsi="Calibri" w:eastAsia="Yu Gothic"/>
+        </w:rPr>
+        <w:t>Family別にSpearman順位相関とMAEを算出した。誤差差は同じseedの4 family・各4 gainを平均して一標本とし、30 seedを2,000回percentile bootstrapして95%区間を求めた。</w:t>
+      </w:r>
+    </w:p>
+    <w:p>
+      <w:r>
+        <w:rPr>
+          <w:rFonts w:ascii="Calibri" w:hAnsi="Calibri" w:eastAsia="Yu Gothic"/>
+        </w:rPr>
+        <w:t>EXP-2026-010の事前判定は、confirmation全480 networkでraw count 16、certificate下界違反0、4 familyすべてでmean marginとtask retentionのSpearmanが0.75超、pooled raw-count MAE minus margin MAEの95%区間下限が0超、の4項目である。Couplingとlocal Jacobianに対する誤差差はsecondary endpointとして事前に固定した。</w:t>
+      </w:r>
+    </w:p>
+    <w:p>
+      <w:pPr>
+        <w:pStyle w:val="Reproducibility"/>
+        <w:jc w:val="left"/>
+      </w:pPr>
+      <w:r>
+        <w:rPr>
+          <w:rFonts w:ascii="Calibri" w:hAnsi="Calibri" w:eastAsia="Yu Gothic"/>
+        </w:rPr>
+        <w:t>実験EXP-2026-011では各confirmation seedの4 family・4 gainを平均して一標本とした paired誤差差を用いた。事前判定は、raw count 16、certificate違反0、全familyで robust-pair予測とのSpearman 0.75超、raw-count MAE minus robust-pair MAEの 95%区間下限0超、structural MAE minus robust-pair MAEの区間下限0超、の5項目 である。確認seedを観測する前にsource/test manifestを固定した。</w:t>
+      </w:r>
+    </w:p>
+    <w:p>
+      <w:pPr>
+        <w:pStyle w:val="Reproducibility"/>
+        <w:jc w:val="left"/>
+      </w:pPr>
+      <w:r>
+        <w:rPr>
+          <w:rFonts w:ascii="Calibri" w:hAnsi="Calibri" w:eastAsia="Yu Gothic"/>
+        </w:rPr>
         <w:t xml:space="preserve">EXP-2026-012も同じ5判定を用いたが、family別ではなく第五family全120点のSpearmanを用いた。各seedの4 gainを一標本とする2,000回paired bootstrapを事前登録した。Source/test manifest SHA-256は </w:t>
       </w:r>
       <w:r>
@@ -2742,11 +3265,15 @@
       </w:r>
     </w:p>
     <w:p>
-      <w:r>
-        <w:rPr>
-          <w:rFonts w:ascii="Calibri" w:hAnsi="Calibri" w:eastAsia="Yu Gothic"/>
-        </w:rPr>
-        <w:t xml:space="preserve">EXP-2026-013は予測modelをfitせず、構造gate、固定点数の積、component box不変性、global common-boundary certificateの保守性、全corner task保持率の積、component certificate下界の6判定をtolerance </w:t>
+      <w:pPr>
+        <w:pStyle w:val="Reproducibility"/>
+        <w:jc w:val="left"/>
+      </w:pPr>
+      <w:r>
+        <w:rPr>
+          <w:rFonts w:ascii="Calibri" w:hAnsi="Calibri" w:eastAsia="Yu Gothic"/>
+        </w:rPr>
+        <w:t xml:space="preserve">実験EXP-2026-013は予測modelをfitせず、構造gate、固定点数の積、component box不変性、global common-boundary certificateの保守性、全corner task保持率の積、component certificate下界の6判定をtolerance </w:t>
       </w:r>
       <w:r>
         <w:rPr>
@@ -2775,6 +3302,10 @@
       </w:r>
     </w:p>
     <w:p>
+      <w:pPr>
+        <w:pStyle w:val="Reproducibility"/>
+        <w:jc w:val="left"/>
+      </w:pPr>
       <w:r>
         <w:rPr>
           <w:rFonts w:ascii="Calibri" w:hAnsi="Calibri" w:eastAsia="Yu Gothic"/>
@@ -2796,6 +3327,10 @@
       </w:r>
     </w:p>
     <w:p>
+      <w:pPr>
+        <w:pStyle w:val="Reproducibility"/>
+        <w:jc w:val="left"/>
+      </w:pPr>
       <w:r>
         <w:rPr>
           <w:rFonts w:ascii="Calibri" w:hAnsi="Calibri" w:eastAsia="Yu Gothic"/>
@@ -2817,6 +3352,10 @@
       </w:r>
     </w:p>
     <w:p>
+      <w:pPr>
+        <w:pStyle w:val="Reproducibility"/>
+        <w:jc w:val="left"/>
+      </w:pPr>
       <w:r>
         <w:rPr>
           <w:rFonts w:ascii="Calibri" w:hAnsi="Calibri" w:eastAsia="Yu Gothic"/>
@@ -2842,6 +3381,60 @@
           <w:sz w:val="19"/>
         </w:rPr>
         <w:t>db0b50a648fb085ca687922a531fab5482af2a134bd01eefc3efe3dd85675a01</w:t>
+      </w:r>
+      <w:r>
+        <w:rPr>
+          <w:rFonts w:ascii="Calibri" w:hAnsi="Calibri" w:eastAsia="Yu Gothic"/>
+        </w:rPr>
+        <w:t xml:space="preserve"> である。</w:t>
+      </w:r>
+    </w:p>
+    <w:p>
+      <w:r>
+        <w:rPr>
+          <w:rFonts w:ascii="Calibri" w:hAnsi="Calibri" w:eastAsia="Yu Gothic"/>
+        </w:rPr>
+        <w:t>EXP-2026-017は分割回復、oracle–inferred同値、零結合task積則、因子化certificateの直積列挙一致、transported下界、certificate chain、feature有限性、局所16対全系128の計算量削減を8理論・構造判定とした。経験判定はcomponent MAE 0.05以下、Spearman 0.60以上、global minus componentおよびproduct-only minus component MAEのseed bootstrap 10,000回区間下限0.005、0以上である。</w:t>
+      </w:r>
+    </w:p>
+    <w:p>
+      <w:r>
+        <w:rPr>
+          <w:rFonts w:ascii="Calibri" w:hAnsi="Calibri" w:eastAsia="Yu Gothic"/>
+        </w:rPr>
+        <w:t xml:space="preserve">Manifestは </w:t>
+      </w:r>
+      <w:r>
+        <w:rPr>
+          <w:rFonts w:ascii="Consolas" w:hAnsi="Consolas" w:eastAsia="Yu Gothic"/>
+          <w:sz w:val="19"/>
+        </w:rPr>
+        <w:t>ee21b3bb6962dc3c483f194d8684217a6177d6e86fbea00343e14582543329a0</w:t>
+      </w:r>
+      <w:r>
+        <w:rPr>
+          <w:rFonts w:ascii="Calibri" w:hAnsi="Calibri" w:eastAsia="Yu Gothic"/>
+        </w:rPr>
+        <w:t>、固定model hashはEXP-2026-016と同一である。</w:t>
+      </w:r>
+    </w:p>
+    <w:p>
+      <w:pPr>
+        <w:pStyle w:val="Reproducibility"/>
+        <w:jc w:val="left"/>
+      </w:pPr>
+      <w:r>
+        <w:rPr>
+          <w:rFonts w:ascii="Calibri" w:hAnsi="Calibri" w:eastAsia="Yu Gothic"/>
+        </w:rPr>
+        <w:t xml:space="preserve">EXP-2026-018はbase分割回復、正の有限半径、pair-affinityのLipschitz上限、半径未満の完全回復、pair disagreement 0、等号を保証へ含めないstrict boundary、task-free、構造class重複なしの8判定を固定した。半径外の回復率にはdevelopment後も閾値を追加しなかった。Confirmation manifestは </w:t>
+      </w:r>
+      <w:r>
+        <w:rPr>
+          <w:rFonts w:ascii="Consolas" w:hAnsi="Consolas" w:eastAsia="Yu Gothic"/>
+          <w:sz w:val="19"/>
+        </w:rPr>
+        <w:t>7583c4c5e500b60d504462b263c8e056139254eec18f1d474fd890fcac3b7110</w:t>
       </w:r>
       <w:r>
         <w:rPr>
@@ -7668,10 +8261,332 @@
     </w:p>
     <w:p>
       <w:pPr>
-        <w:pStyle w:val="Heading1"/>
+        <w:pStyle w:val="Heading2"/>
       </w:pPr>
       <w:r>
-        <w:t>6. 考察</w:t>
+        <w:t>5.11 未知三module分割と因子化移送</w:t>
+      </w:r>
+    </w:p>
+    <w:p>
+      <w:r>
+        <w:rPr>
+          <w:rFonts w:ascii="Calibri" w:hAnsi="Calibri" w:eastAsia="Yu Gothic"/>
+        </w:rPr>
+        <w:t>EXP-2026-017のtask-free構造gateでは、2 internal gain、4 bridge strengthの各群で 30 networkが30絶対値構造classとなり、全240 networkの推定partitionが生成真値と label-freeで一致した。選択gapはinter/intra gapと一致して一意に最大であり、 task値は生成されていなかった。固定model hashも一致した。</w:t>
+      </w:r>
+    </w:p>
+    <w:p>
+      <w:r>
+        <w:rPr>
+          <w:rFonts w:ascii="Calibri" w:hAnsi="Calibri" w:eastAsia="Yu Gothic"/>
+        </w:rPr>
+        <w:t>960点、491,520 challengeで事前登録12判定はすべて成立した。因子化certificateと 全系直積列挙の最大差は0、</w:t>
+      </w:r>
+      <w:r>
+        <w:rPr>
+          <w:rFonts w:ascii="Cambria Math" w:hAnsi="Cambria Math" w:eastAsia="Yu Gothic"/>
+        </w:rPr>
+        <w:t>T-R_rect</w:t>
+      </w:r>
+      <w:r>
+        <w:rPr>
+          <w:rFonts w:ascii="Calibri" w:hAnsi="Calibri" w:eastAsia="Yu Gothic"/>
+        </w:rPr>
+        <w:t xml:space="preserve"> の最小値は0だった。局所列挙は </w:t>
+      </w:r>
+      <w:r>
+        <w:rPr>
+          <w:rFonts w:ascii="Cambria Math" w:hAnsi="Cambria Math" w:eastAsia="Yu Gothic"/>
+        </w:rPr>
+        <w:t>4+4+8=16</w:t>
+      </w:r>
+      <w:r>
+        <w:rPr>
+          <w:rFonts w:ascii="Calibri" w:hAnsi="Calibri" w:eastAsia="Yu Gothic"/>
+        </w:rPr>
+        <w:t>、全系列挙は128で、certificate計算対象を正確に1/8へ削減した。 Task保持率は0.25–1、全条件の最大絶対task積則残差は0.246094だった。</w:t>
+      </w:r>
+    </w:p>
+    <w:tbl>
+      <w:tblPr>
+        <w:tblW w:type="dxa" w:w="9360"/>
+        <w:tblLayout w:type="fixed"/>
+        <w:tblLook w:firstColumn="1" w:firstRow="1" w:lastColumn="0" w:lastRow="0" w:noHBand="0" w:noVBand="1" w:val="04A0"/>
+        <w:tblInd w:w="120" w:type="dxa"/>
+        <w:tblLayout w:type="fixed"/>
+        <w:tblBorders>
+          <w:top w:val="single" w:sz="4" w:color="CBD2DA"/>
+          <w:left w:val="single" w:sz="4" w:color="CBD2DA"/>
+          <w:bottom w:val="single" w:sz="4" w:color="CBD2DA"/>
+          <w:right w:val="single" w:sz="4" w:color="CBD2DA"/>
+          <w:insideH w:val="single" w:sz="4" w:color="CBD2DA"/>
+          <w:insideV w:val="single" w:sz="4" w:color="CBD2DA"/>
+        </w:tblBorders>
+        <w:tblCellMar>
+          <w:top w:w="80" w:type="dxa"/>
+          <w:bottom w:w="80" w:type="dxa"/>
+          <w:start w:w="120" w:type="dxa"/>
+          <w:end w:w="120" w:type="dxa"/>
+        </w:tblCellMar>
+      </w:tblPr>
+      <w:tblGrid>
+        <w:gridCol w:w="4000"/>
+        <w:gridCol w:w="1800"/>
+        <w:gridCol w:w="3560"/>
+      </w:tblGrid>
+      <w:tr>
+        <w:trPr>
+          <w:tblHeader w:val="true"/>
+        </w:trPr>
+        <w:tc>
+          <w:tcPr>
+            <w:tcW w:type="dxa" w:w="4000"/>
+            <w:vAlign w:val="center"/>
+            <w:shd w:fill="F4F6F9"/>
+          </w:tcPr>
+          <w:p>
+            <w:pPr>
+              <w:pStyle w:val="ScientificTableText"/>
+              <w:jc w:val="left"/>
+            </w:pPr>
+            <w:r>
+              <w:rPr>
+                <w:rFonts w:ascii="Calibri" w:hAnsi="Calibri" w:eastAsia="Yu Gothic"/>
+                <w:b/>
+              </w:rPr>
+              <w:t>Model</w:t>
+            </w:r>
+          </w:p>
+        </w:tc>
+        <w:tc>
+          <w:tcPr>
+            <w:tcW w:type="dxa" w:w="1800"/>
+            <w:vAlign w:val="center"/>
+            <w:shd w:fill="F4F6F9"/>
+          </w:tcPr>
+          <w:p>
+            <w:pPr>
+              <w:pStyle w:val="ScientificTableText"/>
+              <w:jc w:val="center"/>
+            </w:pPr>
+            <w:r>
+              <w:rPr>
+                <w:rFonts w:ascii="Calibri" w:hAnsi="Calibri" w:eastAsia="Yu Gothic"/>
+                <w:b/>
+              </w:rPr>
+              <w:t>Confirmation MAE</w:t>
+            </w:r>
+          </w:p>
+        </w:tc>
+        <w:tc>
+          <w:tcPr>
+            <w:tcW w:type="dxa" w:w="3560"/>
+            <w:vAlign w:val="center"/>
+            <w:shd w:fill="F4F6F9"/>
+          </w:tcPr>
+          <w:p>
+            <w:pPr>
+              <w:pStyle w:val="ScientificTableText"/>
+              <w:jc w:val="center"/>
+            </w:pPr>
+            <w:r>
+              <w:rPr>
+                <w:rFonts w:ascii="Calibri" w:hAnsi="Calibri" w:eastAsia="Yu Gothic"/>
+                <w:b/>
+              </w:rPr>
+              <w:t>Spearman</w:t>
+            </w:r>
+          </w:p>
+        </w:tc>
+      </w:tr>
+      <w:tr>
+        <w:tc>
+          <w:tcPr>
+            <w:tcW w:type="dxa" w:w="4000"/>
+            <w:vAlign w:val="center"/>
+          </w:tcPr>
+          <w:p>
+            <w:pPr>
+              <w:pStyle w:val="ScientificTableText"/>
+              <w:jc w:val="left"/>
+            </w:pPr>
+            <w:r>
+              <w:rPr>
+                <w:rFonts w:ascii="Calibri" w:hAnsi="Calibri" w:eastAsia="Yu Gothic"/>
+              </w:rPr>
+              <w:t>Component-aware</w:t>
+            </w:r>
+          </w:p>
+        </w:tc>
+        <w:tc>
+          <w:tcPr>
+            <w:tcW w:type="dxa" w:w="1800"/>
+            <w:vAlign w:val="center"/>
+          </w:tcPr>
+          <w:p>
+            <w:pPr>
+              <w:pStyle w:val="ScientificTableText"/>
+              <w:jc w:val="center"/>
+            </w:pPr>
+            <w:r>
+              <w:rPr>
+                <w:rFonts w:ascii="Calibri" w:hAnsi="Calibri" w:eastAsia="Yu Gothic"/>
+              </w:rPr>
+              <w:t>0.016257</w:t>
+            </w:r>
+          </w:p>
+        </w:tc>
+        <w:tc>
+          <w:tcPr>
+            <w:tcW w:type="dxa" w:w="3560"/>
+            <w:vAlign w:val="center"/>
+          </w:tcPr>
+          <w:p>
+            <w:pPr>
+              <w:pStyle w:val="ScientificTableText"/>
+              <w:jc w:val="center"/>
+            </w:pPr>
+            <w:r>
+              <w:rPr>
+                <w:rFonts w:ascii="Calibri" w:hAnsi="Calibri" w:eastAsia="Yu Gothic"/>
+              </w:rPr>
+              <w:t>0.879666</w:t>
+            </w:r>
+          </w:p>
+        </w:tc>
+      </w:tr>
+      <w:tr>
+        <w:tc>
+          <w:tcPr>
+            <w:tcW w:type="dxa" w:w="4000"/>
+            <w:vAlign w:val="center"/>
+          </w:tcPr>
+          <w:p>
+            <w:pPr>
+              <w:pStyle w:val="ScientificTableText"/>
+              <w:jc w:val="left"/>
+            </w:pPr>
+            <w:r>
+              <w:rPr>
+                <w:rFonts w:ascii="Calibri" w:hAnsi="Calibri" w:eastAsia="Yu Gothic"/>
+              </w:rPr>
+              <w:t>Global profile</w:t>
+            </w:r>
+          </w:p>
+        </w:tc>
+        <w:tc>
+          <w:tcPr>
+            <w:tcW w:type="dxa" w:w="1800"/>
+            <w:vAlign w:val="center"/>
+          </w:tcPr>
+          <w:p>
+            <w:pPr>
+              <w:pStyle w:val="ScientificTableText"/>
+              <w:jc w:val="center"/>
+            </w:pPr>
+            <w:r>
+              <w:rPr>
+                <w:rFonts w:ascii="Calibri" w:hAnsi="Calibri" w:eastAsia="Yu Gothic"/>
+              </w:rPr>
+              <w:t>0.079928</w:t>
+            </w:r>
+          </w:p>
+        </w:tc>
+        <w:tc>
+          <w:tcPr>
+            <w:tcW w:type="dxa" w:w="3560"/>
+            <w:vAlign w:val="center"/>
+          </w:tcPr>
+          <w:p>
+            <w:pPr>
+              <w:pStyle w:val="ScientificTableText"/>
+              <w:jc w:val="center"/>
+            </w:pPr>
+            <w:r>
+              <w:rPr>
+                <w:rFonts w:ascii="Calibri" w:hAnsi="Calibri" w:eastAsia="Yu Gothic"/>
+              </w:rPr>
+              <w:t>0.946810</w:t>
+            </w:r>
+          </w:p>
+        </w:tc>
+      </w:tr>
+      <w:tr>
+        <w:tc>
+          <w:tcPr>
+            <w:tcW w:type="dxa" w:w="4000"/>
+            <w:vAlign w:val="center"/>
+          </w:tcPr>
+          <w:p>
+            <w:pPr>
+              <w:pStyle w:val="ScientificTableText"/>
+              <w:jc w:val="left"/>
+            </w:pPr>
+            <w:r>
+              <w:rPr>
+                <w:rFonts w:ascii="Calibri" w:hAnsi="Calibri" w:eastAsia="Yu Gothic"/>
+              </w:rPr>
+              <w:t>Product-only</w:t>
+            </w:r>
+          </w:p>
+        </w:tc>
+        <w:tc>
+          <w:tcPr>
+            <w:tcW w:type="dxa" w:w="1800"/>
+            <w:vAlign w:val="center"/>
+          </w:tcPr>
+          <w:p>
+            <w:pPr>
+              <w:pStyle w:val="ScientificTableText"/>
+              <w:jc w:val="center"/>
+            </w:pPr>
+            <w:r>
+              <w:rPr>
+                <w:rFonts w:ascii="Calibri" w:hAnsi="Calibri" w:eastAsia="Yu Gothic"/>
+              </w:rPr>
+              <w:t>0.021025</w:t>
+            </w:r>
+          </w:p>
+        </w:tc>
+        <w:tc>
+          <w:tcPr>
+            <w:tcW w:type="dxa" w:w="3560"/>
+            <w:vAlign w:val="center"/>
+          </w:tcPr>
+          <w:p>
+            <w:pPr>
+              <w:pStyle w:val="ScientificTableText"/>
+              <w:jc w:val="center"/>
+            </w:pPr>
+            <w:r>
+              <w:rPr>
+                <w:rFonts w:ascii="Calibri" w:hAnsi="Calibri" w:eastAsia="Yu Gothic"/>
+              </w:rPr>
+              <w:t>0.868936</w:t>
+            </w:r>
+          </w:p>
+        </w:tc>
+      </w:tr>
+    </w:tbl>
+    <w:p>
+      <w:pPr>
+        <w:spacing w:before="0" w:after="40"/>
+      </w:pPr>
+    </w:p>
+    <w:p>
+      <w:r>
+        <w:rPr>
+          <w:rFonts w:ascii="Calibri" w:hAnsi="Calibri" w:eastAsia="Yu Gothic"/>
+        </w:rPr>
+        <w:t>seed単位bootstrap 10,000回でglobal minus component MAEは0.063670、95%区間 [0.061675, 0.065729]、product-only minus componentは0.004767、 [0.004194, 0.005303]だった。従って固定二module predictorは未知三modulefamilyでも 絶対保持率を二baselineよりよく較正したが、順位相関はglobal modelが最も高かった。</w:t>
+      </w:r>
+    </w:p>
+    <w:p>
+      <w:r>
+        <w:rPr>
+          <w:rFonts w:ascii="Calibri" w:hAnsi="Calibri" w:eastAsia="Yu Gothic"/>
+        </w:rPr>
+        <w:t>このgeneratorでは各受信moduleの最大総流入loadを同じstrengthへ揃えたため、 directionalとglobal certificateは全点で一致した。従って本実験は因子化の厳密性と 固定modelのMAE移送を支持するが、directional loadがglobal loadより保守性を緩める という効果は検証していない。</w:t>
       </w:r>
     </w:p>
     <w:p>
@@ -7679,7 +8594,7 @@
         <w:pStyle w:val="Heading2"/>
       </w:pPr>
       <w:r>
-        <w:t>6.1 アトラクタ数から利用可能性へ</w:t>
+        <w:t>5.12 最大gap分割の摂動保証半径</w:t>
       </w:r>
     </w:p>
     <w:p>
@@ -7687,63 +8602,672 @@
         <w:rPr>
           <w:rFonts w:ascii="Calibri" w:hAnsi="Calibri" w:eastAsia="Yu Gothic"/>
         </w:rPr>
-        <w:t>本結果の中心は、全networkが同じ16個の自律符号固定点を持つ条件でも、外乱下保持率が大きく異なることである。Raw countは存在を数えるが、有限外乱に対する安全性を含まない。</w:t>
-      </w:r>
-      <w:r>
-        <w:rPr>
-          <w:rFonts w:ascii="Cambria Math" w:hAnsi="Cambria Math" w:eastAsia="Yu Gothic"/>
-        </w:rPr>
-        <w:t>N_rob(e)</w:t>
-      </w:r>
-      <w:r>
-        <w:rPr>
-          <w:rFonts w:ascii="Calibri" w:hAnsi="Calibri" w:eastAsia="Yu Gothic"/>
-        </w:rPr>
-        <w:t xml:space="preserve"> とmargin分布は、要求外乱budgetに応じて利用可能な状態を数え直す。</w:t>
-      </w:r>
+        <w:t>EXP-2026-018の未使用confirmation 180 base networkでは、真partition回復、正の有限半径、Lipschitz上限、半径内完全回復、pair distance 0、strict boundary、task-free、構造独立性の8判定がすべて成立した。保証半径は最小0.001887、平均0.005616、最大0.009434だった。</w:t>
+      </w:r>
+    </w:p>
+    <w:tbl>
+      <w:tblPr>
+        <w:tblW w:type="dxa" w:w="9360"/>
+        <w:tblLayout w:type="fixed"/>
+        <w:tblLook w:firstColumn="1" w:firstRow="1" w:lastColumn="0" w:lastRow="0" w:noHBand="0" w:noVBand="1" w:val="04A0"/>
+        <w:tblInd w:w="120" w:type="dxa"/>
+        <w:tblLayout w:type="fixed"/>
+        <w:tblBorders>
+          <w:top w:val="single" w:sz="4" w:color="CBD2DA"/>
+          <w:left w:val="single" w:sz="4" w:color="CBD2DA"/>
+          <w:bottom w:val="single" w:sz="4" w:color="CBD2DA"/>
+          <w:right w:val="single" w:sz="4" w:color="CBD2DA"/>
+          <w:insideH w:val="single" w:sz="4" w:color="CBD2DA"/>
+          <w:insideV w:val="single" w:sz="4" w:color="CBD2DA"/>
+        </w:tblBorders>
+        <w:tblCellMar>
+          <w:top w:w="80" w:type="dxa"/>
+          <w:bottom w:w="80" w:type="dxa"/>
+          <w:start w:w="120" w:type="dxa"/>
+          <w:end w:w="120" w:type="dxa"/>
+        </w:tblCellMar>
+      </w:tblPr>
+      <w:tblGrid>
+        <w:gridCol w:w="2350"/>
+        <w:gridCol w:w="2850"/>
+        <w:gridCol w:w="2100"/>
+        <w:gridCol w:w="2060"/>
+      </w:tblGrid>
+      <w:tr>
+        <w:trPr>
+          <w:tblHeader w:val="true"/>
+        </w:trPr>
+        <w:tc>
+          <w:tcPr>
+            <w:tcW w:type="dxa" w:w="2350"/>
+            <w:vAlign w:val="center"/>
+            <w:shd w:fill="F4F6F9"/>
+          </w:tcPr>
+          <w:p>
+            <w:pPr>
+              <w:pStyle w:val="ScientificTableText"/>
+              <w:jc w:val="left"/>
+            </w:pPr>
+            <w:r>
+              <w:rPr>
+                <w:rFonts w:ascii="Calibri" w:hAnsi="Calibri" w:eastAsia="Yu Gothic"/>
+                <w:b/>
+              </w:rPr>
+              <w:t>半径倍率</w:t>
+            </w:r>
+          </w:p>
+        </w:tc>
+        <w:tc>
+          <w:tcPr>
+            <w:tcW w:type="dxa" w:w="2850"/>
+            <w:vAlign w:val="center"/>
+            <w:shd w:fill="F4F6F9"/>
+          </w:tcPr>
+          <w:p>
+            <w:pPr>
+              <w:pStyle w:val="ScientificTableText"/>
+              <w:jc w:val="center"/>
+            </w:pPr>
+            <w:r>
+              <w:rPr>
+                <w:rFonts w:ascii="Calibri" w:hAnsi="Calibri" w:eastAsia="Yu Gothic"/>
+                <w:b/>
+              </w:rPr>
+              <w:t>推定成功率</w:t>
+            </w:r>
+          </w:p>
+        </w:tc>
+        <w:tc>
+          <w:tcPr>
+            <w:tcW w:type="dxa" w:w="2100"/>
+            <w:vAlign w:val="center"/>
+            <w:shd w:fill="F4F6F9"/>
+          </w:tcPr>
+          <w:p>
+            <w:pPr>
+              <w:pStyle w:val="ScientificTableText"/>
+              <w:jc w:val="center"/>
+            </w:pPr>
+            <w:r>
+              <w:rPr>
+                <w:rFonts w:ascii="Calibri" w:hAnsi="Calibri" w:eastAsia="Yu Gothic"/>
+                <w:b/>
+              </w:rPr>
+              <w:t>Partition回復率</w:t>
+            </w:r>
+          </w:p>
+        </w:tc>
+        <w:tc>
+          <w:tcPr>
+            <w:tcW w:type="dxa" w:w="2060"/>
+            <w:vAlign w:val="center"/>
+            <w:shd w:fill="F4F6F9"/>
+          </w:tcPr>
+          <w:p>
+            <w:pPr>
+              <w:pStyle w:val="ScientificTableText"/>
+              <w:jc w:val="center"/>
+            </w:pPr>
+            <w:r>
+              <w:rPr>
+                <w:rFonts w:ascii="Calibri" w:hAnsi="Calibri" w:eastAsia="Yu Gothic"/>
+                <w:b/>
+              </w:rPr>
+              <w:t>平均pair disagreement</w:t>
+            </w:r>
+          </w:p>
+        </w:tc>
+      </w:tr>
+      <w:tr>
+        <w:tc>
+          <w:tcPr>
+            <w:tcW w:type="dxa" w:w="2350"/>
+            <w:vAlign w:val="center"/>
+          </w:tcPr>
+          <w:p>
+            <w:pPr>
+              <w:pStyle w:val="ScientificTableText"/>
+              <w:jc w:val="left"/>
+            </w:pPr>
+            <w:r>
+              <w:rPr>
+                <w:rFonts w:ascii="Calibri" w:hAnsi="Calibri" w:eastAsia="Yu Gothic"/>
+              </w:rPr>
+              <w:t>0.00</w:t>
+            </w:r>
+          </w:p>
+        </w:tc>
+        <w:tc>
+          <w:tcPr>
+            <w:tcW w:type="dxa" w:w="2850"/>
+            <w:vAlign w:val="center"/>
+          </w:tcPr>
+          <w:p>
+            <w:pPr>
+              <w:pStyle w:val="ScientificTableText"/>
+              <w:jc w:val="center"/>
+            </w:pPr>
+            <w:r>
+              <w:rPr>
+                <w:rFonts w:ascii="Calibri" w:hAnsi="Calibri" w:eastAsia="Yu Gothic"/>
+              </w:rPr>
+              <w:t>1.000000</w:t>
+            </w:r>
+          </w:p>
+        </w:tc>
+        <w:tc>
+          <w:tcPr>
+            <w:tcW w:type="dxa" w:w="2100"/>
+            <w:vAlign w:val="center"/>
+          </w:tcPr>
+          <w:p>
+            <w:pPr>
+              <w:pStyle w:val="ScientificTableText"/>
+              <w:jc w:val="center"/>
+            </w:pPr>
+            <w:r>
+              <w:rPr>
+                <w:rFonts w:ascii="Calibri" w:hAnsi="Calibri" w:eastAsia="Yu Gothic"/>
+              </w:rPr>
+              <w:t>1.000000</w:t>
+            </w:r>
+          </w:p>
+        </w:tc>
+        <w:tc>
+          <w:tcPr>
+            <w:tcW w:type="dxa" w:w="2060"/>
+            <w:vAlign w:val="center"/>
+          </w:tcPr>
+          <w:p>
+            <w:pPr>
+              <w:pStyle w:val="ScientificTableText"/>
+              <w:jc w:val="center"/>
+            </w:pPr>
+            <w:r>
+              <w:rPr>
+                <w:rFonts w:ascii="Calibri" w:hAnsi="Calibri" w:eastAsia="Yu Gothic"/>
+              </w:rPr>
+              <w:t>0.000000</w:t>
+            </w:r>
+          </w:p>
+        </w:tc>
+      </w:tr>
+      <w:tr>
+        <w:tc>
+          <w:tcPr>
+            <w:tcW w:type="dxa" w:w="2350"/>
+            <w:vAlign w:val="center"/>
+          </w:tcPr>
+          <w:p>
+            <w:pPr>
+              <w:pStyle w:val="ScientificTableText"/>
+              <w:jc w:val="left"/>
+            </w:pPr>
+            <w:r>
+              <w:rPr>
+                <w:rFonts w:ascii="Calibri" w:hAnsi="Calibri" w:eastAsia="Yu Gothic"/>
+              </w:rPr>
+              <w:t>0.25</w:t>
+            </w:r>
+          </w:p>
+        </w:tc>
+        <w:tc>
+          <w:tcPr>
+            <w:tcW w:type="dxa" w:w="2850"/>
+            <w:vAlign w:val="center"/>
+          </w:tcPr>
+          <w:p>
+            <w:pPr>
+              <w:pStyle w:val="ScientificTableText"/>
+              <w:jc w:val="center"/>
+            </w:pPr>
+            <w:r>
+              <w:rPr>
+                <w:rFonts w:ascii="Calibri" w:hAnsi="Calibri" w:eastAsia="Yu Gothic"/>
+              </w:rPr>
+              <w:t>1.000000</w:t>
+            </w:r>
+          </w:p>
+        </w:tc>
+        <w:tc>
+          <w:tcPr>
+            <w:tcW w:type="dxa" w:w="2100"/>
+            <w:vAlign w:val="center"/>
+          </w:tcPr>
+          <w:p>
+            <w:pPr>
+              <w:pStyle w:val="ScientificTableText"/>
+              <w:jc w:val="center"/>
+            </w:pPr>
+            <w:r>
+              <w:rPr>
+                <w:rFonts w:ascii="Calibri" w:hAnsi="Calibri" w:eastAsia="Yu Gothic"/>
+              </w:rPr>
+              <w:t>1.000000</w:t>
+            </w:r>
+          </w:p>
+        </w:tc>
+        <w:tc>
+          <w:tcPr>
+            <w:tcW w:type="dxa" w:w="2060"/>
+            <w:vAlign w:val="center"/>
+          </w:tcPr>
+          <w:p>
+            <w:pPr>
+              <w:pStyle w:val="ScientificTableText"/>
+              <w:jc w:val="center"/>
+            </w:pPr>
+            <w:r>
+              <w:rPr>
+                <w:rFonts w:ascii="Calibri" w:hAnsi="Calibri" w:eastAsia="Yu Gothic"/>
+              </w:rPr>
+              <w:t>0.000000</w:t>
+            </w:r>
+          </w:p>
+        </w:tc>
+      </w:tr>
+      <w:tr>
+        <w:tc>
+          <w:tcPr>
+            <w:tcW w:type="dxa" w:w="2350"/>
+            <w:vAlign w:val="center"/>
+          </w:tcPr>
+          <w:p>
+            <w:pPr>
+              <w:pStyle w:val="ScientificTableText"/>
+              <w:jc w:val="left"/>
+            </w:pPr>
+            <w:r>
+              <w:rPr>
+                <w:rFonts w:ascii="Calibri" w:hAnsi="Calibri" w:eastAsia="Yu Gothic"/>
+              </w:rPr>
+              <w:t>0.50</w:t>
+            </w:r>
+          </w:p>
+        </w:tc>
+        <w:tc>
+          <w:tcPr>
+            <w:tcW w:type="dxa" w:w="2850"/>
+            <w:vAlign w:val="center"/>
+          </w:tcPr>
+          <w:p>
+            <w:pPr>
+              <w:pStyle w:val="ScientificTableText"/>
+              <w:jc w:val="center"/>
+            </w:pPr>
+            <w:r>
+              <w:rPr>
+                <w:rFonts w:ascii="Calibri" w:hAnsi="Calibri" w:eastAsia="Yu Gothic"/>
+              </w:rPr>
+              <w:t>1.000000</w:t>
+            </w:r>
+          </w:p>
+        </w:tc>
+        <w:tc>
+          <w:tcPr>
+            <w:tcW w:type="dxa" w:w="2100"/>
+            <w:vAlign w:val="center"/>
+          </w:tcPr>
+          <w:p>
+            <w:pPr>
+              <w:pStyle w:val="ScientificTableText"/>
+              <w:jc w:val="center"/>
+            </w:pPr>
+            <w:r>
+              <w:rPr>
+                <w:rFonts w:ascii="Calibri" w:hAnsi="Calibri" w:eastAsia="Yu Gothic"/>
+              </w:rPr>
+              <w:t>1.000000</w:t>
+            </w:r>
+          </w:p>
+        </w:tc>
+        <w:tc>
+          <w:tcPr>
+            <w:tcW w:type="dxa" w:w="2060"/>
+            <w:vAlign w:val="center"/>
+          </w:tcPr>
+          <w:p>
+            <w:pPr>
+              <w:pStyle w:val="ScientificTableText"/>
+              <w:jc w:val="center"/>
+            </w:pPr>
+            <w:r>
+              <w:rPr>
+                <w:rFonts w:ascii="Calibri" w:hAnsi="Calibri" w:eastAsia="Yu Gothic"/>
+              </w:rPr>
+              <w:t>0.000000</w:t>
+            </w:r>
+          </w:p>
+        </w:tc>
+      </w:tr>
+      <w:tr>
+        <w:tc>
+          <w:tcPr>
+            <w:tcW w:type="dxa" w:w="2350"/>
+            <w:vAlign w:val="center"/>
+          </w:tcPr>
+          <w:p>
+            <w:pPr>
+              <w:pStyle w:val="ScientificTableText"/>
+              <w:jc w:val="left"/>
+            </w:pPr>
+            <w:r>
+              <w:rPr>
+                <w:rFonts w:ascii="Calibri" w:hAnsi="Calibri" w:eastAsia="Yu Gothic"/>
+              </w:rPr>
+              <w:t>0.90</w:t>
+            </w:r>
+          </w:p>
+        </w:tc>
+        <w:tc>
+          <w:tcPr>
+            <w:tcW w:type="dxa" w:w="2850"/>
+            <w:vAlign w:val="center"/>
+          </w:tcPr>
+          <w:p>
+            <w:pPr>
+              <w:pStyle w:val="ScientificTableText"/>
+              <w:jc w:val="center"/>
+            </w:pPr>
+            <w:r>
+              <w:rPr>
+                <w:rFonts w:ascii="Calibri" w:hAnsi="Calibri" w:eastAsia="Yu Gothic"/>
+              </w:rPr>
+              <w:t>1.000000</w:t>
+            </w:r>
+          </w:p>
+        </w:tc>
+        <w:tc>
+          <w:tcPr>
+            <w:tcW w:type="dxa" w:w="2100"/>
+            <w:vAlign w:val="center"/>
+          </w:tcPr>
+          <w:p>
+            <w:pPr>
+              <w:pStyle w:val="ScientificTableText"/>
+              <w:jc w:val="center"/>
+            </w:pPr>
+            <w:r>
+              <w:rPr>
+                <w:rFonts w:ascii="Calibri" w:hAnsi="Calibri" w:eastAsia="Yu Gothic"/>
+              </w:rPr>
+              <w:t>1.000000</w:t>
+            </w:r>
+          </w:p>
+        </w:tc>
+        <w:tc>
+          <w:tcPr>
+            <w:tcW w:type="dxa" w:w="2060"/>
+            <w:vAlign w:val="center"/>
+          </w:tcPr>
+          <w:p>
+            <w:pPr>
+              <w:pStyle w:val="ScientificTableText"/>
+              <w:jc w:val="center"/>
+            </w:pPr>
+            <w:r>
+              <w:rPr>
+                <w:rFonts w:ascii="Calibri" w:hAnsi="Calibri" w:eastAsia="Yu Gothic"/>
+              </w:rPr>
+              <w:t>0.000000</w:t>
+            </w:r>
+          </w:p>
+        </w:tc>
+      </w:tr>
+      <w:tr>
+        <w:tc>
+          <w:tcPr>
+            <w:tcW w:type="dxa" w:w="2350"/>
+            <w:vAlign w:val="center"/>
+          </w:tcPr>
+          <w:p>
+            <w:pPr>
+              <w:pStyle w:val="ScientificTableText"/>
+              <w:jc w:val="left"/>
+            </w:pPr>
+            <w:r>
+              <w:rPr>
+                <w:rFonts w:ascii="Calibri" w:hAnsi="Calibri" w:eastAsia="Yu Gothic"/>
+              </w:rPr>
+              <w:t>1.10</w:t>
+            </w:r>
+          </w:p>
+        </w:tc>
+        <w:tc>
+          <w:tcPr>
+            <w:tcW w:type="dxa" w:w="2850"/>
+            <w:vAlign w:val="center"/>
+          </w:tcPr>
+          <w:p>
+            <w:pPr>
+              <w:pStyle w:val="ScientificTableText"/>
+              <w:jc w:val="center"/>
+            </w:pPr>
+            <w:r>
+              <w:rPr>
+                <w:rFonts w:ascii="Calibri" w:hAnsi="Calibri" w:eastAsia="Yu Gothic"/>
+              </w:rPr>
+              <w:t>1.000000</w:t>
+            </w:r>
+          </w:p>
+        </w:tc>
+        <w:tc>
+          <w:tcPr>
+            <w:tcW w:type="dxa" w:w="2100"/>
+            <w:vAlign w:val="center"/>
+          </w:tcPr>
+          <w:p>
+            <w:pPr>
+              <w:pStyle w:val="ScientificTableText"/>
+              <w:jc w:val="center"/>
+            </w:pPr>
+            <w:r>
+              <w:rPr>
+                <w:rFonts w:ascii="Calibri" w:hAnsi="Calibri" w:eastAsia="Yu Gothic"/>
+              </w:rPr>
+              <w:t>1.000000</w:t>
+            </w:r>
+          </w:p>
+        </w:tc>
+        <w:tc>
+          <w:tcPr>
+            <w:tcW w:type="dxa" w:w="2060"/>
+            <w:vAlign w:val="center"/>
+          </w:tcPr>
+          <w:p>
+            <w:pPr>
+              <w:pStyle w:val="ScientificTableText"/>
+              <w:jc w:val="center"/>
+            </w:pPr>
+            <w:r>
+              <w:rPr>
+                <w:rFonts w:ascii="Calibri" w:hAnsi="Calibri" w:eastAsia="Yu Gothic"/>
+              </w:rPr>
+              <w:t>0.000000</w:t>
+            </w:r>
+          </w:p>
+        </w:tc>
+      </w:tr>
+      <w:tr>
+        <w:tc>
+          <w:tcPr>
+            <w:tcW w:type="dxa" w:w="2350"/>
+            <w:vAlign w:val="center"/>
+          </w:tcPr>
+          <w:p>
+            <w:pPr>
+              <w:pStyle w:val="ScientificTableText"/>
+              <w:jc w:val="left"/>
+            </w:pPr>
+            <w:r>
+              <w:rPr>
+                <w:rFonts w:ascii="Calibri" w:hAnsi="Calibri" w:eastAsia="Yu Gothic"/>
+              </w:rPr>
+              <w:t>2.00</w:t>
+            </w:r>
+          </w:p>
+        </w:tc>
+        <w:tc>
+          <w:tcPr>
+            <w:tcW w:type="dxa" w:w="2850"/>
+            <w:vAlign w:val="center"/>
+          </w:tcPr>
+          <w:p>
+            <w:pPr>
+              <w:pStyle w:val="ScientificTableText"/>
+              <w:jc w:val="center"/>
+            </w:pPr>
+            <w:r>
+              <w:rPr>
+                <w:rFonts w:ascii="Calibri" w:hAnsi="Calibri" w:eastAsia="Yu Gothic"/>
+              </w:rPr>
+              <w:t>1.000000</w:t>
+            </w:r>
+          </w:p>
+        </w:tc>
+        <w:tc>
+          <w:tcPr>
+            <w:tcW w:type="dxa" w:w="2100"/>
+            <w:vAlign w:val="center"/>
+          </w:tcPr>
+          <w:p>
+            <w:pPr>
+              <w:pStyle w:val="ScientificTableText"/>
+              <w:jc w:val="center"/>
+            </w:pPr>
+            <w:r>
+              <w:rPr>
+                <w:rFonts w:ascii="Calibri" w:hAnsi="Calibri" w:eastAsia="Yu Gothic"/>
+              </w:rPr>
+              <w:t>0.737500</w:t>
+            </w:r>
+          </w:p>
+        </w:tc>
+        <w:tc>
+          <w:tcPr>
+            <w:tcW w:type="dxa" w:w="2060"/>
+            <w:vAlign w:val="center"/>
+          </w:tcPr>
+          <w:p>
+            <w:pPr>
+              <w:pStyle w:val="ScientificTableText"/>
+              <w:jc w:val="center"/>
+            </w:pPr>
+            <w:r>
+              <w:rPr>
+                <w:rFonts w:ascii="Calibri" w:hAnsi="Calibri" w:eastAsia="Yu Gothic"/>
+              </w:rPr>
+              <w:t>0.035020</w:t>
+            </w:r>
+          </w:p>
+        </w:tc>
+      </w:tr>
+      <w:tr>
+        <w:tc>
+          <w:tcPr>
+            <w:tcW w:type="dxa" w:w="2350"/>
+            <w:vAlign w:val="center"/>
+          </w:tcPr>
+          <w:p>
+            <w:pPr>
+              <w:pStyle w:val="ScientificTableText"/>
+              <w:jc w:val="left"/>
+            </w:pPr>
+            <w:r>
+              <w:rPr>
+                <w:rFonts w:ascii="Calibri" w:hAnsi="Calibri" w:eastAsia="Yu Gothic"/>
+              </w:rPr>
+              <w:t>4.00</w:t>
+            </w:r>
+          </w:p>
+        </w:tc>
+        <w:tc>
+          <w:tcPr>
+            <w:tcW w:type="dxa" w:w="2850"/>
+            <w:vAlign w:val="center"/>
+          </w:tcPr>
+          <w:p>
+            <w:pPr>
+              <w:pStyle w:val="ScientificTableText"/>
+              <w:jc w:val="center"/>
+            </w:pPr>
+            <w:r>
+              <w:rPr>
+                <w:rFonts w:ascii="Calibri" w:hAnsi="Calibri" w:eastAsia="Yu Gothic"/>
+              </w:rPr>
+              <w:t>0.961806</w:t>
+            </w:r>
+          </w:p>
+        </w:tc>
+        <w:tc>
+          <w:tcPr>
+            <w:tcW w:type="dxa" w:w="2100"/>
+            <w:vAlign w:val="center"/>
+          </w:tcPr>
+          <w:p>
+            <w:pPr>
+              <w:pStyle w:val="ScientificTableText"/>
+              <w:jc w:val="center"/>
+            </w:pPr>
+            <w:r>
+              <w:rPr>
+                <w:rFonts w:ascii="Calibri" w:hAnsi="Calibri" w:eastAsia="Yu Gothic"/>
+              </w:rPr>
+              <w:t>0.165278</w:t>
+            </w:r>
+          </w:p>
+        </w:tc>
+        <w:tc>
+          <w:tcPr>
+            <w:tcW w:type="dxa" w:w="2060"/>
+            <w:vAlign w:val="center"/>
+          </w:tcPr>
+          <w:p>
+            <w:pPr>
+              <w:pStyle w:val="ScientificTableText"/>
+              <w:jc w:val="center"/>
+            </w:pPr>
+            <w:r>
+              <w:rPr>
+                <w:rFonts w:ascii="Calibri" w:hAnsi="Calibri" w:eastAsia="Yu Gothic"/>
+              </w:rPr>
+              <w:t>0.110848</w:t>
+            </w:r>
+          </w:p>
+        </w:tc>
+      </w:tr>
+    </w:tbl>
+    <w:p>
+      <w:pPr>
+        <w:spacing w:before="0" w:after="40"/>
+      </w:pPr>
     </w:p>
     <w:p>
       <w:r>
         <w:rPr>
           <w:rFonts w:ascii="Calibri" w:hAnsi="Calibri" w:eastAsia="Yu Gothic"/>
         </w:rPr>
-        <w:t xml:space="preserve">低外乱ではthreshold付きrobust fractionが有効であり、高外乱では連続的な平均marginがより情報を持った。EXP-2026-011では、curveの要求点での高さ </w:t>
+        <w:t xml:space="preserve">事前登録保証域 </w:t>
       </w:r>
       <w:r>
         <w:rPr>
           <w:rFonts w:ascii="Cambria Math" w:hAnsi="Cambria Math" w:eastAsia="Yu Gothic"/>
         </w:rPr>
-        <w:t>R(e)</w:t>
-      </w:r>
-      <w:r>
-        <w:rPr>
-          <w:rFonts w:ascii="Calibri" w:hAnsi="Calibri" w:eastAsia="Yu Gothic"/>
-        </w:rPr>
-        <w:t xml:space="preserve"> と無次元化面積 </w:t>
-      </w:r>
-      <w:r>
-        <w:rPr>
-          <w:rFonts w:ascii="Cambria Math" w:hAnsi="Cambria Math" w:eastAsia="Yu Gothic"/>
-        </w:rPr>
-        <w:t>μ̄/e</w:t>
-      </w:r>
-      <w:r>
-        <w:rPr>
-          <w:rFonts w:ascii="Calibri" w:hAnsi="Calibri" w:eastAsia="Yu Gothic"/>
-        </w:rPr>
-        <w:t xml:space="preserve"> の組が、いずれか単独より小さい未知seed MAEを示した。従って、分析ツールは単一scoreへ縮約せず、raw count、certified count、</w:t>
-      </w:r>
-      <w:r>
-        <w:rPr>
-          <w:rFonts w:ascii="Cambria Math" w:hAnsi="Cambria Math" w:eastAsia="Yu Gothic"/>
-        </w:rPr>
-        <w:t>N_rob(e)</w:t>
-      </w:r>
-      <w:r>
-        <w:rPr>
-          <w:rFonts w:ascii="Calibri" w:hAnsi="Calibri" w:eastAsia="Yu Gothic"/>
-        </w:rPr>
-        <w:t xml:space="preserve"> curve、margin分布、未認証率を保持すべきである。</w:t>
+        <w:t>kappa&lt;1</w:t>
+      </w:r>
+      <w:r>
+        <w:rPr>
+          <w:rFonts w:ascii="Calibri" w:hAnsi="Calibri" w:eastAsia="Yu Gothic"/>
+        </w:rPr>
+        <w:t xml:space="preserve"> の5,760条件では全て同じpartitionを保った。1.10倍の全一致は半径の保守性と整合するが、事後的に保証域へ含めない。2倍と4倍での低下はdevelopmentでも0.775、0.1944と再現した。ただし半径外はランダム8方向の探索値であり、最悪方向の変化確率、task失敗率、単調な崩壊則ではない。</w:t>
+      </w:r>
+    </w:p>
+    <w:p>
+      <w:pPr>
+        <w:pStyle w:val="Heading1"/>
+      </w:pPr>
+      <w:r>
+        <w:t>6. 考察</w:t>
       </w:r>
     </w:p>
     <w:p>
@@ -7751,7 +9275,7 @@
         <w:pStyle w:val="Heading2"/>
       </w:pPr>
       <w:r>
-        <w:t>6.2 保証と予測の分離</w:t>
+        <w:t>6.1 アトラクタ数から利用可能性へ</w:t>
       </w:r>
     </w:p>
     <w:p>
@@ -7759,7 +9283,19 @@
         <w:rPr>
           <w:rFonts w:ascii="Calibri" w:hAnsi="Calibri" w:eastAsia="Yu Gothic"/>
         </w:rPr>
-        <w:t>Hyperbox certificateは任意の時変成分別外乱に対する十分条件である。今回の一定corner taskでは、認証robust fractionは全条件で経験保持率の下界になった。ただし未認証orthantにも成功例があり、点予測としては保守的である。</w:t>
+        <w:t>本結果の中心は、全networkが同じ16個の自律符号固定点を持つ条件でも、外乱下保持率が大きく異なることである。Raw countは存在を数えるが、有限外乱に対する安全性を含まない。</w:t>
+      </w:r>
+      <w:r>
+        <w:rPr>
+          <w:rFonts w:ascii="Cambria Math" w:hAnsi="Cambria Math" w:eastAsia="Yu Gothic"/>
+        </w:rPr>
+        <w:t>N_rob(e)</w:t>
+      </w:r>
+      <w:r>
+        <w:rPr>
+          <w:rFonts w:ascii="Calibri" w:hAnsi="Calibri" w:eastAsia="Yu Gothic"/>
+        </w:rPr>
+        <w:t xml:space="preserve"> とmargin分布は、要求外乱budgetに応じて利用可能な状態を数え直す。</w:t>
       </w:r>
     </w:p>
     <w:p>
@@ -7767,7 +9303,43 @@
         <w:rPr>
           <w:rFonts w:ascii="Calibri" w:hAnsi="Calibri" w:eastAsia="Yu Gothic"/>
         </w:rPr>
-        <w:t>従ってツールは二つの出力を分ける必要がある。第一は反例が出れば理論または実装が誤っている保証下界、第二はdataset上の相関や交差検証誤差として評価する経験予測である。この分離により、「認証不能」を「失敗」と誤解することを避けられる。</w:t>
+        <w:t xml:space="preserve">低外乱ではthreshold付きrobust fractionが有効であり、高外乱では連続的な平均marginがより情報を持った。EXP-2026-011では、curveの要求点での高さ </w:t>
+      </w:r>
+      <w:r>
+        <w:rPr>
+          <w:rFonts w:ascii="Cambria Math" w:hAnsi="Cambria Math" w:eastAsia="Yu Gothic"/>
+        </w:rPr>
+        <w:t>R(e)</w:t>
+      </w:r>
+      <w:r>
+        <w:rPr>
+          <w:rFonts w:ascii="Calibri" w:hAnsi="Calibri" w:eastAsia="Yu Gothic"/>
+        </w:rPr>
+        <w:t xml:space="preserve"> と無次元化面積 </w:t>
+      </w:r>
+      <w:r>
+        <w:rPr>
+          <w:rFonts w:ascii="Cambria Math" w:hAnsi="Cambria Math" w:eastAsia="Yu Gothic"/>
+        </w:rPr>
+        <w:t>μ̄/e</w:t>
+      </w:r>
+      <w:r>
+        <w:rPr>
+          <w:rFonts w:ascii="Calibri" w:hAnsi="Calibri" w:eastAsia="Yu Gothic"/>
+        </w:rPr>
+        <w:t xml:space="preserve"> の組が、いずれか単独より小さい未知seed MAEを示した。従って、分析ツールは単一scoreへ縮約せず、raw count、certified count、</w:t>
+      </w:r>
+      <w:r>
+        <w:rPr>
+          <w:rFonts w:ascii="Cambria Math" w:hAnsi="Cambria Math" w:eastAsia="Yu Gothic"/>
+        </w:rPr>
+        <w:t>N_rob(e)</w:t>
+      </w:r>
+      <w:r>
+        <w:rPr>
+          <w:rFonts w:ascii="Calibri" w:hAnsi="Calibri" w:eastAsia="Yu Gothic"/>
+        </w:rPr>
+        <w:t xml:space="preserve"> curve、margin分布、未認証率を保持すべきである。</w:t>
       </w:r>
     </w:p>
     <w:p>
@@ -7775,7 +9347,7 @@
         <w:pStyle w:val="Heading2"/>
       </w:pPr>
       <w:r>
-        <w:t>6.3 局所安定性と有限外乱安全性</w:t>
+        <w:t>6.2 保証と予測の分離</w:t>
       </w:r>
     </w:p>
     <w:p>
@@ -7783,7 +9355,7 @@
         <w:rPr>
           <w:rFonts w:ascii="Calibri" w:hAnsi="Calibri" w:eastAsia="Yu Gothic"/>
         </w:rPr>
-        <w:t>Local Jacobianは固定点近傍の微小摂動増幅を測るが、符号境界までの有限距離とworst-case方向を直接含まない。Orthant marginは両者をhyperbox十分条件の形で含む。EXP-2026-010のpooled secondary解析でmarginがlocal Jacobianを上回ったことは、この差がtask予測に寄与する可能性を示す。</w:t>
+        <w:t>Hyperbox certificateは任意の時変成分別外乱に対する十分条件である。今回の一定corner taskでは、認証robust fractionは全条件で経験保持率の下界になった。ただし未認証orthantにも成功例があり、点予測としては保守的である。</w:t>
       </w:r>
     </w:p>
     <w:p>
@@ -7791,7 +9363,7 @@
         <w:rPr>
           <w:rFonts w:ascii="Calibri" w:hAnsi="Calibri" w:eastAsia="Yu Gothic"/>
         </w:rPr>
-        <w:t>ただしfamily内では局所baselineが優位な例もあった。EXP-2026-011ではcoupling、局所Jacobian、minimum coordinate、nonnormalityを同時に含むstructural modelを事前登録baselineとし、robust pairがpooled MAEを上回った。これは線形ridgeの範囲での増分予測力であり、非線形model、family indicatorを用いた階層model、nested cross-validationとの比較は残る。</w:t>
+        <w:t>従ってツールは二つの出力を分ける必要がある。第一は反例が出れば理論または実装が誤っている保証下界、第二はdataset上の相関や交差検証誤差として評価する経験予測である。この分離により、「認証不能」を「失敗」と誤解することを避けられる。</w:t>
       </w:r>
     </w:p>
     <w:p>
@@ -7799,6 +9371,30 @@
         <w:pStyle w:val="Heading2"/>
       </w:pPr>
       <w:r>
+        <w:t>6.3 局所安定性と有限外乱安全性</w:t>
+      </w:r>
+    </w:p>
+    <w:p>
+      <w:r>
+        <w:rPr>
+          <w:rFonts w:ascii="Calibri" w:hAnsi="Calibri" w:eastAsia="Yu Gothic"/>
+        </w:rPr>
+        <w:t>Local Jacobianは固定点近傍の微小摂動増幅を測るが、符号境界までの有限距離とworst-case方向を直接含まない。Orthant marginは両者をhyperbox十分条件の形で含む。EXP-2026-010のpooled secondary解析でmarginがlocal Jacobianを上回ったことは、この差がtask予測に寄与する可能性を示す。</w:t>
+      </w:r>
+    </w:p>
+    <w:p>
+      <w:r>
+        <w:rPr>
+          <w:rFonts w:ascii="Calibri" w:hAnsi="Calibri" w:eastAsia="Yu Gothic"/>
+        </w:rPr>
+        <w:t>ただしfamily内では局所baselineが優位な例もあった。EXP-2026-011ではcoupling、局所Jacobian、minimum coordinate、nonnormalityを同時に含むstructural modelを事前登録baselineとし、robust pairがpooled MAEを上回った。これは線形ridgeの範囲での増分予測力であり、非線形model、family indicatorを用いた階層model、nested cross-validationとの比較は残る。</w:t>
+      </w:r>
+    </w:p>
+    <w:p>
+      <w:pPr>
+        <w:pStyle w:val="Heading2"/>
+      </w:pPr>
+      <w:r>
         <w:t>6.4 Module積則と較正の非普遍性</w:t>
       </w:r>
     </w:p>
@@ -7943,7 +9539,35 @@
         <w:rPr>
           <w:rFonts w:ascii="Calibri" w:hAnsi="Calibri" w:eastAsia="Yu Gothic"/>
         </w:rPr>
-        <w:t>EXP-2026-016は非対称bridgeとmodule size差へこの表現を外挿し、小さい二familyだけでfitしたcomponent-aware modelが未知3+5 familyでglobal profileとisolated task積より低いMAEを示した。これはcomponent分解が絶対保持率の較正へ増分情報を与える支持である。一方、順位相関は二baselineより低く、global featureの粗い順序づけを置き換えたわけではない。較正とrankingは異なる評価軸であり、「全指標で支配」と解釈しない。次は別generator、3 module以上、分割未知、stochastic/cue/readout task、非線形baselineで検証する必要がある。</w:t>
+        <w:t>EXP-2026-016は非対称bridgeとmodule size差へこの表現を外挿し、小さい二familyだけでfitしたcomponent-aware modelが未知3+5 familyでglobal profileとisolated task積より低いMAEを示した。これはcomponent分解が絶対保持率の較正へ増分情報を与える支持である。一方、順位相関は二baselineより低く、global featureの粗い順序づけを置き換えたわけではない。較正とrankingは異なる評価軸であり、「全指標で支配」と解釈しない。</w:t>
+      </w:r>
+    </w:p>
+    <w:p>
+      <w:r>
+        <w:rPr>
+          <w:rFonts w:ascii="Calibri" w:hAnsi="Calibri" w:eastAsia="Yu Gothic"/>
+        </w:rPr>
+        <w:t xml:space="preserve">EXP-2026-017はtask値を見ない未知三module分割と因子化合成へ進め、強い一意affinity gapの下でpartition回復、局所16対全系128の厳密一致、固定modelのMAE優位を確認した。これは局所次元が有界ならcertificate抽出を全次元指数から </w:t>
+      </w:r>
+      <w:r>
+        <w:rPr>
+          <w:rFonts w:ascii="Cambria Math" w:hAnsi="Cambria Math" w:eastAsia="Yu Gothic"/>
+        </w:rPr>
+        <w:t>m2^b</w:t>
+      </w:r>
+      <w:r>
+        <w:rPr>
+          <w:rFonts w:ascii="Calibri" w:hAnsi="Calibri" w:eastAsia="Yu Gothic"/>
+        </w:rPr>
+        <w:t xml:space="preserve"> 型へ分解できる構成例である。ただしgeneratorが回復条件を明示的に満たし、流入loadも均一だった。次は別generator、弱いまたは曖昧な分割、4 module以上、不均衡な方向別流入、stochastic/cue/readout task、非線形baselineで検証する必要がある。</w:t>
+      </w:r>
+    </w:p>
+    <w:p>
+      <w:r>
+        <w:rPr>
+          <w:rFonts w:ascii="Calibri" w:hAnsi="Calibri" w:eastAsia="Yu Gothic"/>
+        </w:rPr>
+        <w:t>EXP-2026-018はこの分割条件を連続量へ変え、同じ最大gap partitionを保つentrywise誤差半径を与えた。半径内では点推定を安全に因子化解析へ渡せるが、半径外では競合partition群と共所属確率を保持すべきである。これは構造推定の適用範囲を陽にする結果であって、同じpartitionが同じ機能を意味するわけではない。次の識別実験は、半径外の誤分割がcomponent profile、certificate、固定predictorへ与える誤差を測ることである。</w:t>
       </w:r>
     </w:p>
     <w:p>
@@ -8071,7 +9695,7 @@
         <w:rPr>
           <w:rFonts w:ascii="Calibri" w:hAnsi="Calibri" w:eastAsia="Yu Gothic"/>
         </w:rPr>
-        <w:t>EXP-2026-010は、同じ状態数を持つ人工回路でもmargin分布により利用可能性が異なることを示した。EXP-2026-011はさらに、要求budgetで残る状態割合と余裕総量の二成分が、fitから除外した構造の新規seedへ移送できることを示した。しかしEXP-2026-012では積構造への線形較正移送が失敗したため、回路のmodule構成を無視した普遍scoreとしては使えない。EXP-2026-016は局所margin、方向別load、size imbalanceを明示すれば一つの異サイズfamilyへ較正を移せることを示した。EXP-2026-015は、非対称core–reserve構造で局所的にfeedback loadを制御すれば、同一energyの一様制御よりcore保持とreserve記憶を両立できる人工的十分例を加えた。</w:t>
+        <w:t>EXP-2026-010は、同じ状態数を持つ人工回路でもmargin分布により利用可能性が異なることを示した。EXP-2026-011はさらに、要求budgetで残る状態割合と余裕総量の二成分が、fitから除外した構造の新規seedへ移送できることを示した。しかしEXP-2026-012では積構造への線形較正移送が失敗したため、回路のmodule構成を無視した普遍scoreとしては使えない。EXP-2026-016は局所margin、方向別load、size imbalanceを明示すれば一つの異サイズfamilyへ較正を移せることを示し、EXP-2026-017は強く分離可能な三moduleでtask-free分割と局所certificate合成を加えた。EXP-2026-018はその分割がentrywise構造差をどこまで許容するかを陽にした。EXP-2026-015は、非対称core–reserve構造で局所的にfeedback loadを制御すれば、同一energyの一様制御よりcore保持とreserve記憶を両立できる人工的十分例を加えた。</w:t>
       </w:r>
     </w:p>
     <w:p>
@@ -8079,7 +9703,7 @@
         <w:rPr>
           <w:rFonts w:ascii="Calibri" w:hAnsi="Calibri" w:eastAsia="Yu Gothic"/>
         </w:rPr>
-        <w:t>Astrocyte、細胞外イオン、dopamine、AChに関する一次研究 [18–24] は、局所から広域、subsecondから分単位の変調が共存し得ることを支持する。しかし、いずれも本稿のcore–reserve分解または局所gate方程式を同定していない。本結果は長期仮説と整合する構成例であって、遺伝的設計、発生、可塑性、生物回路を実証していない。発生過程、受容体map、学習maskを操作し、core margin、忘却、新規task獲得の因果関係を測る別研究が必要である。</w:t>
+        <w:t>Astrocyte、細胞外イオン、dopamine、AChに関する一次研究 [18–24] は、局所から広域、subsecondから分単位の変調が共存し得ることを支持する。発生時期と成人構造connectomeの対応 [29]、発生期皮質のgene co-expression meta-module [30] は発生programによるscaffold制約と整合する。しかし、いずれも本稿のcore–reserve分解、attractor module、局所gate方程式を同定していない。本結果は長期仮説と整合する構成例であって、遺伝的設計、発生、可塑性、生物回路を実証していない。発生過程、受容体map、学習maskを操作し、core margin、忘却、新規task獲得の因果関係を測る別研究が必要である。</w:t>
       </w:r>
     </w:p>
     <w:p>
@@ -8239,7 +9863,31 @@
         <w:rPr>
           <w:rFonts w:ascii="Calibri" w:hAnsi="Calibri" w:eastAsia="Yu Gothic"/>
         </w:rPr>
-        <w:t>EXP-2026-016は2 module・最大8 nodeまでの範囲で、局所marginと方向別loadを残す表現がmodule size変更後の絶対保持率を較正できる一例を与えた。これを規模条件へ昇格するには、module分割の同定誤差、3 module以上でのcertificate合成計算量、失敗相関、stochastic外乱、cueとreadoutの影響に対する外挿誤差上界が必要である。従って人間規模のnode数またはアトラクタ数はまだ導かない。</w:t>
+        <w:t xml:space="preserve">EXP-2026-016は2 module・最大8 nodeまでの範囲で、局所marginと方向別loadを残す表現がmodule size変更後の絶対保持率を較正できる一例を与えた。EXP-2026-017は3 module・7 nodeで、強い一意affinity gapから分割を回復し、certificate計算を全系128 orthantから局所16へ分解できる一例を与えた。EXP-2026-018は同じpartitionを保つentrywise誤差半径を加えた。これを規模条件へ昇格するには、半径外の誤分割に対する機能誤差上界、最大局所次元 </w:t>
+      </w:r>
+      <w:r>
+        <w:rPr>
+          <w:rFonts w:ascii="Cambria Math" w:hAnsi="Cambria Math" w:eastAsia="Yu Gothic"/>
+        </w:rPr>
+        <w:t>b</w:t>
+      </w:r>
+      <w:r>
+        <w:rPr>
+          <w:rFonts w:ascii="Calibri" w:hAnsi="Calibri" w:eastAsia="Yu Gothic"/>
+        </w:rPr>
+        <w:t xml:space="preserve"> と総流入 </w:t>
+      </w:r>
+      <w:r>
+        <w:rPr>
+          <w:rFonts w:ascii="Cambria Math" w:hAnsi="Cambria Math" w:eastAsia="Yu Gothic"/>
+        </w:rPr>
+        <w:t>ellᵢ</w:t>
+      </w:r>
+      <w:r>
+        <w:rPr>
+          <w:rFonts w:ascii="Calibri" w:hAnsi="Calibri" w:eastAsia="Yu Gothic"/>
+        </w:rPr>
+        <w:t xml:space="preserve"> の規模非依存性、失敗相関、stochastic外乱、cueとreadoutの影響に対する外挿誤差上界が必要である。従って人間規模のnode数またはアトラクタ数はまだ導かない。</w:t>
       </w:r>
     </w:p>
     <w:p>
@@ -8279,7 +9927,7 @@
         <w:rPr>
           <w:rFonts w:ascii="Calibri" w:hAnsi="Calibri" w:eastAsia="Yu Gothic"/>
         </w:rPr>
-        <w:t>第六に、EXP-2026-010のcouplingとlocal Jacobianに対するpooled優位は事前登録secondary endpointである。第七に、EXP-2026-011はfold内で対象familyをfitから除外したが、candidate選択には4 familyすべてのpilot成績を用いた。第八に、EXP-2026-012の第五familyではrobust-pair線形modelが外挿に失敗した。さらに30 seedは符号共役で同値なため、modular family母集団に対する区間推定ではない。第九に、normalized margin単独の第五family相関は同じconfirmation上のsecondary結果であり、独立確認されていない。第十に、AUDIT-2026-001は符号対角共役だけを扱い、node permutation、一般similarity、近似共役は未監査である。第十一に、EXP-2026-013は独立な2+2 node moduleに限定される。第十二に、EXP-2026-014は対称二bridgeの弱結合だけを扱う。第十三に、EXP-2026-016は非対称・異サイズを扱ったが、既知二module分割、一generator、整列4方向task、線形ridgeに限定され、順位相関ではbaselineを上回らなかった。第十四に、EXP-2026-015のglobal対照は一様scalarで、局所政策は既知bridgeへ直接アクセスした。低rank、MPC、学習済み制御との比較、場のmodel誤差と遅延、plasticity ruleは未検証である。第十五に、別task family、basin-weighted safe mass、生物学的core–reserve仮説、人間規模条件は本稿の実験から直接導かれない。</w:t>
+        <w:t>第六に、EXP-2026-010のcouplingとlocal Jacobianに対するpooled優位は事前登録secondary endpointである。第七に、EXP-2026-011はfold内で対象familyをfitから除外したが、candidate選択には4 familyすべてのpilot成績を用いた。第八に、EXP-2026-012の第五familyではrobust-pair線形modelが外挿に失敗した。さらに30 seedは符号共役で同値なため、modular family母集団に対する区間推定ではない。第九に、normalized margin単独の第五family相関は同じconfirmation上のsecondary結果であり、独立確認されていない。第十に、AUDIT-2026-001は符号対角共役だけを扱い、node permutation、一般similarity、近似共役は未監査である。第十一に、EXP-2026-013は独立な2+2 node moduleに限定される。第十二に、EXP-2026-014は対称二bridgeの弱結合だけを扱う。第十三に、EXP-2026-016は非対称・異サイズを扱ったが、既知二module分割、一generator、整列4方向task、線形ridgeに限定され、順位相関ではbaselineを上回らなかった。第十四に、EXP-2026-017は一意な強いaffinity gapを埋め込んだ7次元三module、一generator、整列4方向taskに限定される。全moduleの最大総流入が同じためdirectionalとglobal certificateも一致し、global順位相関が最良だった。第十五に、EXP-2026-018は同じ7次元generator、独立一様entrywise摂動、task-free構造phaseに限定され、欠測edge、相関誤差、誤分割後の機能を扱わない。第十六に、EXP-2026-015のglobal対照は一様scalarで、局所政策は既知bridgeへ直接アクセスした。低rank、MPC、学習済み制御との比較、場のmodel誤差と遅延、plasticity ruleは未検証である。第十七に、別task family、basin-weighted safe mass、生物学的core–reserve仮説、人間規模条件は本稿の実験から直接導かれない。</w:t>
       </w:r>
     </w:p>
     <w:p>
@@ -8303,7 +9951,7 @@
         <w:rPr>
           <w:rFonts w:ascii="Calibri" w:hAnsi="Calibri" w:eastAsia="Yu Gothic"/>
         </w:rPr>
-        <w:t>しかし、candidate選択にも未使用の独立module familyでは同じ線形modelが外挿に失敗した。さらに既存600 network条件は符号共役で192 classへ縮約された。異質独立moduleでは固定点、component certificate、task保持率の積則を確認し、対称弱結合ではraw countを保ったまま積則残差がcoupling normとともに増えることと、二種類のrectangle保証がtask下界を保つことを確認した。方向別component modelは2+2・2+3から3+5系へ再fitなしで外挿し、global profileとisolated task積よりMAEを改善したが、順位相関では上回らなかった。非対称3+5 core–reserve系では、同一介入energyの局所場が一様global制御より必須core状態とreserve記憶を保った。</w:t>
+        <w:t>しかし、candidate選択にも未使用の独立module familyでは同じ線形modelが外挿に失敗した。さらに既存600 network条件は符号共役で192 classへ縮約された。異質独立moduleでは固定点、component certificate、task保持率の積則を確認し、対称弱結合ではraw countを保ったまま積則残差がcoupling normとともに増えることと、二種類のrectangle保証がtask下界を保つことを確認した。方向別component modelは2+2・2+3から3+5系へ再fitなしで外挿し、global profileとisolated task積よりMAEを改善したが、順位相関では上回らなかった。強く分離可能な未知2+2+3系ではtask-free partition回復、局所16対全系128のcertificate一致、固定modelのMAE優位を確認したが、global順位相関が最良だった。最大gapと競合gapから得たentrywise半径は、未使用5,760条件で同じpartitionを保証し、半径外の構造感度を定量化した。非対称3+5 core–reserve系では、同一介入energyの局所場が一様global制御より必須core状態とreserve記憶を保った。</w:t>
       </w:r>
     </w:p>
     <w:p>
@@ -8311,7 +9959,7 @@
         <w:rPr>
           <w:rFonts w:ascii="Calibri" w:hAnsi="Calibri" w:eastAsia="Yu Gothic"/>
         </w:rPr>
-        <w:t>従ってAtlasはraw seed数とglobal scoreだけでなく、task保存対称性で割った有効構造class、component別profile、方向別load、積則残差、移送certificate、介入場とenergyを保持すべきである。本研究の結論は「アトラクタ数から外乱budget付き・構造分解付き・介入可能なprofileへ評価単位を移す必要がある」までであり、「一つのglobal score、線形較正、局所制御が任意の力学系へ通用する」ではない。次の焦点は別generator・3 module以上・未知分割でのcomponent外挿、stochastic repertoire、高次元系、より豊かなset表現、強いenergy-matched制御baselineである。</w:t>
+        <w:t>従ってAtlasはraw seed数とglobal scoreだけでなく、task保存対称性で割った有効構造class、推定partition、不確実性と保証半径、component別profile、方向別load、積則残差、移送certificate、介入場とenergyを保持すべきである。本研究の結論は「アトラクタ数から外乱budget付き・構造分解付き・介入可能なprofileへ評価単位を移す必要がある」までであり、「一つのglobal score、線形較正、局所制御が任意の力学系へ通用する」ではない。次の焦点は保証半径外の誤分割task、別generator、4 module以上、不均衡方向別load、stochastic repertoire、高次元系、より豊かなset表現、強いenergy-matched制御baselineである。</w:t>
       </w:r>
     </w:p>
     <w:p>
@@ -8331,7 +9979,7 @@
         <w:rPr>
           <w:rFonts w:ascii="Calibri" w:hAnsi="Calibri" w:eastAsia="Yu Gothic"/>
         </w:rPr>
-        <w:t xml:space="preserve">実験spec、seed、判定、導出済みartifact、主張台帳、実装、テストは本repositoryに保存した。主要記録はEXP-2026-008からEXP-2026-016とAUDIT-2026-001である。EXP-2026-011 confirmationはsource/test manifest SHA-256 </w:t>
+        <w:t xml:space="preserve">実験spec、seed、判定、導出済みartifact、主張台帳、実装、テストは本repositoryに保存した。主要記録はEXP-2026-008からEXP-2026-018とAUDIT-2026-001である。EXP-2026-011 confirmationはsource/test manifest SHA-256 </w:t>
       </w:r>
       <w:r>
         <w:rPr>
@@ -8436,6 +10084,95 @@
           <w:rFonts w:ascii="Calibri" w:hAnsi="Calibri" w:eastAsia="Yu Gothic"/>
         </w:rPr>
         <w:t xml:space="preserve"> で未使用30 seedを一度だけ実行した。</w:t>
+      </w:r>
+    </w:p>
+    <w:p>
+      <w:pPr>
+        <w:pStyle w:val="Reproducibility"/>
+        <w:jc w:val="left"/>
+      </w:pPr>
+      <w:r>
+        <w:rPr>
+          <w:rFonts w:ascii="Calibri" w:hAnsi="Calibri" w:eastAsia="Yu Gothic"/>
+        </w:rPr>
+        <w:t xml:space="preserve">EXP-2026-017では確認前に全203 unittestとbranch coverage 87%を確認し、task-free構造gateを通過した。Manifest </w:t>
+      </w:r>
+      <w:r>
+        <w:rPr>
+          <w:rFonts w:ascii="Consolas" w:hAnsi="Consolas" w:eastAsia="Yu Gothic"/>
+          <w:sz w:val="19"/>
+        </w:rPr>
+        <w:t>ee21b3bb6962dc3c483f194d8684217a6177d6e86fbea00343e14582543329a0</w:t>
+      </w:r>
+      <w:r>
+        <w:rPr>
+          <w:rFonts w:ascii="Calibri" w:hAnsi="Calibri" w:eastAsia="Yu Gothic"/>
+        </w:rPr>
+        <w:t xml:space="preserve"> と同じ固定model hashで未使用30 seedを一度だけ実行した。外側のshell待機はtimeoutしたが同じcontainer/processの終了だけを追跡し、再実行はしていない。構造gate artifact SHA-256は </w:t>
+      </w:r>
+      <w:r>
+        <w:rPr>
+          <w:rFonts w:ascii="Consolas" w:hAnsi="Consolas" w:eastAsia="Yu Gothic"/>
+          <w:sz w:val="19"/>
+        </w:rPr>
+        <w:t>86f5739e840d83fed9ea6d0fabcf5214d55a9e3a0a3af5fb24126755b4c34e63</w:t>
+      </w:r>
+      <w:r>
+        <w:rPr>
+          <w:rFonts w:ascii="Calibri" w:hAnsi="Calibri" w:eastAsia="Yu Gothic"/>
+        </w:rPr>
+        <w:t xml:space="preserve">、confirmation artifact SHA-256は </w:t>
+      </w:r>
+      <w:r>
+        <w:rPr>
+          <w:rFonts w:ascii="Consolas" w:hAnsi="Consolas" w:eastAsia="Yu Gothic"/>
+          <w:sz w:val="19"/>
+        </w:rPr>
+        <w:t>7c5a5719b09690917f26a1a631a7904cf7f208204260b1f8388e6061bc091cf0</w:t>
+      </w:r>
+      <w:r>
+        <w:rPr>
+          <w:rFonts w:ascii="Calibri" w:hAnsi="Calibri" w:eastAsia="Yu Gothic"/>
+        </w:rPr>
+        <w:t xml:space="preserve"> である。</w:t>
+      </w:r>
+    </w:p>
+    <w:p>
+      <w:pPr>
+        <w:pStyle w:val="Reproducibility"/>
+        <w:jc w:val="left"/>
+      </w:pPr>
+      <w:r>
+        <w:rPr>
+          <w:rFonts w:ascii="Calibri" w:hAnsi="Calibri" w:eastAsia="Yu Gothic"/>
+        </w:rPr>
+        <w:t xml:space="preserve">EXP-2026-018では全216 unittestとbranch coverage 87%を確認し、development 10,080条件の8判定成立後にsource/test manifest </w:t>
+      </w:r>
+      <w:r>
+        <w:rPr>
+          <w:rFonts w:ascii="Consolas" w:hAnsi="Consolas" w:eastAsia="Yu Gothic"/>
+          <w:sz w:val="19"/>
+        </w:rPr>
+        <w:t>7583c4c5e500b60d504462b263c8e056139254eec18f1d474fd890fcac3b7110</w:t>
+      </w:r>
+      <w:r>
+        <w:rPr>
+          <w:rFonts w:ascii="Calibri" w:hAnsi="Calibri" w:eastAsia="Yu Gothic"/>
+        </w:rPr>
+        <w:t xml:space="preserve"> を固定した。未使用30 seedのconfirmation 10,080条件を一度だけ実行し、8判定はすべて成立した。Confirmation artifact SHA-256は </w:t>
+      </w:r>
+      <w:r>
+        <w:rPr>
+          <w:rFonts w:ascii="Consolas" w:hAnsi="Consolas" w:eastAsia="Yu Gothic"/>
+          <w:sz w:val="19"/>
+        </w:rPr>
+        <w:t>0830936f84f06f293cdaf79e2e50138a80c11cfa3df37ebab938b4b6d9cf635f</w:t>
+      </w:r>
+      <w:r>
+        <w:rPr>
+          <w:rFonts w:ascii="Calibri" w:hAnsi="Calibri" w:eastAsia="Yu Gothic"/>
+        </w:rPr>
+        <w:t xml:space="preserve"> である。従って主要記録範囲はEXP-2026-018までである。</w:t>
       </w:r>
     </w:p>
     <w:p>
@@ -8773,6 +10510,90 @@
           <w:rFonts w:ascii="Calibri" w:hAnsi="Calibri" w:eastAsia="Yu Gothic"/>
         </w:rPr>
         <w:t>[27] Pradhan N, Dasgupta S, Sinha S. Modular Organization Enhances the Robustness of Attractor Network Dynamics. Europhysics Letters 94, 38004, 2011. https://doi.org/10.1209/0295-5075/94/38004</w:t>
+      </w:r>
+    </w:p>
+    <w:p>
+      <w:pPr>
+        <w:pStyle w:val="Bibliography"/>
+        <w:jc w:val="left"/>
+      </w:pPr>
+      <w:r>
+        <w:rPr>
+          <w:rFonts w:ascii="Calibri" w:hAnsi="Calibri" w:eastAsia="Yu Gothic"/>
+        </w:rPr>
+        <w:t>[28] Zhou Y, Liu S, Fan C. Scalable Input-to-State Stability Certificates for Interconnected Discrete-Time Systems. arXiv:2509.10118, 2025. https://arxiv.org/abs/2509.10118</w:t>
+      </w:r>
+    </w:p>
+    <w:p>
+      <w:pPr>
+        <w:pStyle w:val="Bibliography"/>
+        <w:jc w:val="left"/>
+      </w:pPr>
+      <w:r>
+        <w:rPr>
+          <w:rFonts w:ascii="Calibri" w:hAnsi="Calibri" w:eastAsia="Yu Gothic"/>
+        </w:rPr>
+        <w:t>[29] Diez I, et al. Developmental Timing Shapes Structural Connectivity and Centrality in the Human Connectome. Nature Communications 17, 2026. https://doi.org/10.1038/s41467-025-67785-3</w:t>
+      </w:r>
+    </w:p>
+    <w:p>
+      <w:pPr>
+        <w:pStyle w:val="Bibliography"/>
+        <w:jc w:val="left"/>
+      </w:pPr>
+      <w:r>
+        <w:rPr>
+          <w:rFonts w:ascii="Calibri" w:hAnsi="Calibri" w:eastAsia="Yu Gothic"/>
+        </w:rPr>
+        <w:t>[30] Nano PR, et al. Gene Co-expression Networks Underlying Cell-type Specification in the Developing Human Cortex. Nature Neuroscience, 2025. https://doi.org/10.1038/s41593-025-01933-2</w:t>
+      </w:r>
+    </w:p>
+    <w:p>
+      <w:pPr>
+        <w:pStyle w:val="Bibliography"/>
+        <w:jc w:val="left"/>
+      </w:pPr>
+      <w:r>
+        <w:rPr>
+          <w:rFonts w:ascii="Calibri" w:hAnsi="Calibri" w:eastAsia="Yu Gothic"/>
+        </w:rPr>
+        <w:t>[31] Karrer B, Levina E, Newman MEJ. Robustness of Community Structure in Networks. Physical Review E 77, 046119, 2008. https://doi.org/10.1103/PhysRevE.77.046119</w:t>
+      </w:r>
+    </w:p>
+    <w:p>
+      <w:pPr>
+        <w:pStyle w:val="Bibliography"/>
+        <w:jc w:val="left"/>
+      </w:pPr>
+      <w:r>
+        <w:rPr>
+          <w:rFonts w:ascii="Calibri" w:hAnsi="Calibri" w:eastAsia="Yu Gothic"/>
+        </w:rPr>
+        <w:t>[32] Peixoto TP. Revealing Consensus and Dissensus between Network Partitions. Physical Review X 11, 021003, 2021. https://doi.org/10.1103/PhysRevX.11.021003</w:t>
+      </w:r>
+    </w:p>
+    <w:p>
+      <w:pPr>
+        <w:pStyle w:val="Bibliography"/>
+        <w:jc w:val="left"/>
+      </w:pPr>
+      <w:r>
+        <w:rPr>
+          <w:rFonts w:ascii="Calibri" w:hAnsi="Calibri" w:eastAsia="Yu Gothic"/>
+        </w:rPr>
+        <w:t>[33] Béna G, Goodman DFM. Dynamics of Specialization in Neural Modules under Resource Constraints. Nature Communications 16, 187, 2025. https://doi.org/10.1038/s41467-024-55188-9</w:t>
+      </w:r>
+    </w:p>
+    <w:p>
+      <w:pPr>
+        <w:pStyle w:val="Bibliography"/>
+        <w:jc w:val="left"/>
+      </w:pPr>
+      <w:r>
+        <w:rPr>
+          <w:rFonts w:ascii="Calibri" w:hAnsi="Calibri" w:eastAsia="Yu Gothic"/>
+        </w:rPr>
+        <w:t>[34] Yang H, et al. Connectional Axis of Individual Functional Variability: Patterns, Structural Correlates, and Relevance for Development and Cognition. Proceedings of the National Academy of Sciences 122, e2420228122, 2025. https://doi.org/10.1073/pnas.2420228122</w:t>
       </w:r>
     </w:p>
     <w:sectPr>

</xml_diff>